<commit_message>
Format algorithms and equations in ICPA draft
</commit_message>
<xml_diff>
--- a/paper/word/icpa_2026_mask_guided_cotton_until_algorithms.docx
+++ b/paper/word/icpa_2026_mask_guided_cotton_until_algorithms.docx
@@ -1277,7 +1277,7 @@
         <w:rPr>
           <w:i w:val="0"/>
         </w:rPr>
-        <w:t>Let s denote the image scale in mm per pixel, l_px and w_px denote the major and minor axes of the extracted mask, and w_box and h_box denote the detector-box width and height. The pipeline reports mask length L, mask width W, coarse detector diameter D, ellipsoid volume proxy V, visibility v, and extraction confidence q. Equations (1)-(6) define the planned trait computations.</w:t>
+        <w:t>Let s denote the image scale in mm per pixel, l_i and w_i denote the major and minor axes of the extracted mask for candidate i, and w_i^box and h_i^box denote the detector-box width and height. The pipeline reports mask length L_i, mask width W_i, coarse detector diameter D_i, ellipsoid volume proxy V_i, visibility nu_i, extraction confidence q_i, and plot-cell count C_rc. Equations (1)-(6) define the planned trait computations.</w:t>
       </w:r>
     </w:p>
     <w:p>
@@ -1286,7 +1286,11 @@
         <w:jc w:val="center"/>
       </w:pPr>
       <w:r>
-        <w:t>(1)  L = l_px * s</w:t>
+        <w:rPr>
+          <w:rFonts w:ascii="Times New Roman" w:hAnsi="Times New Roman"/>
+          <w:sz w:val="21"/>
+        </w:rPr>
+        <w:t>(1)   L_i = l_i s,     W_i = w_i s</w:t>
       </w:r>
     </w:p>
     <w:p>
@@ -1295,7 +1299,11 @@
         <w:jc w:val="center"/>
       </w:pPr>
       <w:r>
-        <w:t>(2)  W = w_px * s</w:t>
+        <w:rPr>
+          <w:rFonts w:ascii="Times New Roman" w:hAnsi="Times New Roman"/>
+          <w:sz w:val="21"/>
+        </w:rPr>
+        <w:t>(2)   D_i = 1/2 (w_i^box + h_i^box) s</w:t>
       </w:r>
     </w:p>
     <w:p>
@@ -1304,7 +1312,11 @@
         <w:jc w:val="center"/>
       </w:pPr>
       <w:r>
-        <w:t>(3)  D = 0.5 * (w_box + h_box) * s</w:t>
+        <w:rPr>
+          <w:rFonts w:ascii="Times New Roman" w:hAnsi="Times New Roman"/>
+          <w:sz w:val="21"/>
+        </w:rPr>
+        <w:t>(3)   V_i = 4π/3 · (L_i/2)(W_i/2)^2</w:t>
       </w:r>
     </w:p>
     <w:p>
@@ -1313,7 +1325,11 @@
         <w:jc w:val="center"/>
       </w:pPr>
       <w:r>
-        <w:t>(4)  V_ellipsoid = (4/3) pi (L/2)(W/2)(W/2)</w:t>
+        <w:rPr>
+          <w:rFonts w:ascii="Times New Roman" w:hAnsi="Times New Roman"/>
+          <w:sz w:val="21"/>
+        </w:rPr>
+        <w:t>(4)   ν_i = A_i^contour / A_i^box</w:t>
       </w:r>
     </w:p>
     <w:p>
@@ -1322,7 +1338,11 @@
         <w:jc w:val="center"/>
       </w:pPr>
       <w:r>
-        <w:t>(5)  v = A_contour / A_box</w:t>
+        <w:rPr>
+          <w:rFonts w:ascii="Times New Roman" w:hAnsi="Times New Roman"/>
+          <w:sz w:val="21"/>
+        </w:rPr>
+        <w:t>(5)   q_i = λ_1 r_i^lint + λ_2 ν_i + λ_3 d_i + λ_4 r_i^size + λ_5 b_i + λ_6(1 - r_i^green)</w:t>
       </w:r>
     </w:p>
     <w:p>
@@ -1331,7 +1351,11 @@
         <w:jc w:val="center"/>
       </w:pPr>
       <w:r>
-        <w:t>(6)  q = f(r_lint, v, d, r_size, b, 1 - r_green)</w:t>
+        <w:rPr>
+          <w:rFonts w:ascii="Times New Roman" w:hAnsi="Times New Roman"/>
+          <w:sz w:val="21"/>
+        </w:rPr>
+        <w:t>(6)   C_rc = Σ_i 1[center_i ∈ G_rc]</w:t>
       </w:r>
     </w:p>
     <w:p>
@@ -1391,353 +1415,2995 @@
         <w:t>5 Algorithms</w:t>
       </w:r>
     </w:p>
+    <w:tbl>
+      <w:tblPr>
+        <w:tblStyle w:val="TableGrid"/>
+        <w:tblW w:type="auto" w:w="0"/>
+        <w:jc w:val="left"/>
+        <w:tblLayout w:type="fixed"/>
+        <w:tblLook w:firstColumn="1" w:firstRow="1" w:lastColumn="0" w:lastRow="0" w:noHBand="0" w:noVBand="1" w:val="04A0"/>
+        <w:tblLayout w:type="fixed"/>
+      </w:tblPr>
+      <w:tblGrid>
+        <w:gridCol w:w="604"/>
+        <w:gridCol w:w="7992"/>
+      </w:tblGrid>
+      <w:tr>
+        <w:tc>
+          <w:tcPr>
+            <w:tcW w:type="dxa" w:w="8596"/>
+            <w:gridSpan w:val="2"/>
+            <w:tcBorders>
+              <w:top w:val="single" w:sz="12" w:space="0" w:color="000000"/>
+              <w:bottom w:val="single" w:sz="8" w:space="0" w:color="000000"/>
+              <w:left w:val="nil"/>
+              <w:right w:val="nil"/>
+            </w:tcBorders>
+          </w:tcPr>
+          <w:p>
+            <w:pPr>
+              <w:spacing w:after="20"/>
+            </w:pPr>
+            <w:r/>
+            <w:r>
+              <w:rPr>
+                <w:b/>
+                <w:sz w:val="22"/>
+              </w:rPr>
+              <w:t xml:space="preserve">Algorithm 1 </w:t>
+            </w:r>
+            <w:r>
+              <w:rPr>
+                <w:sz w:val="22"/>
+              </w:rPr>
+              <w:t>Mask-guided cotton boll phenotyping pipeline</w:t>
+            </w:r>
+          </w:p>
+        </w:tc>
+      </w:tr>
+      <w:tr>
+        <w:tc>
+          <w:tcPr>
+            <w:tcW w:type="dxa" w:w="604"/>
+            <w:tcBorders>
+              <w:top w:val="nil"/>
+              <w:bottom w:val="nil"/>
+              <w:left w:val="nil"/>
+              <w:right w:val="nil"/>
+            </w:tcBorders>
+          </w:tcPr>
+          <w:p>
+            <w:pPr>
+              <w:spacing w:after="0"/>
+            </w:pPr>
+            <w:r/>
+            <w:r>
+              <w:rPr>
+                <w:rFonts w:ascii="Times New Roman" w:hAnsi="Times New Roman"/>
+                <w:sz w:val="20"/>
+              </w:rPr>
+              <w:t>1:</w:t>
+            </w:r>
+          </w:p>
+        </w:tc>
+        <w:tc>
+          <w:tcPr>
+            <w:tcW w:type="dxa" w:w="7992"/>
+            <w:tcBorders>
+              <w:top w:val="nil"/>
+              <w:bottom w:val="nil"/>
+              <w:left w:val="nil"/>
+              <w:right w:val="nil"/>
+            </w:tcBorders>
+          </w:tcPr>
+          <w:p>
+            <w:pPr>
+              <w:spacing w:after="0"/>
+            </w:pPr>
+            <w:r/>
+            <w:r>
+              <w:rPr>
+                <w:rFonts w:ascii="Times New Roman" w:hAnsi="Times New Roman"/>
+                <w:b/>
+                <w:sz w:val="20"/>
+              </w:rPr>
+              <w:t>input:</w:t>
+            </w:r>
+            <w:r>
+              <w:rPr>
+                <w:rFonts w:ascii="Times New Roman" w:hAnsi="Times New Roman"/>
+                <w:b w:val="0"/>
+                <w:sz w:val="20"/>
+              </w:rPr>
+              <w:t xml:space="preserve"> UAV image I, phase p, scale s or calibration metadata, detector parameters Θ_d, mask parameters Θ_m</w:t>
+            </w:r>
+          </w:p>
+        </w:tc>
+      </w:tr>
+      <w:tr>
+        <w:tc>
+          <w:tcPr>
+            <w:tcW w:type="dxa" w:w="604"/>
+            <w:tcBorders>
+              <w:top w:val="nil"/>
+              <w:bottom w:val="nil"/>
+              <w:left w:val="nil"/>
+              <w:right w:val="nil"/>
+            </w:tcBorders>
+          </w:tcPr>
+          <w:p>
+            <w:pPr>
+              <w:spacing w:after="0"/>
+            </w:pPr>
+            <w:r/>
+            <w:r>
+              <w:rPr>
+                <w:rFonts w:ascii="Times New Roman" w:hAnsi="Times New Roman"/>
+                <w:sz w:val="20"/>
+              </w:rPr>
+              <w:t>2:</w:t>
+            </w:r>
+          </w:p>
+        </w:tc>
+        <w:tc>
+          <w:tcPr>
+            <w:tcW w:type="dxa" w:w="7992"/>
+            <w:tcBorders>
+              <w:top w:val="nil"/>
+              <w:bottom w:val="nil"/>
+              <w:left w:val="nil"/>
+              <w:right w:val="nil"/>
+            </w:tcBorders>
+          </w:tcPr>
+          <w:p>
+            <w:pPr>
+              <w:spacing w:after="0"/>
+            </w:pPr>
+            <w:r/>
+            <w:r>
+              <w:rPr>
+                <w:rFonts w:ascii="Times New Roman" w:hAnsi="Times New Roman"/>
+                <w:b/>
+                <w:sz w:val="20"/>
+              </w:rPr>
+              <w:t>initialize</w:t>
+            </w:r>
+            <w:r>
+              <w:rPr>
+                <w:rFonts w:ascii="Times New Roman" w:hAnsi="Times New Roman"/>
+                <w:b w:val="0"/>
+                <w:sz w:val="20"/>
+              </w:rPr>
+              <w:t xml:space="preserve"> candidate set B ← ∅, measurement set R ← ∅</w:t>
+            </w:r>
+          </w:p>
+        </w:tc>
+      </w:tr>
+      <w:tr>
+        <w:tc>
+          <w:tcPr>
+            <w:tcW w:type="dxa" w:w="604"/>
+            <w:tcBorders>
+              <w:top w:val="nil"/>
+              <w:bottom w:val="nil"/>
+              <w:left w:val="nil"/>
+              <w:right w:val="nil"/>
+            </w:tcBorders>
+          </w:tcPr>
+          <w:p>
+            <w:pPr>
+              <w:spacing w:after="0"/>
+            </w:pPr>
+            <w:r/>
+            <w:r>
+              <w:rPr>
+                <w:rFonts w:ascii="Times New Roman" w:hAnsi="Times New Roman"/>
+                <w:sz w:val="20"/>
+              </w:rPr>
+              <w:t>3:</w:t>
+            </w:r>
+          </w:p>
+        </w:tc>
+        <w:tc>
+          <w:tcPr>
+            <w:tcW w:type="dxa" w:w="7992"/>
+            <w:tcBorders>
+              <w:top w:val="nil"/>
+              <w:bottom w:val="nil"/>
+              <w:left w:val="nil"/>
+              <w:right w:val="nil"/>
+            </w:tcBorders>
+          </w:tcPr>
+          <w:p>
+            <w:pPr>
+              <w:spacing w:after="0"/>
+            </w:pPr>
+            <w:r/>
+            <w:r>
+              <w:rPr>
+                <w:rFonts w:ascii="Times New Roman" w:hAnsi="Times New Roman"/>
+                <w:b/>
+                <w:sz w:val="20"/>
+              </w:rPr>
+              <w:t>if</w:t>
+            </w:r>
+            <w:r>
+              <w:rPr>
+                <w:rFonts w:ascii="Times New Roman" w:hAnsi="Times New Roman"/>
+                <w:b w:val="0"/>
+                <w:sz w:val="20"/>
+              </w:rPr>
+              <w:t xml:space="preserve"> p is unknown </w:t>
+            </w:r>
+            <w:r>
+              <w:rPr>
+                <w:rFonts w:ascii="Times New Roman" w:hAnsi="Times New Roman"/>
+                <w:b/>
+                <w:sz w:val="20"/>
+              </w:rPr>
+              <w:t>then</w:t>
+            </w:r>
+            <w:r>
+              <w:rPr>
+                <w:rFonts w:ascii="Times New Roman" w:hAnsi="Times New Roman"/>
+                <w:b w:val="0"/>
+                <w:sz w:val="20"/>
+              </w:rPr>
+              <w:t xml:space="preserve"> infer p from canopy greenness</w:t>
+            </w:r>
+            <w:r>
+              <w:rPr>
+                <w:sz w:val="20"/>
+              </w:rPr>
+              <w:tab/>
+              <w:t xml:space="preserve">▷ </w:t>
+            </w:r>
+            <w:r>
+              <w:rPr>
+                <w:rFonts w:ascii="Times New Roman" w:hAnsi="Times New Roman"/>
+                <w:sz w:val="20"/>
+              </w:rPr>
+              <w:t>phase resolution</w:t>
+            </w:r>
+          </w:p>
+        </w:tc>
+      </w:tr>
+      <w:tr>
+        <w:tc>
+          <w:tcPr>
+            <w:tcW w:type="dxa" w:w="604"/>
+            <w:tcBorders>
+              <w:top w:val="nil"/>
+              <w:bottom w:val="nil"/>
+              <w:left w:val="nil"/>
+              <w:right w:val="nil"/>
+            </w:tcBorders>
+          </w:tcPr>
+          <w:p>
+            <w:pPr>
+              <w:spacing w:after="0"/>
+            </w:pPr>
+            <w:r/>
+            <w:r>
+              <w:rPr>
+                <w:rFonts w:ascii="Times New Roman" w:hAnsi="Times New Roman"/>
+                <w:sz w:val="20"/>
+              </w:rPr>
+              <w:t>4:</w:t>
+            </w:r>
+          </w:p>
+        </w:tc>
+        <w:tc>
+          <w:tcPr>
+            <w:tcW w:type="dxa" w:w="7992"/>
+            <w:tcBorders>
+              <w:top w:val="nil"/>
+              <w:bottom w:val="nil"/>
+              <w:left w:val="nil"/>
+              <w:right w:val="nil"/>
+            </w:tcBorders>
+          </w:tcPr>
+          <w:p>
+            <w:pPr>
+              <w:spacing w:after="0"/>
+            </w:pPr>
+            <w:r/>
+            <w:r>
+              <w:rPr>
+                <w:rFonts w:ascii="Times New Roman" w:hAnsi="Times New Roman"/>
+                <w:b w:val="0"/>
+                <w:sz w:val="20"/>
+              </w:rPr>
+              <w:t>B ← DetectBolls(I, p; Θ_d)</w:t>
+            </w:r>
+            <w:r>
+              <w:rPr>
+                <w:sz w:val="20"/>
+              </w:rPr>
+              <w:tab/>
+              <w:t xml:space="preserve">▷ </w:t>
+            </w:r>
+            <w:r>
+              <w:rPr>
+                <w:rFonts w:ascii="Times New Roman" w:hAnsi="Times New Roman"/>
+                <w:sz w:val="20"/>
+              </w:rPr>
+              <w:t>raw candidate detection</w:t>
+            </w:r>
+          </w:p>
+        </w:tc>
+      </w:tr>
+      <w:tr>
+        <w:tc>
+          <w:tcPr>
+            <w:tcW w:type="dxa" w:w="604"/>
+            <w:tcBorders>
+              <w:top w:val="nil"/>
+              <w:bottom w:val="nil"/>
+              <w:left w:val="nil"/>
+              <w:right w:val="nil"/>
+            </w:tcBorders>
+          </w:tcPr>
+          <w:p>
+            <w:pPr>
+              <w:spacing w:after="0"/>
+            </w:pPr>
+            <w:r/>
+            <w:r>
+              <w:rPr>
+                <w:rFonts w:ascii="Times New Roman" w:hAnsi="Times New Roman"/>
+                <w:sz w:val="20"/>
+              </w:rPr>
+              <w:t>5:</w:t>
+            </w:r>
+          </w:p>
+        </w:tc>
+        <w:tc>
+          <w:tcPr>
+            <w:tcW w:type="dxa" w:w="7992"/>
+            <w:tcBorders>
+              <w:top w:val="nil"/>
+              <w:bottom w:val="nil"/>
+              <w:left w:val="nil"/>
+              <w:right w:val="nil"/>
+            </w:tcBorders>
+          </w:tcPr>
+          <w:p>
+            <w:pPr>
+              <w:spacing w:after="0"/>
+            </w:pPr>
+            <w:r/>
+            <w:r>
+              <w:rPr>
+                <w:rFonts w:ascii="Times New Roman" w:hAnsi="Times New Roman"/>
+                <w:b/>
+                <w:sz w:val="20"/>
+              </w:rPr>
+              <w:t>for</w:t>
+            </w:r>
+            <w:r>
+              <w:rPr>
+                <w:rFonts w:ascii="Times New Roman" w:hAnsi="Times New Roman"/>
+                <w:b w:val="0"/>
+                <w:sz w:val="20"/>
+              </w:rPr>
+              <w:t xml:space="preserve"> each candidate b_i ∈ B </w:t>
+            </w:r>
+            <w:r>
+              <w:rPr>
+                <w:rFonts w:ascii="Times New Roman" w:hAnsi="Times New Roman"/>
+                <w:b/>
+                <w:sz w:val="20"/>
+              </w:rPr>
+              <w:t>do</w:t>
+            </w:r>
+          </w:p>
+        </w:tc>
+      </w:tr>
+      <w:tr>
+        <w:tc>
+          <w:tcPr>
+            <w:tcW w:type="dxa" w:w="604"/>
+            <w:tcBorders>
+              <w:top w:val="nil"/>
+              <w:bottom w:val="nil"/>
+              <w:left w:val="nil"/>
+              <w:right w:val="nil"/>
+            </w:tcBorders>
+          </w:tcPr>
+          <w:p>
+            <w:pPr>
+              <w:spacing w:after="0"/>
+            </w:pPr>
+            <w:r/>
+            <w:r>
+              <w:rPr>
+                <w:rFonts w:ascii="Times New Roman" w:hAnsi="Times New Roman"/>
+                <w:sz w:val="20"/>
+              </w:rPr>
+              <w:t>6:</w:t>
+            </w:r>
+          </w:p>
+        </w:tc>
+        <w:tc>
+          <w:tcPr>
+            <w:tcW w:type="dxa" w:w="7992"/>
+            <w:tcBorders>
+              <w:top w:val="nil"/>
+              <w:bottom w:val="nil"/>
+              <w:left w:val="nil"/>
+              <w:right w:val="nil"/>
+            </w:tcBorders>
+          </w:tcPr>
+          <w:p>
+            <w:pPr>
+              <w:spacing w:after="0"/>
+            </w:pPr>
+            <w:r/>
+            <w:r>
+              <w:rPr>
+                <w:rFonts w:ascii="Times New Roman" w:hAnsi="Times New Roman"/>
+                <w:b w:val="0"/>
+                <w:sz w:val="20"/>
+              </w:rPr>
+              <w:t xml:space="preserve">    M_i, m_i ← ExtractMask(I, b_i; Θ_m)</w:t>
+            </w:r>
+            <w:r>
+              <w:rPr>
+                <w:sz w:val="20"/>
+              </w:rPr>
+              <w:tab/>
+              <w:t xml:space="preserve">▷ </w:t>
+            </w:r>
+            <w:r>
+              <w:rPr>
+                <w:rFonts w:ascii="Times New Roman" w:hAnsi="Times New Roman"/>
+                <w:sz w:val="20"/>
+              </w:rPr>
+              <w:t>Algorithm 2</w:t>
+            </w:r>
+          </w:p>
+        </w:tc>
+      </w:tr>
+      <w:tr>
+        <w:tc>
+          <w:tcPr>
+            <w:tcW w:type="dxa" w:w="604"/>
+            <w:tcBorders>
+              <w:top w:val="nil"/>
+              <w:bottom w:val="nil"/>
+              <w:left w:val="nil"/>
+              <w:right w:val="nil"/>
+            </w:tcBorders>
+          </w:tcPr>
+          <w:p>
+            <w:pPr>
+              <w:spacing w:after="0"/>
+            </w:pPr>
+            <w:r/>
+            <w:r>
+              <w:rPr>
+                <w:rFonts w:ascii="Times New Roman" w:hAnsi="Times New Roman"/>
+                <w:sz w:val="20"/>
+              </w:rPr>
+              <w:t>7:</w:t>
+            </w:r>
+          </w:p>
+        </w:tc>
+        <w:tc>
+          <w:tcPr>
+            <w:tcW w:type="dxa" w:w="7992"/>
+            <w:tcBorders>
+              <w:top w:val="nil"/>
+              <w:bottom w:val="nil"/>
+              <w:left w:val="nil"/>
+              <w:right w:val="nil"/>
+            </w:tcBorders>
+          </w:tcPr>
+          <w:p>
+            <w:pPr>
+              <w:spacing w:after="0"/>
+            </w:pPr>
+            <w:r/>
+            <w:r>
+              <w:rPr>
+                <w:rFonts w:ascii="Times New Roman" w:hAnsi="Times New Roman"/>
+                <w:b w:val="0"/>
+                <w:sz w:val="20"/>
+              </w:rPr>
+              <w:t xml:space="preserve">    x_i ← EstimateTraits(b_i, M_i, s)</w:t>
+            </w:r>
+            <w:r>
+              <w:rPr>
+                <w:sz w:val="20"/>
+              </w:rPr>
+              <w:tab/>
+              <w:t xml:space="preserve">▷ </w:t>
+            </w:r>
+            <w:r>
+              <w:rPr>
+                <w:rFonts w:ascii="Times New Roman" w:hAnsi="Times New Roman"/>
+                <w:sz w:val="20"/>
+              </w:rPr>
+              <w:t>Equations (1)-(6)</w:t>
+            </w:r>
+          </w:p>
+        </w:tc>
+      </w:tr>
+      <w:tr>
+        <w:tc>
+          <w:tcPr>
+            <w:tcW w:type="dxa" w:w="604"/>
+            <w:tcBorders>
+              <w:top w:val="nil"/>
+              <w:bottom w:val="nil"/>
+              <w:left w:val="nil"/>
+              <w:right w:val="nil"/>
+            </w:tcBorders>
+          </w:tcPr>
+          <w:p>
+            <w:pPr>
+              <w:spacing w:after="0"/>
+            </w:pPr>
+            <w:r/>
+            <w:r>
+              <w:rPr>
+                <w:rFonts w:ascii="Times New Roman" w:hAnsi="Times New Roman"/>
+                <w:sz w:val="20"/>
+              </w:rPr>
+              <w:t>8:</w:t>
+            </w:r>
+          </w:p>
+        </w:tc>
+        <w:tc>
+          <w:tcPr>
+            <w:tcW w:type="dxa" w:w="7992"/>
+            <w:tcBorders>
+              <w:top w:val="nil"/>
+              <w:bottom w:val="nil"/>
+              <w:left w:val="nil"/>
+              <w:right w:val="nil"/>
+            </w:tcBorders>
+          </w:tcPr>
+          <w:p>
+            <w:pPr>
+              <w:spacing w:after="0"/>
+            </w:pPr>
+            <w:r/>
+            <w:r>
+              <w:rPr>
+                <w:rFonts w:ascii="Times New Roman" w:hAnsi="Times New Roman"/>
+                <w:b w:val="0"/>
+                <w:sz w:val="20"/>
+              </w:rPr>
+              <w:t xml:space="preserve">    q_i ← ScoreCandidate(x_i, M_i, b_i)</w:t>
+            </w:r>
+            <w:r>
+              <w:rPr>
+                <w:sz w:val="20"/>
+              </w:rPr>
+              <w:tab/>
+              <w:t xml:space="preserve">▷ </w:t>
+            </w:r>
+            <w:r>
+              <w:rPr>
+                <w:rFonts w:ascii="Times New Roman" w:hAnsi="Times New Roman"/>
+                <w:sz w:val="20"/>
+              </w:rPr>
+              <w:t>measurement readiness</w:t>
+            </w:r>
+          </w:p>
+        </w:tc>
+      </w:tr>
+      <w:tr>
+        <w:tc>
+          <w:tcPr>
+            <w:tcW w:type="dxa" w:w="604"/>
+            <w:tcBorders>
+              <w:top w:val="nil"/>
+              <w:bottom w:val="nil"/>
+              <w:left w:val="nil"/>
+              <w:right w:val="nil"/>
+            </w:tcBorders>
+          </w:tcPr>
+          <w:p>
+            <w:pPr>
+              <w:spacing w:after="0"/>
+            </w:pPr>
+            <w:r/>
+            <w:r>
+              <w:rPr>
+                <w:rFonts w:ascii="Times New Roman" w:hAnsi="Times New Roman"/>
+                <w:sz w:val="20"/>
+              </w:rPr>
+              <w:t>9:</w:t>
+            </w:r>
+          </w:p>
+        </w:tc>
+        <w:tc>
+          <w:tcPr>
+            <w:tcW w:type="dxa" w:w="7992"/>
+            <w:tcBorders>
+              <w:top w:val="nil"/>
+              <w:bottom w:val="nil"/>
+              <w:left w:val="nil"/>
+              <w:right w:val="nil"/>
+            </w:tcBorders>
+          </w:tcPr>
+          <w:p>
+            <w:pPr>
+              <w:spacing w:after="0"/>
+            </w:pPr>
+            <w:r/>
+            <w:r>
+              <w:rPr>
+                <w:rFonts w:ascii="Times New Roman" w:hAnsi="Times New Roman"/>
+                <w:b w:val="0"/>
+                <w:sz w:val="20"/>
+              </w:rPr>
+              <w:t xml:space="preserve">    </w:t>
+            </w:r>
+            <w:r>
+              <w:rPr>
+                <w:rFonts w:ascii="Times New Roman" w:hAnsi="Times New Roman"/>
+                <w:b/>
+                <w:sz w:val="20"/>
+              </w:rPr>
+              <w:t>if</w:t>
+            </w:r>
+            <w:r>
+              <w:rPr>
+                <w:rFonts w:ascii="Times New Roman" w:hAnsi="Times New Roman"/>
+                <w:b w:val="0"/>
+                <w:sz w:val="20"/>
+              </w:rPr>
+              <w:t xml:space="preserve"> q_i ≥ τ_q </w:t>
+            </w:r>
+            <w:r>
+              <w:rPr>
+                <w:rFonts w:ascii="Times New Roman" w:hAnsi="Times New Roman"/>
+                <w:b/>
+                <w:sz w:val="20"/>
+              </w:rPr>
+              <w:t>then</w:t>
+            </w:r>
+            <w:r>
+              <w:rPr>
+                <w:rFonts w:ascii="Times New Roman" w:hAnsi="Times New Roman"/>
+                <w:b w:val="0"/>
+                <w:sz w:val="20"/>
+              </w:rPr>
+              <w:t xml:space="preserve"> R ← R ∪ {(b_i, M_i, x_i, q_i)}</w:t>
+            </w:r>
+            <w:r>
+              <w:rPr>
+                <w:sz w:val="20"/>
+              </w:rPr>
+              <w:tab/>
+              <w:t xml:space="preserve">▷ </w:t>
+            </w:r>
+            <w:r>
+              <w:rPr>
+                <w:rFonts w:ascii="Times New Roman" w:hAnsi="Times New Roman"/>
+                <w:sz w:val="20"/>
+              </w:rPr>
+              <w:t>retain high-confidence candidate</w:t>
+            </w:r>
+          </w:p>
+        </w:tc>
+      </w:tr>
+      <w:tr>
+        <w:tc>
+          <w:tcPr>
+            <w:tcW w:type="dxa" w:w="604"/>
+            <w:tcBorders>
+              <w:top w:val="nil"/>
+              <w:bottom w:val="nil"/>
+              <w:left w:val="nil"/>
+              <w:right w:val="nil"/>
+            </w:tcBorders>
+          </w:tcPr>
+          <w:p>
+            <w:pPr>
+              <w:spacing w:after="0"/>
+            </w:pPr>
+            <w:r/>
+            <w:r>
+              <w:rPr>
+                <w:rFonts w:ascii="Times New Roman" w:hAnsi="Times New Roman"/>
+                <w:sz w:val="20"/>
+              </w:rPr>
+              <w:t>10:</w:t>
+            </w:r>
+          </w:p>
+        </w:tc>
+        <w:tc>
+          <w:tcPr>
+            <w:tcW w:type="dxa" w:w="7992"/>
+            <w:tcBorders>
+              <w:top w:val="nil"/>
+              <w:bottom w:val="nil"/>
+              <w:left w:val="nil"/>
+              <w:right w:val="nil"/>
+            </w:tcBorders>
+          </w:tcPr>
+          <w:p>
+            <w:pPr>
+              <w:spacing w:after="0"/>
+            </w:pPr>
+            <w:r/>
+            <w:r>
+              <w:rPr>
+                <w:rFonts w:ascii="Times New Roman" w:hAnsi="Times New Roman"/>
+                <w:b/>
+                <w:sz w:val="20"/>
+              </w:rPr>
+              <w:t>end for</w:t>
+            </w:r>
+          </w:p>
+        </w:tc>
+      </w:tr>
+      <w:tr>
+        <w:tc>
+          <w:tcPr>
+            <w:tcW w:type="dxa" w:w="604"/>
+            <w:tcBorders>
+              <w:top w:val="nil"/>
+              <w:bottom w:val="nil"/>
+              <w:left w:val="nil"/>
+              <w:right w:val="nil"/>
+            </w:tcBorders>
+          </w:tcPr>
+          <w:p>
+            <w:pPr>
+              <w:spacing w:after="0"/>
+            </w:pPr>
+            <w:r/>
+            <w:r>
+              <w:rPr>
+                <w:rFonts w:ascii="Times New Roman" w:hAnsi="Times New Roman"/>
+                <w:sz w:val="20"/>
+              </w:rPr>
+              <w:t>11:</w:t>
+            </w:r>
+          </w:p>
+        </w:tc>
+        <w:tc>
+          <w:tcPr>
+            <w:tcW w:type="dxa" w:w="7992"/>
+            <w:tcBorders>
+              <w:top w:val="nil"/>
+              <w:bottom w:val="nil"/>
+              <w:left w:val="nil"/>
+              <w:right w:val="nil"/>
+            </w:tcBorders>
+          </w:tcPr>
+          <w:p>
+            <w:pPr>
+              <w:spacing w:after="0"/>
+            </w:pPr>
+            <w:r/>
+            <w:r>
+              <w:rPr>
+                <w:rFonts w:ascii="Times New Roman" w:hAnsi="Times New Roman"/>
+                <w:b w:val="0"/>
+                <w:sz w:val="20"/>
+              </w:rPr>
+              <w:t>P_scene, P_boll ← ProjectTo3D(I, R)</w:t>
+            </w:r>
+            <w:r>
+              <w:rPr>
+                <w:sz w:val="20"/>
+              </w:rPr>
+              <w:tab/>
+              <w:t xml:space="preserve">▷ </w:t>
+            </w:r>
+            <w:r>
+              <w:rPr>
+                <w:rFonts w:ascii="Times New Roman" w:hAnsi="Times New Roman"/>
+                <w:sz w:val="20"/>
+              </w:rPr>
+              <w:t>Algorithm 3</w:t>
+            </w:r>
+          </w:p>
+        </w:tc>
+      </w:tr>
+      <w:tr>
+        <w:tc>
+          <w:tcPr>
+            <w:tcW w:type="dxa" w:w="604"/>
+            <w:tcBorders>
+              <w:top w:val="nil"/>
+              <w:bottom w:val="nil"/>
+              <w:left w:val="nil"/>
+              <w:right w:val="nil"/>
+            </w:tcBorders>
+          </w:tcPr>
+          <w:p>
+            <w:pPr>
+              <w:spacing w:after="0"/>
+            </w:pPr>
+            <w:r/>
+            <w:r>
+              <w:rPr>
+                <w:rFonts w:ascii="Times New Roman" w:hAnsi="Times New Roman"/>
+                <w:sz w:val="20"/>
+              </w:rPr>
+              <w:t>12:</w:t>
+            </w:r>
+          </w:p>
+        </w:tc>
+        <w:tc>
+          <w:tcPr>
+            <w:tcW w:type="dxa" w:w="7992"/>
+            <w:tcBorders>
+              <w:top w:val="nil"/>
+              <w:bottom w:val="nil"/>
+              <w:left w:val="nil"/>
+              <w:right w:val="nil"/>
+            </w:tcBorders>
+          </w:tcPr>
+          <w:p>
+            <w:pPr>
+              <w:spacing w:after="0"/>
+            </w:pPr>
+            <w:r/>
+            <w:r>
+              <w:rPr>
+                <w:rFonts w:ascii="Times New Roman" w:hAnsi="Times New Roman"/>
+                <w:b w:val="0"/>
+                <w:sz w:val="20"/>
+              </w:rPr>
+              <w:t>G ← AggregatePlotCells(R)</w:t>
+            </w:r>
+            <w:r>
+              <w:rPr>
+                <w:sz w:val="20"/>
+              </w:rPr>
+              <w:tab/>
+              <w:t xml:space="preserve">▷ </w:t>
+            </w:r>
+            <w:r>
+              <w:rPr>
+                <w:rFonts w:ascii="Times New Roman" w:hAnsi="Times New Roman"/>
+                <w:sz w:val="20"/>
+              </w:rPr>
+              <w:t>Algorithm 4</w:t>
+            </w:r>
+          </w:p>
+        </w:tc>
+      </w:tr>
+      <w:tr>
+        <w:tc>
+          <w:tcPr>
+            <w:tcW w:type="dxa" w:w="604"/>
+            <w:tcBorders>
+              <w:top w:val="nil"/>
+              <w:bottom w:val="nil"/>
+              <w:left w:val="nil"/>
+              <w:right w:val="nil"/>
+            </w:tcBorders>
+          </w:tcPr>
+          <w:p>
+            <w:pPr>
+              <w:spacing w:after="0"/>
+            </w:pPr>
+            <w:r/>
+            <w:r>
+              <w:rPr>
+                <w:rFonts w:ascii="Times New Roman" w:hAnsi="Times New Roman"/>
+                <w:sz w:val="20"/>
+              </w:rPr>
+              <w:t>13:</w:t>
+            </w:r>
+          </w:p>
+        </w:tc>
+        <w:tc>
+          <w:tcPr>
+            <w:tcW w:type="dxa" w:w="7992"/>
+            <w:tcBorders>
+              <w:top w:val="nil"/>
+              <w:bottom w:val="nil"/>
+              <w:left w:val="nil"/>
+              <w:right w:val="nil"/>
+            </w:tcBorders>
+          </w:tcPr>
+          <w:p>
+            <w:pPr>
+              <w:spacing w:after="0"/>
+            </w:pPr>
+            <w:r/>
+            <w:r>
+              <w:rPr>
+                <w:rFonts w:ascii="Times New Roman" w:hAnsi="Times New Roman"/>
+                <w:b/>
+                <w:sz w:val="20"/>
+              </w:rPr>
+              <w:t>output</w:t>
+            </w:r>
+            <w:r>
+              <w:rPr>
+                <w:rFonts w:ascii="Times New Roman" w:hAnsi="Times New Roman"/>
+                <w:b w:val="0"/>
+                <w:sz w:val="20"/>
+              </w:rPr>
+              <w:t xml:space="preserve"> R, mask overlay, P_scene, P_boll, G</w:t>
+            </w:r>
+          </w:p>
+        </w:tc>
+      </w:tr>
+      <w:tr>
+        <w:tc>
+          <w:tcPr>
+            <w:tcW w:type="dxa" w:w="8596"/>
+            <w:gridSpan w:val="2"/>
+            <w:tcBorders>
+              <w:top w:val="single" w:sz="8" w:space="0" w:color="000000"/>
+              <w:bottom w:val="nil"/>
+              <w:left w:val="nil"/>
+              <w:right w:val="nil"/>
+            </w:tcBorders>
+          </w:tcPr>
+          <w:p>
+            <w:r/>
+          </w:p>
+        </w:tc>
+      </w:tr>
+    </w:tbl>
     <w:p>
       <w:pPr>
-        <w:spacing w:before="120" w:after="40"/>
+        <w:spacing w:after="40"/>
       </w:pPr>
-      <w:r>
-        <w:rPr>
-          <w:b/>
-        </w:rPr>
-        <w:t>Algorithm 1. Mask-guided cotton boll phenotyping pipeline.</w:t>
-      </w:r>
     </w:p>
+    <w:tbl>
+      <w:tblPr>
+        <w:tblStyle w:val="TableGrid"/>
+        <w:tblW w:type="auto" w:w="0"/>
+        <w:jc w:val="left"/>
+        <w:tblLayout w:type="fixed"/>
+        <w:tblLook w:firstColumn="1" w:firstRow="1" w:lastColumn="0" w:lastRow="0" w:noHBand="0" w:noVBand="1" w:val="04A0"/>
+        <w:tblLayout w:type="fixed"/>
+      </w:tblPr>
+      <w:tblGrid>
+        <w:gridCol w:w="604"/>
+        <w:gridCol w:w="7992"/>
+      </w:tblGrid>
+      <w:tr>
+        <w:tc>
+          <w:tcPr>
+            <w:tcW w:type="dxa" w:w="8596"/>
+            <w:gridSpan w:val="2"/>
+            <w:tcBorders>
+              <w:top w:val="single" w:sz="12" w:space="0" w:color="000000"/>
+              <w:bottom w:val="single" w:sz="8" w:space="0" w:color="000000"/>
+              <w:left w:val="nil"/>
+              <w:right w:val="nil"/>
+            </w:tcBorders>
+          </w:tcPr>
+          <w:p>
+            <w:pPr>
+              <w:spacing w:after="20"/>
+            </w:pPr>
+            <w:r/>
+            <w:r>
+              <w:rPr>
+                <w:b/>
+                <w:sz w:val="22"/>
+              </w:rPr>
+              <w:t xml:space="preserve">Algorithm 2 </w:t>
+            </w:r>
+            <w:r>
+              <w:rPr>
+                <w:sz w:val="22"/>
+              </w:rPr>
+              <w:t>SAM-style boll mask extraction</w:t>
+            </w:r>
+          </w:p>
+        </w:tc>
+      </w:tr>
+      <w:tr>
+        <w:tc>
+          <w:tcPr>
+            <w:tcW w:type="dxa" w:w="604"/>
+            <w:tcBorders>
+              <w:top w:val="nil"/>
+              <w:bottom w:val="nil"/>
+              <w:left w:val="nil"/>
+              <w:right w:val="nil"/>
+            </w:tcBorders>
+          </w:tcPr>
+          <w:p>
+            <w:pPr>
+              <w:spacing w:after="0"/>
+            </w:pPr>
+            <w:r/>
+            <w:r>
+              <w:rPr>
+                <w:rFonts w:ascii="Times New Roman" w:hAnsi="Times New Roman"/>
+                <w:sz w:val="20"/>
+              </w:rPr>
+              <w:t>1:</w:t>
+            </w:r>
+          </w:p>
+        </w:tc>
+        <w:tc>
+          <w:tcPr>
+            <w:tcW w:type="dxa" w:w="7992"/>
+            <w:tcBorders>
+              <w:top w:val="nil"/>
+              <w:bottom w:val="nil"/>
+              <w:left w:val="nil"/>
+              <w:right w:val="nil"/>
+            </w:tcBorders>
+          </w:tcPr>
+          <w:p>
+            <w:pPr>
+              <w:spacing w:after="0"/>
+            </w:pPr>
+            <w:r/>
+            <w:r>
+              <w:rPr>
+                <w:rFonts w:ascii="Times New Roman" w:hAnsi="Times New Roman"/>
+                <w:b/>
+                <w:sz w:val="20"/>
+              </w:rPr>
+              <w:t>input:</w:t>
+            </w:r>
+            <w:r>
+              <w:rPr>
+                <w:rFonts w:ascii="Times New Roman" w:hAnsi="Times New Roman"/>
+                <w:b w:val="0"/>
+                <w:sz w:val="20"/>
+              </w:rPr>
+              <w:t xml:space="preserve"> image I, detector box b_i, color thresholds Θ_m</w:t>
+            </w:r>
+          </w:p>
+        </w:tc>
+      </w:tr>
+      <w:tr>
+        <w:tc>
+          <w:tcPr>
+            <w:tcW w:type="dxa" w:w="604"/>
+            <w:tcBorders>
+              <w:top w:val="nil"/>
+              <w:bottom w:val="nil"/>
+              <w:left w:val="nil"/>
+              <w:right w:val="nil"/>
+            </w:tcBorders>
+          </w:tcPr>
+          <w:p>
+            <w:pPr>
+              <w:spacing w:after="0"/>
+            </w:pPr>
+            <w:r/>
+            <w:r>
+              <w:rPr>
+                <w:rFonts w:ascii="Times New Roman" w:hAnsi="Times New Roman"/>
+                <w:sz w:val="20"/>
+              </w:rPr>
+              <w:t>2:</w:t>
+            </w:r>
+          </w:p>
+        </w:tc>
+        <w:tc>
+          <w:tcPr>
+            <w:tcW w:type="dxa" w:w="7992"/>
+            <w:tcBorders>
+              <w:top w:val="nil"/>
+              <w:bottom w:val="nil"/>
+              <w:left w:val="nil"/>
+              <w:right w:val="nil"/>
+            </w:tcBorders>
+          </w:tcPr>
+          <w:p>
+            <w:pPr>
+              <w:spacing w:after="0"/>
+            </w:pPr>
+            <w:r/>
+            <w:r>
+              <w:rPr>
+                <w:rFonts w:ascii="Times New Roman" w:hAnsi="Times New Roman"/>
+                <w:b w:val="0"/>
+                <w:sz w:val="20"/>
+              </w:rPr>
+              <w:t>Crop padded region C_i around b_i</w:t>
+            </w:r>
+            <w:r>
+              <w:rPr>
+                <w:sz w:val="20"/>
+              </w:rPr>
+              <w:tab/>
+              <w:t xml:space="preserve">▷ </w:t>
+            </w:r>
+            <w:r>
+              <w:rPr>
+                <w:rFonts w:ascii="Times New Roman" w:hAnsi="Times New Roman"/>
+                <w:sz w:val="20"/>
+              </w:rPr>
+              <w:t>local prompt window</w:t>
+            </w:r>
+          </w:p>
+        </w:tc>
+      </w:tr>
+      <w:tr>
+        <w:tc>
+          <w:tcPr>
+            <w:tcW w:type="dxa" w:w="604"/>
+            <w:tcBorders>
+              <w:top w:val="nil"/>
+              <w:bottom w:val="nil"/>
+              <w:left w:val="nil"/>
+              <w:right w:val="nil"/>
+            </w:tcBorders>
+          </w:tcPr>
+          <w:p>
+            <w:pPr>
+              <w:spacing w:after="0"/>
+            </w:pPr>
+            <w:r/>
+            <w:r>
+              <w:rPr>
+                <w:rFonts w:ascii="Times New Roman" w:hAnsi="Times New Roman"/>
+                <w:sz w:val="20"/>
+              </w:rPr>
+              <w:t>3:</w:t>
+            </w:r>
+          </w:p>
+        </w:tc>
+        <w:tc>
+          <w:tcPr>
+            <w:tcW w:type="dxa" w:w="7992"/>
+            <w:tcBorders>
+              <w:top w:val="nil"/>
+              <w:bottom w:val="nil"/>
+              <w:left w:val="nil"/>
+              <w:right w:val="nil"/>
+            </w:tcBorders>
+          </w:tcPr>
+          <w:p>
+            <w:pPr>
+              <w:spacing w:after="0"/>
+            </w:pPr>
+            <w:r/>
+            <w:r>
+              <w:rPr>
+                <w:rFonts w:ascii="Times New Roman" w:hAnsi="Times New Roman"/>
+                <w:b w:val="0"/>
+                <w:sz w:val="20"/>
+              </w:rPr>
+              <w:t>Convert C_i from RGB to HSV and compute excess-green response</w:t>
+            </w:r>
+            <w:r>
+              <w:rPr>
+                <w:sz w:val="20"/>
+              </w:rPr>
+              <w:tab/>
+              <w:t xml:space="preserve">▷ </w:t>
+            </w:r>
+            <w:r>
+              <w:rPr>
+                <w:rFonts w:ascii="Times New Roman" w:hAnsi="Times New Roman"/>
+                <w:sz w:val="20"/>
+              </w:rPr>
+              <w:t>color representation</w:t>
+            </w:r>
+          </w:p>
+        </w:tc>
+      </w:tr>
+      <w:tr>
+        <w:tc>
+          <w:tcPr>
+            <w:tcW w:type="dxa" w:w="604"/>
+            <w:tcBorders>
+              <w:top w:val="nil"/>
+              <w:bottom w:val="nil"/>
+              <w:left w:val="nil"/>
+              <w:right w:val="nil"/>
+            </w:tcBorders>
+          </w:tcPr>
+          <w:p>
+            <w:pPr>
+              <w:spacing w:after="0"/>
+            </w:pPr>
+            <w:r/>
+            <w:r>
+              <w:rPr>
+                <w:rFonts w:ascii="Times New Roman" w:hAnsi="Times New Roman"/>
+                <w:sz w:val="20"/>
+              </w:rPr>
+              <w:t>4:</w:t>
+            </w:r>
+          </w:p>
+        </w:tc>
+        <w:tc>
+          <w:tcPr>
+            <w:tcW w:type="dxa" w:w="7992"/>
+            <w:tcBorders>
+              <w:top w:val="nil"/>
+              <w:bottom w:val="nil"/>
+              <w:left w:val="nil"/>
+              <w:right w:val="nil"/>
+            </w:tcBorders>
+          </w:tcPr>
+          <w:p>
+            <w:pPr>
+              <w:spacing w:after="0"/>
+            </w:pPr>
+            <w:r/>
+            <w:r>
+              <w:rPr>
+                <w:rFonts w:ascii="Times New Roman" w:hAnsi="Times New Roman"/>
+                <w:b w:val="0"/>
+                <w:sz w:val="20"/>
+              </w:rPr>
+              <w:t>M_i^0 ← pixels with low saturation, high value, and limited green response</w:t>
+            </w:r>
+            <w:r>
+              <w:rPr>
+                <w:sz w:val="20"/>
+              </w:rPr>
+              <w:tab/>
+              <w:t xml:space="preserve">▷ </w:t>
+            </w:r>
+            <w:r>
+              <w:rPr>
+                <w:rFonts w:ascii="Times New Roman" w:hAnsi="Times New Roman"/>
+                <w:sz w:val="20"/>
+              </w:rPr>
+              <w:t>lint likelihood</w:t>
+            </w:r>
+          </w:p>
+        </w:tc>
+      </w:tr>
+      <w:tr>
+        <w:tc>
+          <w:tcPr>
+            <w:tcW w:type="dxa" w:w="604"/>
+            <w:tcBorders>
+              <w:top w:val="nil"/>
+              <w:bottom w:val="nil"/>
+              <w:left w:val="nil"/>
+              <w:right w:val="nil"/>
+            </w:tcBorders>
+          </w:tcPr>
+          <w:p>
+            <w:pPr>
+              <w:spacing w:after="0"/>
+            </w:pPr>
+            <w:r/>
+            <w:r>
+              <w:rPr>
+                <w:rFonts w:ascii="Times New Roman" w:hAnsi="Times New Roman"/>
+                <w:sz w:val="20"/>
+              </w:rPr>
+              <w:t>5:</w:t>
+            </w:r>
+          </w:p>
+        </w:tc>
+        <w:tc>
+          <w:tcPr>
+            <w:tcW w:type="dxa" w:w="7992"/>
+            <w:tcBorders>
+              <w:top w:val="nil"/>
+              <w:bottom w:val="nil"/>
+              <w:left w:val="nil"/>
+              <w:right w:val="nil"/>
+            </w:tcBorders>
+          </w:tcPr>
+          <w:p>
+            <w:pPr>
+              <w:spacing w:after="0"/>
+            </w:pPr>
+            <w:r/>
+            <w:r>
+              <w:rPr>
+                <w:rFonts w:ascii="Times New Roman" w:hAnsi="Times New Roman"/>
+                <w:b w:val="0"/>
+                <w:sz w:val="20"/>
+              </w:rPr>
+              <w:t>M_i^1 ← Open(Close(M_i^0)) using an elliptical structuring element</w:t>
+            </w:r>
+            <w:r>
+              <w:rPr>
+                <w:sz w:val="20"/>
+              </w:rPr>
+              <w:tab/>
+              <w:t xml:space="preserve">▷ </w:t>
+            </w:r>
+            <w:r>
+              <w:rPr>
+                <w:rFonts w:ascii="Times New Roman" w:hAnsi="Times New Roman"/>
+                <w:sz w:val="20"/>
+              </w:rPr>
+              <w:t>remove speckle</w:t>
+            </w:r>
+          </w:p>
+        </w:tc>
+      </w:tr>
+      <w:tr>
+        <w:tc>
+          <w:tcPr>
+            <w:tcW w:type="dxa" w:w="604"/>
+            <w:tcBorders>
+              <w:top w:val="nil"/>
+              <w:bottom w:val="nil"/>
+              <w:left w:val="nil"/>
+              <w:right w:val="nil"/>
+            </w:tcBorders>
+          </w:tcPr>
+          <w:p>
+            <w:pPr>
+              <w:spacing w:after="0"/>
+            </w:pPr>
+            <w:r/>
+            <w:r>
+              <w:rPr>
+                <w:rFonts w:ascii="Times New Roman" w:hAnsi="Times New Roman"/>
+                <w:sz w:val="20"/>
+              </w:rPr>
+              <w:t>6:</w:t>
+            </w:r>
+          </w:p>
+        </w:tc>
+        <w:tc>
+          <w:tcPr>
+            <w:tcW w:type="dxa" w:w="7992"/>
+            <w:tcBorders>
+              <w:top w:val="nil"/>
+              <w:bottom w:val="nil"/>
+              <w:left w:val="nil"/>
+              <w:right w:val="nil"/>
+            </w:tcBorders>
+          </w:tcPr>
+          <w:p>
+            <w:pPr>
+              <w:spacing w:after="0"/>
+            </w:pPr>
+            <w:r/>
+            <w:r>
+              <w:rPr>
+                <w:rFonts w:ascii="Times New Roman" w:hAnsi="Times New Roman"/>
+                <w:b w:val="0"/>
+                <w:sz w:val="20"/>
+              </w:rPr>
+              <w:t>{K_j} ← ConnectedComponents(M_i^1)</w:t>
+            </w:r>
+            <w:r>
+              <w:rPr>
+                <w:sz w:val="20"/>
+              </w:rPr>
+              <w:tab/>
+              <w:t xml:space="preserve">▷ </w:t>
+            </w:r>
+            <w:r>
+              <w:rPr>
+                <w:rFonts w:ascii="Times New Roman" w:hAnsi="Times New Roman"/>
+                <w:sz w:val="20"/>
+              </w:rPr>
+              <w:t>candidate components</w:t>
+            </w:r>
+          </w:p>
+        </w:tc>
+      </w:tr>
+      <w:tr>
+        <w:tc>
+          <w:tcPr>
+            <w:tcW w:type="dxa" w:w="604"/>
+            <w:tcBorders>
+              <w:top w:val="nil"/>
+              <w:bottom w:val="nil"/>
+              <w:left w:val="nil"/>
+              <w:right w:val="nil"/>
+            </w:tcBorders>
+          </w:tcPr>
+          <w:p>
+            <w:pPr>
+              <w:spacing w:after="0"/>
+            </w:pPr>
+            <w:r/>
+            <w:r>
+              <w:rPr>
+                <w:rFonts w:ascii="Times New Roman" w:hAnsi="Times New Roman"/>
+                <w:sz w:val="20"/>
+              </w:rPr>
+              <w:t>7:</w:t>
+            </w:r>
+          </w:p>
+        </w:tc>
+        <w:tc>
+          <w:tcPr>
+            <w:tcW w:type="dxa" w:w="7992"/>
+            <w:tcBorders>
+              <w:top w:val="nil"/>
+              <w:bottom w:val="nil"/>
+              <w:left w:val="nil"/>
+              <w:right w:val="nil"/>
+            </w:tcBorders>
+          </w:tcPr>
+          <w:p>
+            <w:pPr>
+              <w:spacing w:after="0"/>
+            </w:pPr>
+            <w:r/>
+            <w:r>
+              <w:rPr>
+                <w:rFonts w:ascii="Times New Roman" w:hAnsi="Times New Roman"/>
+                <w:b w:val="0"/>
+                <w:sz w:val="20"/>
+              </w:rPr>
+              <w:t>M_i ← arg max_{K_j} Area(K_j)</w:t>
+            </w:r>
+            <w:r>
+              <w:rPr>
+                <w:sz w:val="20"/>
+              </w:rPr>
+              <w:tab/>
+              <w:t xml:space="preserve">▷ </w:t>
+            </w:r>
+            <w:r>
+              <w:rPr>
+                <w:rFonts w:ascii="Times New Roman" w:hAnsi="Times New Roman"/>
+                <w:sz w:val="20"/>
+              </w:rPr>
+              <w:t>largest lint component</w:t>
+            </w:r>
+          </w:p>
+        </w:tc>
+      </w:tr>
+      <w:tr>
+        <w:tc>
+          <w:tcPr>
+            <w:tcW w:type="dxa" w:w="604"/>
+            <w:tcBorders>
+              <w:top w:val="nil"/>
+              <w:bottom w:val="nil"/>
+              <w:left w:val="nil"/>
+              <w:right w:val="nil"/>
+            </w:tcBorders>
+          </w:tcPr>
+          <w:p>
+            <w:pPr>
+              <w:spacing w:after="0"/>
+            </w:pPr>
+            <w:r/>
+            <w:r>
+              <w:rPr>
+                <w:rFonts w:ascii="Times New Roman" w:hAnsi="Times New Roman"/>
+                <w:sz w:val="20"/>
+              </w:rPr>
+              <w:t>8:</w:t>
+            </w:r>
+          </w:p>
+        </w:tc>
+        <w:tc>
+          <w:tcPr>
+            <w:tcW w:type="dxa" w:w="7992"/>
+            <w:tcBorders>
+              <w:top w:val="nil"/>
+              <w:bottom w:val="nil"/>
+              <w:left w:val="nil"/>
+              <w:right w:val="nil"/>
+            </w:tcBorders>
+          </w:tcPr>
+          <w:p>
+            <w:pPr>
+              <w:spacing w:after="0"/>
+            </w:pPr>
+            <w:r/>
+            <w:r>
+              <w:rPr>
+                <w:rFonts w:ascii="Times New Roman" w:hAnsi="Times New Roman"/>
+                <w:b w:val="0"/>
+                <w:sz w:val="20"/>
+              </w:rPr>
+              <w:t>m_i ← {Area(M_i), length(M_i), width(M_i), centroid(M_i)}</w:t>
+            </w:r>
+            <w:r>
+              <w:rPr>
+                <w:sz w:val="20"/>
+              </w:rPr>
+              <w:tab/>
+              <w:t xml:space="preserve">▷ </w:t>
+            </w:r>
+            <w:r>
+              <w:rPr>
+                <w:rFonts w:ascii="Times New Roman" w:hAnsi="Times New Roman"/>
+                <w:sz w:val="20"/>
+              </w:rPr>
+              <w:t>mask statistics</w:t>
+            </w:r>
+          </w:p>
+        </w:tc>
+      </w:tr>
+      <w:tr>
+        <w:tc>
+          <w:tcPr>
+            <w:tcW w:type="dxa" w:w="604"/>
+            <w:tcBorders>
+              <w:top w:val="nil"/>
+              <w:bottom w:val="nil"/>
+              <w:left w:val="nil"/>
+              <w:right w:val="nil"/>
+            </w:tcBorders>
+          </w:tcPr>
+          <w:p>
+            <w:pPr>
+              <w:spacing w:after="0"/>
+            </w:pPr>
+            <w:r/>
+            <w:r>
+              <w:rPr>
+                <w:rFonts w:ascii="Times New Roman" w:hAnsi="Times New Roman"/>
+                <w:sz w:val="20"/>
+              </w:rPr>
+              <w:t>9:</w:t>
+            </w:r>
+          </w:p>
+        </w:tc>
+        <w:tc>
+          <w:tcPr>
+            <w:tcW w:type="dxa" w:w="7992"/>
+            <w:tcBorders>
+              <w:top w:val="nil"/>
+              <w:bottom w:val="nil"/>
+              <w:left w:val="nil"/>
+              <w:right w:val="nil"/>
+            </w:tcBorders>
+          </w:tcPr>
+          <w:p>
+            <w:pPr>
+              <w:spacing w:after="0"/>
+            </w:pPr>
+            <w:r/>
+            <w:r>
+              <w:rPr>
+                <w:rFonts w:ascii="Times New Roman" w:hAnsi="Times New Roman"/>
+                <w:b/>
+                <w:sz w:val="20"/>
+              </w:rPr>
+              <w:t>output</w:t>
+            </w:r>
+            <w:r>
+              <w:rPr>
+                <w:rFonts w:ascii="Times New Roman" w:hAnsi="Times New Roman"/>
+                <w:b w:val="0"/>
+                <w:sz w:val="20"/>
+              </w:rPr>
+              <w:t xml:space="preserve"> M_i, m_i</w:t>
+            </w:r>
+          </w:p>
+        </w:tc>
+      </w:tr>
+      <w:tr>
+        <w:tc>
+          <w:tcPr>
+            <w:tcW w:type="dxa" w:w="8596"/>
+            <w:gridSpan w:val="2"/>
+            <w:tcBorders>
+              <w:top w:val="single" w:sz="8" w:space="0" w:color="000000"/>
+              <w:bottom w:val="nil"/>
+              <w:left w:val="nil"/>
+              <w:right w:val="nil"/>
+            </w:tcBorders>
+          </w:tcPr>
+          <w:p>
+            <w:r/>
+          </w:p>
+        </w:tc>
+      </w:tr>
+    </w:tbl>
     <w:p>
       <w:pPr>
-        <w:spacing w:after="80"/>
+        <w:spacing w:after="40"/>
       </w:pPr>
-      <w:r>
-        <w:rPr>
-          <w:i/>
-        </w:rPr>
-        <w:t>Input: UAV image I, phase p, scale s or calibration metadata, detector parameters, mask parameters.</w:t>
-      </w:r>
     </w:p>
+    <w:tbl>
+      <w:tblPr>
+        <w:tblStyle w:val="TableGrid"/>
+        <w:tblW w:type="auto" w:w="0"/>
+        <w:jc w:val="left"/>
+        <w:tblLayout w:type="fixed"/>
+        <w:tblLook w:firstColumn="1" w:firstRow="1" w:lastColumn="0" w:lastRow="0" w:noHBand="0" w:noVBand="1" w:val="04A0"/>
+        <w:tblLayout w:type="fixed"/>
+      </w:tblPr>
+      <w:tblGrid>
+        <w:gridCol w:w="604"/>
+        <w:gridCol w:w="7992"/>
+      </w:tblGrid>
+      <w:tr>
+        <w:tc>
+          <w:tcPr>
+            <w:tcW w:type="dxa" w:w="8596"/>
+            <w:gridSpan w:val="2"/>
+            <w:tcBorders>
+              <w:top w:val="single" w:sz="12" w:space="0" w:color="000000"/>
+              <w:bottom w:val="single" w:sz="8" w:space="0" w:color="000000"/>
+              <w:left w:val="nil"/>
+              <w:right w:val="nil"/>
+            </w:tcBorders>
+          </w:tcPr>
+          <w:p>
+            <w:pPr>
+              <w:spacing w:after="20"/>
+            </w:pPr>
+            <w:r/>
+            <w:r>
+              <w:rPr>
+                <w:b/>
+                <w:sz w:val="22"/>
+              </w:rPr>
+              <w:t xml:space="preserve">Algorithm 3 </w:t>
+            </w:r>
+            <w:r>
+              <w:rPr>
+                <w:sz w:val="22"/>
+              </w:rPr>
+              <w:t>Mask-to-3D projection and trait estimation</w:t>
+            </w:r>
+          </w:p>
+        </w:tc>
+      </w:tr>
+      <w:tr>
+        <w:tc>
+          <w:tcPr>
+            <w:tcW w:type="dxa" w:w="604"/>
+            <w:tcBorders>
+              <w:top w:val="nil"/>
+              <w:bottom w:val="nil"/>
+              <w:left w:val="nil"/>
+              <w:right w:val="nil"/>
+            </w:tcBorders>
+          </w:tcPr>
+          <w:p>
+            <w:pPr>
+              <w:spacing w:after="0"/>
+            </w:pPr>
+            <w:r/>
+            <w:r>
+              <w:rPr>
+                <w:rFonts w:ascii="Times New Roman" w:hAnsi="Times New Roman"/>
+                <w:sz w:val="20"/>
+              </w:rPr>
+              <w:t>1:</w:t>
+            </w:r>
+          </w:p>
+        </w:tc>
+        <w:tc>
+          <w:tcPr>
+            <w:tcW w:type="dxa" w:w="7992"/>
+            <w:tcBorders>
+              <w:top w:val="nil"/>
+              <w:bottom w:val="nil"/>
+              <w:left w:val="nil"/>
+              <w:right w:val="nil"/>
+            </w:tcBorders>
+          </w:tcPr>
+          <w:p>
+            <w:pPr>
+              <w:spacing w:after="0"/>
+            </w:pPr>
+            <w:r/>
+            <w:r>
+              <w:rPr>
+                <w:rFonts w:ascii="Times New Roman" w:hAnsi="Times New Roman"/>
+                <w:b/>
+                <w:sz w:val="20"/>
+              </w:rPr>
+              <w:t>input:</w:t>
+            </w:r>
+            <w:r>
+              <w:rPr>
+                <w:rFonts w:ascii="Times New Roman" w:hAnsi="Times New Roman"/>
+                <w:b w:val="0"/>
+                <w:sz w:val="20"/>
+              </w:rPr>
+              <w:t xml:space="preserve"> mask M_i, depth or calibrated geometry Z, scale s, candidate b_i</w:t>
+            </w:r>
+          </w:p>
+        </w:tc>
+      </w:tr>
+      <w:tr>
+        <w:tc>
+          <w:tcPr>
+            <w:tcW w:type="dxa" w:w="604"/>
+            <w:tcBorders>
+              <w:top w:val="nil"/>
+              <w:bottom w:val="nil"/>
+              <w:left w:val="nil"/>
+              <w:right w:val="nil"/>
+            </w:tcBorders>
+          </w:tcPr>
+          <w:p>
+            <w:pPr>
+              <w:spacing w:after="0"/>
+            </w:pPr>
+            <w:r/>
+            <w:r>
+              <w:rPr>
+                <w:rFonts w:ascii="Times New Roman" w:hAnsi="Times New Roman"/>
+                <w:sz w:val="20"/>
+              </w:rPr>
+              <w:t>2:</w:t>
+            </w:r>
+          </w:p>
+        </w:tc>
+        <w:tc>
+          <w:tcPr>
+            <w:tcW w:type="dxa" w:w="7992"/>
+            <w:tcBorders>
+              <w:top w:val="nil"/>
+              <w:bottom w:val="nil"/>
+              <w:left w:val="nil"/>
+              <w:right w:val="nil"/>
+            </w:tcBorders>
+          </w:tcPr>
+          <w:p>
+            <w:pPr>
+              <w:spacing w:after="0"/>
+            </w:pPr>
+            <w:r/>
+            <w:r>
+              <w:rPr>
+                <w:rFonts w:ascii="Times New Roman" w:hAnsi="Times New Roman"/>
+                <w:b w:val="0"/>
+                <w:sz w:val="20"/>
+              </w:rPr>
+              <w:t>S_i ← {(u, v) | M_i(u, v) = 1}</w:t>
+            </w:r>
+            <w:r>
+              <w:rPr>
+                <w:sz w:val="20"/>
+              </w:rPr>
+              <w:tab/>
+              <w:t xml:space="preserve">▷ </w:t>
+            </w:r>
+            <w:r>
+              <w:rPr>
+                <w:rFonts w:ascii="Times New Roman" w:hAnsi="Times New Roman"/>
+                <w:sz w:val="20"/>
+              </w:rPr>
+              <w:t>foreground mask pixels</w:t>
+            </w:r>
+          </w:p>
+        </w:tc>
+      </w:tr>
+      <w:tr>
+        <w:tc>
+          <w:tcPr>
+            <w:tcW w:type="dxa" w:w="604"/>
+            <w:tcBorders>
+              <w:top w:val="nil"/>
+              <w:bottom w:val="nil"/>
+              <w:left w:val="nil"/>
+              <w:right w:val="nil"/>
+            </w:tcBorders>
+          </w:tcPr>
+          <w:p>
+            <w:pPr>
+              <w:spacing w:after="0"/>
+            </w:pPr>
+            <w:r/>
+            <w:r>
+              <w:rPr>
+                <w:rFonts w:ascii="Times New Roman" w:hAnsi="Times New Roman"/>
+                <w:sz w:val="20"/>
+              </w:rPr>
+              <w:t>3:</w:t>
+            </w:r>
+          </w:p>
+        </w:tc>
+        <w:tc>
+          <w:tcPr>
+            <w:tcW w:type="dxa" w:w="7992"/>
+            <w:tcBorders>
+              <w:top w:val="nil"/>
+              <w:bottom w:val="nil"/>
+              <w:left w:val="nil"/>
+              <w:right w:val="nil"/>
+            </w:tcBorders>
+          </w:tcPr>
+          <w:p>
+            <w:pPr>
+              <w:spacing w:after="0"/>
+            </w:pPr>
+            <w:r/>
+            <w:r>
+              <w:rPr>
+                <w:rFonts w:ascii="Times New Roman" w:hAnsi="Times New Roman"/>
+                <w:b/>
+                <w:sz w:val="20"/>
+              </w:rPr>
+              <w:t>if</w:t>
+            </w:r>
+            <w:r>
+              <w:rPr>
+                <w:rFonts w:ascii="Times New Roman" w:hAnsi="Times New Roman"/>
+                <w:b w:val="0"/>
+                <w:sz w:val="20"/>
+              </w:rPr>
+              <w:t xml:space="preserve"> |S_i| &gt; N_max </w:t>
+            </w:r>
+            <w:r>
+              <w:rPr>
+                <w:rFonts w:ascii="Times New Roman" w:hAnsi="Times New Roman"/>
+                <w:b/>
+                <w:sz w:val="20"/>
+              </w:rPr>
+              <w:t>then</w:t>
+            </w:r>
+            <w:r>
+              <w:rPr>
+                <w:rFonts w:ascii="Times New Roman" w:hAnsi="Times New Roman"/>
+                <w:b w:val="0"/>
+                <w:sz w:val="20"/>
+              </w:rPr>
+              <w:t xml:space="preserve"> subsample S_i for interactive review</w:t>
+            </w:r>
+            <w:r>
+              <w:rPr>
+                <w:sz w:val="20"/>
+              </w:rPr>
+              <w:tab/>
+              <w:t xml:space="preserve">▷ </w:t>
+            </w:r>
+            <w:r>
+              <w:rPr>
+                <w:rFonts w:ascii="Times New Roman" w:hAnsi="Times New Roman"/>
+                <w:sz w:val="20"/>
+              </w:rPr>
+              <w:t>rendering budget</w:t>
+            </w:r>
+          </w:p>
+        </w:tc>
+      </w:tr>
+      <w:tr>
+        <w:tc>
+          <w:tcPr>
+            <w:tcW w:type="dxa" w:w="604"/>
+            <w:tcBorders>
+              <w:top w:val="nil"/>
+              <w:bottom w:val="nil"/>
+              <w:left w:val="nil"/>
+              <w:right w:val="nil"/>
+            </w:tcBorders>
+          </w:tcPr>
+          <w:p>
+            <w:pPr>
+              <w:spacing w:after="0"/>
+            </w:pPr>
+            <w:r/>
+            <w:r>
+              <w:rPr>
+                <w:rFonts w:ascii="Times New Roman" w:hAnsi="Times New Roman"/>
+                <w:sz w:val="20"/>
+              </w:rPr>
+              <w:t>4:</w:t>
+            </w:r>
+          </w:p>
+        </w:tc>
+        <w:tc>
+          <w:tcPr>
+            <w:tcW w:type="dxa" w:w="7992"/>
+            <w:tcBorders>
+              <w:top w:val="nil"/>
+              <w:bottom w:val="nil"/>
+              <w:left w:val="nil"/>
+              <w:right w:val="nil"/>
+            </w:tcBorders>
+          </w:tcPr>
+          <w:p>
+            <w:pPr>
+              <w:spacing w:after="0"/>
+            </w:pPr>
+            <w:r/>
+            <w:r>
+              <w:rPr>
+                <w:rFonts w:ascii="Times New Roman" w:hAnsi="Times New Roman"/>
+                <w:b/>
+                <w:sz w:val="20"/>
+              </w:rPr>
+              <w:t>for</w:t>
+            </w:r>
+            <w:r>
+              <w:rPr>
+                <w:rFonts w:ascii="Times New Roman" w:hAnsi="Times New Roman"/>
+                <w:b w:val="0"/>
+                <w:sz w:val="20"/>
+              </w:rPr>
+              <w:t xml:space="preserve"> each pixel (u, v) ∈ S_i </w:t>
+            </w:r>
+            <w:r>
+              <w:rPr>
+                <w:rFonts w:ascii="Times New Roman" w:hAnsi="Times New Roman"/>
+                <w:b/>
+                <w:sz w:val="20"/>
+              </w:rPr>
+              <w:t>do</w:t>
+            </w:r>
+          </w:p>
+        </w:tc>
+      </w:tr>
+      <w:tr>
+        <w:tc>
+          <w:tcPr>
+            <w:tcW w:type="dxa" w:w="604"/>
+            <w:tcBorders>
+              <w:top w:val="nil"/>
+              <w:bottom w:val="nil"/>
+              <w:left w:val="nil"/>
+              <w:right w:val="nil"/>
+            </w:tcBorders>
+          </w:tcPr>
+          <w:p>
+            <w:pPr>
+              <w:spacing w:after="0"/>
+            </w:pPr>
+            <w:r/>
+            <w:r>
+              <w:rPr>
+                <w:rFonts w:ascii="Times New Roman" w:hAnsi="Times New Roman"/>
+                <w:sz w:val="20"/>
+              </w:rPr>
+              <w:t>5:</w:t>
+            </w:r>
+          </w:p>
+        </w:tc>
+        <w:tc>
+          <w:tcPr>
+            <w:tcW w:type="dxa" w:w="7992"/>
+            <w:tcBorders>
+              <w:top w:val="nil"/>
+              <w:bottom w:val="nil"/>
+              <w:left w:val="nil"/>
+              <w:right w:val="nil"/>
+            </w:tcBorders>
+          </w:tcPr>
+          <w:p>
+            <w:pPr>
+              <w:spacing w:after="0"/>
+            </w:pPr>
+            <w:r/>
+            <w:r>
+              <w:rPr>
+                <w:rFonts w:ascii="Times New Roman" w:hAnsi="Times New Roman"/>
+                <w:b w:val="0"/>
+                <w:sz w:val="20"/>
+              </w:rPr>
+              <w:t xml:space="preserve">    (x, y, z) ← BackProject(u, v, Z)</w:t>
+            </w:r>
+            <w:r>
+              <w:rPr>
+                <w:sz w:val="20"/>
+              </w:rPr>
+              <w:tab/>
+              <w:t xml:space="preserve">▷ </w:t>
+            </w:r>
+            <w:r>
+              <w:rPr>
+                <w:rFonts w:ascii="Times New Roman" w:hAnsi="Times New Roman"/>
+                <w:sz w:val="20"/>
+              </w:rPr>
+              <w:t>proxy or calibrated geometry</w:t>
+            </w:r>
+          </w:p>
+        </w:tc>
+      </w:tr>
+      <w:tr>
+        <w:tc>
+          <w:tcPr>
+            <w:tcW w:type="dxa" w:w="604"/>
+            <w:tcBorders>
+              <w:top w:val="nil"/>
+              <w:bottom w:val="nil"/>
+              <w:left w:val="nil"/>
+              <w:right w:val="nil"/>
+            </w:tcBorders>
+          </w:tcPr>
+          <w:p>
+            <w:pPr>
+              <w:spacing w:after="0"/>
+            </w:pPr>
+            <w:r/>
+            <w:r>
+              <w:rPr>
+                <w:rFonts w:ascii="Times New Roman" w:hAnsi="Times New Roman"/>
+                <w:sz w:val="20"/>
+              </w:rPr>
+              <w:t>6:</w:t>
+            </w:r>
+          </w:p>
+        </w:tc>
+        <w:tc>
+          <w:tcPr>
+            <w:tcW w:type="dxa" w:w="7992"/>
+            <w:tcBorders>
+              <w:top w:val="nil"/>
+              <w:bottom w:val="nil"/>
+              <w:left w:val="nil"/>
+              <w:right w:val="nil"/>
+            </w:tcBorders>
+          </w:tcPr>
+          <w:p>
+            <w:pPr>
+              <w:spacing w:after="0"/>
+            </w:pPr>
+            <w:r/>
+            <w:r>
+              <w:rPr>
+                <w:rFonts w:ascii="Times New Roman" w:hAnsi="Times New Roman"/>
+                <w:b w:val="0"/>
+                <w:sz w:val="20"/>
+              </w:rPr>
+              <w:t xml:space="preserve">    Append (x, y, z, color_i) to P_boll</w:t>
+            </w:r>
+            <w:r>
+              <w:rPr>
+                <w:sz w:val="20"/>
+              </w:rPr>
+              <w:tab/>
+              <w:t xml:space="preserve">▷ </w:t>
+            </w:r>
+            <w:r>
+              <w:rPr>
+                <w:rFonts w:ascii="Times New Roman" w:hAnsi="Times New Roman"/>
+                <w:sz w:val="20"/>
+              </w:rPr>
+              <w:t>highlighted boll cloud</w:t>
+            </w:r>
+          </w:p>
+        </w:tc>
+      </w:tr>
+      <w:tr>
+        <w:tc>
+          <w:tcPr>
+            <w:tcW w:type="dxa" w:w="604"/>
+            <w:tcBorders>
+              <w:top w:val="nil"/>
+              <w:bottom w:val="nil"/>
+              <w:left w:val="nil"/>
+              <w:right w:val="nil"/>
+            </w:tcBorders>
+          </w:tcPr>
+          <w:p>
+            <w:pPr>
+              <w:spacing w:after="0"/>
+            </w:pPr>
+            <w:r/>
+            <w:r>
+              <w:rPr>
+                <w:rFonts w:ascii="Times New Roman" w:hAnsi="Times New Roman"/>
+                <w:sz w:val="20"/>
+              </w:rPr>
+              <w:t>7:</w:t>
+            </w:r>
+          </w:p>
+        </w:tc>
+        <w:tc>
+          <w:tcPr>
+            <w:tcW w:type="dxa" w:w="7992"/>
+            <w:tcBorders>
+              <w:top w:val="nil"/>
+              <w:bottom w:val="nil"/>
+              <w:left w:val="nil"/>
+              <w:right w:val="nil"/>
+            </w:tcBorders>
+          </w:tcPr>
+          <w:p>
+            <w:pPr>
+              <w:spacing w:after="0"/>
+            </w:pPr>
+            <w:r/>
+            <w:r>
+              <w:rPr>
+                <w:rFonts w:ascii="Times New Roman" w:hAnsi="Times New Roman"/>
+                <w:b/>
+                <w:sz w:val="20"/>
+              </w:rPr>
+              <w:t>end for</w:t>
+            </w:r>
+          </w:p>
+        </w:tc>
+      </w:tr>
+      <w:tr>
+        <w:tc>
+          <w:tcPr>
+            <w:tcW w:type="dxa" w:w="604"/>
+            <w:tcBorders>
+              <w:top w:val="nil"/>
+              <w:bottom w:val="nil"/>
+              <w:left w:val="nil"/>
+              <w:right w:val="nil"/>
+            </w:tcBorders>
+          </w:tcPr>
+          <w:p>
+            <w:pPr>
+              <w:spacing w:after="0"/>
+            </w:pPr>
+            <w:r/>
+            <w:r>
+              <w:rPr>
+                <w:rFonts w:ascii="Times New Roman" w:hAnsi="Times New Roman"/>
+                <w:sz w:val="20"/>
+              </w:rPr>
+              <w:t>8:</w:t>
+            </w:r>
+          </w:p>
+        </w:tc>
+        <w:tc>
+          <w:tcPr>
+            <w:tcW w:type="dxa" w:w="7992"/>
+            <w:tcBorders>
+              <w:top w:val="nil"/>
+              <w:bottom w:val="nil"/>
+              <w:left w:val="nil"/>
+              <w:right w:val="nil"/>
+            </w:tcBorders>
+          </w:tcPr>
+          <w:p>
+            <w:pPr>
+              <w:spacing w:after="0"/>
+            </w:pPr>
+            <w:r/>
+            <w:r>
+              <w:rPr>
+                <w:rFonts w:ascii="Times New Roman" w:hAnsi="Times New Roman"/>
+                <w:b w:val="0"/>
+                <w:sz w:val="20"/>
+              </w:rPr>
+              <w:t>Compute L_i, W_i, D_i, V_i, ν_i, q_i</w:t>
+            </w:r>
+            <w:r>
+              <w:rPr>
+                <w:sz w:val="20"/>
+              </w:rPr>
+              <w:tab/>
+              <w:t xml:space="preserve">▷ </w:t>
+            </w:r>
+            <w:r>
+              <w:rPr>
+                <w:rFonts w:ascii="Times New Roman" w:hAnsi="Times New Roman"/>
+                <w:sz w:val="20"/>
+              </w:rPr>
+              <w:t>Equations (1)-(6)</w:t>
+            </w:r>
+          </w:p>
+        </w:tc>
+      </w:tr>
+      <w:tr>
+        <w:tc>
+          <w:tcPr>
+            <w:tcW w:type="dxa" w:w="604"/>
+            <w:tcBorders>
+              <w:top w:val="nil"/>
+              <w:bottom w:val="nil"/>
+              <w:left w:val="nil"/>
+              <w:right w:val="nil"/>
+            </w:tcBorders>
+          </w:tcPr>
+          <w:p>
+            <w:pPr>
+              <w:spacing w:after="0"/>
+            </w:pPr>
+            <w:r/>
+            <w:r>
+              <w:rPr>
+                <w:rFonts w:ascii="Times New Roman" w:hAnsi="Times New Roman"/>
+                <w:sz w:val="20"/>
+              </w:rPr>
+              <w:t>9:</w:t>
+            </w:r>
+          </w:p>
+        </w:tc>
+        <w:tc>
+          <w:tcPr>
+            <w:tcW w:type="dxa" w:w="7992"/>
+            <w:tcBorders>
+              <w:top w:val="nil"/>
+              <w:bottom w:val="nil"/>
+              <w:left w:val="nil"/>
+              <w:right w:val="nil"/>
+            </w:tcBorders>
+          </w:tcPr>
+          <w:p>
+            <w:pPr>
+              <w:spacing w:after="0"/>
+            </w:pPr>
+            <w:r/>
+            <w:r>
+              <w:rPr>
+                <w:rFonts w:ascii="Times New Roman" w:hAnsi="Times New Roman"/>
+                <w:b w:val="0"/>
+                <w:sz w:val="20"/>
+              </w:rPr>
+              <w:t>Export P_boll as boll_mask_point_cloud.ply</w:t>
+            </w:r>
+            <w:r>
+              <w:rPr>
+                <w:sz w:val="20"/>
+              </w:rPr>
+              <w:tab/>
+              <w:t xml:space="preserve">▷ </w:t>
+            </w:r>
+            <w:r>
+              <w:rPr>
+                <w:rFonts w:ascii="Times New Roman" w:hAnsi="Times New Roman"/>
+                <w:sz w:val="20"/>
+              </w:rPr>
+              <w:t>3D review artifact</w:t>
+            </w:r>
+          </w:p>
+        </w:tc>
+      </w:tr>
+      <w:tr>
+        <w:tc>
+          <w:tcPr>
+            <w:tcW w:type="dxa" w:w="604"/>
+            <w:tcBorders>
+              <w:top w:val="nil"/>
+              <w:bottom w:val="nil"/>
+              <w:left w:val="nil"/>
+              <w:right w:val="nil"/>
+            </w:tcBorders>
+          </w:tcPr>
+          <w:p>
+            <w:pPr>
+              <w:spacing w:after="0"/>
+            </w:pPr>
+            <w:r/>
+            <w:r>
+              <w:rPr>
+                <w:rFonts w:ascii="Times New Roman" w:hAnsi="Times New Roman"/>
+                <w:sz w:val="20"/>
+              </w:rPr>
+              <w:t>10:</w:t>
+            </w:r>
+          </w:p>
+        </w:tc>
+        <w:tc>
+          <w:tcPr>
+            <w:tcW w:type="dxa" w:w="7992"/>
+            <w:tcBorders>
+              <w:top w:val="nil"/>
+              <w:bottom w:val="nil"/>
+              <w:left w:val="nil"/>
+              <w:right w:val="nil"/>
+            </w:tcBorders>
+          </w:tcPr>
+          <w:p>
+            <w:pPr>
+              <w:spacing w:after="0"/>
+            </w:pPr>
+            <w:r/>
+            <w:r>
+              <w:rPr>
+                <w:rFonts w:ascii="Times New Roman" w:hAnsi="Times New Roman"/>
+                <w:b/>
+                <w:sz w:val="20"/>
+              </w:rPr>
+              <w:t>output</w:t>
+            </w:r>
+            <w:r>
+              <w:rPr>
+                <w:rFonts w:ascii="Times New Roman" w:hAnsi="Times New Roman"/>
+                <w:b w:val="0"/>
+                <w:sz w:val="20"/>
+              </w:rPr>
+              <w:t xml:space="preserve"> P_boll and trait vector x_i</w:t>
+            </w:r>
+          </w:p>
+        </w:tc>
+      </w:tr>
+      <w:tr>
+        <w:tc>
+          <w:tcPr>
+            <w:tcW w:type="dxa" w:w="8596"/>
+            <w:gridSpan w:val="2"/>
+            <w:tcBorders>
+              <w:top w:val="single" w:sz="8" w:space="0" w:color="000000"/>
+              <w:bottom w:val="nil"/>
+              <w:left w:val="nil"/>
+              <w:right w:val="nil"/>
+            </w:tcBorders>
+          </w:tcPr>
+          <w:p>
+            <w:r/>
+          </w:p>
+        </w:tc>
+      </w:tr>
+    </w:tbl>
     <w:p>
       <w:pPr>
-        <w:spacing w:after="80"/>
+        <w:spacing w:after="40"/>
       </w:pPr>
-      <w:r>
-        <w:rPr>
-          <w:i/>
-        </w:rPr>
-        <w:t>Output: Measurement table, mask overlay, scene point cloud, boll-mask point cloud, and plot-cell summary.</w:t>
-      </w:r>
     </w:p>
+    <w:tbl>
+      <w:tblPr>
+        <w:tblStyle w:val="TableGrid"/>
+        <w:tblW w:type="auto" w:w="0"/>
+        <w:jc w:val="left"/>
+        <w:tblLayout w:type="fixed"/>
+        <w:tblLook w:firstColumn="1" w:firstRow="1" w:lastColumn="0" w:lastRow="0" w:noHBand="0" w:noVBand="1" w:val="04A0"/>
+        <w:tblLayout w:type="fixed"/>
+      </w:tblPr>
+      <w:tblGrid>
+        <w:gridCol w:w="604"/>
+        <w:gridCol w:w="7992"/>
+      </w:tblGrid>
+      <w:tr>
+        <w:tc>
+          <w:tcPr>
+            <w:tcW w:type="dxa" w:w="8596"/>
+            <w:gridSpan w:val="2"/>
+            <w:tcBorders>
+              <w:top w:val="single" w:sz="12" w:space="0" w:color="000000"/>
+              <w:bottom w:val="single" w:sz="8" w:space="0" w:color="000000"/>
+              <w:left w:val="nil"/>
+              <w:right w:val="nil"/>
+            </w:tcBorders>
+          </w:tcPr>
+          <w:p>
+            <w:pPr>
+              <w:spacing w:after="20"/>
+            </w:pPr>
+            <w:r/>
+            <w:r>
+              <w:rPr>
+                <w:b/>
+                <w:sz w:val="22"/>
+              </w:rPr>
+              <w:t xml:space="preserve">Algorithm 4 </w:t>
+            </w:r>
+            <w:r>
+              <w:rPr>
+                <w:sz w:val="22"/>
+              </w:rPr>
+              <w:t>Plot-cell aggregation</w:t>
+            </w:r>
+          </w:p>
+        </w:tc>
+      </w:tr>
+      <w:tr>
+        <w:tc>
+          <w:tcPr>
+            <w:tcW w:type="dxa" w:w="604"/>
+            <w:tcBorders>
+              <w:top w:val="nil"/>
+              <w:bottom w:val="nil"/>
+              <w:left w:val="nil"/>
+              <w:right w:val="nil"/>
+            </w:tcBorders>
+          </w:tcPr>
+          <w:p>
+            <w:pPr>
+              <w:spacing w:after="0"/>
+            </w:pPr>
+            <w:r/>
+            <w:r>
+              <w:rPr>
+                <w:rFonts w:ascii="Times New Roman" w:hAnsi="Times New Roman"/>
+                <w:sz w:val="20"/>
+              </w:rPr>
+              <w:t>1:</w:t>
+            </w:r>
+          </w:p>
+        </w:tc>
+        <w:tc>
+          <w:tcPr>
+            <w:tcW w:type="dxa" w:w="7992"/>
+            <w:tcBorders>
+              <w:top w:val="nil"/>
+              <w:bottom w:val="nil"/>
+              <w:left w:val="nil"/>
+              <w:right w:val="nil"/>
+            </w:tcBorders>
+          </w:tcPr>
+          <w:p>
+            <w:pPr>
+              <w:spacing w:after="0"/>
+            </w:pPr>
+            <w:r/>
+            <w:r>
+              <w:rPr>
+                <w:rFonts w:ascii="Times New Roman" w:hAnsi="Times New Roman"/>
+                <w:b/>
+                <w:sz w:val="20"/>
+              </w:rPr>
+              <w:t>input:</w:t>
+            </w:r>
+            <w:r>
+              <w:rPr>
+                <w:rFonts w:ascii="Times New Roman" w:hAnsi="Times New Roman"/>
+                <w:b w:val="0"/>
+                <w:sz w:val="20"/>
+              </w:rPr>
+              <w:t xml:space="preserve"> measurement-ready candidates R and plot grid G with rows r and columns c</w:t>
+            </w:r>
+          </w:p>
+        </w:tc>
+      </w:tr>
+      <w:tr>
+        <w:tc>
+          <w:tcPr>
+            <w:tcW w:type="dxa" w:w="604"/>
+            <w:tcBorders>
+              <w:top w:val="nil"/>
+              <w:bottom w:val="nil"/>
+              <w:left w:val="nil"/>
+              <w:right w:val="nil"/>
+            </w:tcBorders>
+          </w:tcPr>
+          <w:p>
+            <w:pPr>
+              <w:spacing w:after="0"/>
+            </w:pPr>
+            <w:r/>
+            <w:r>
+              <w:rPr>
+                <w:rFonts w:ascii="Times New Roman" w:hAnsi="Times New Roman"/>
+                <w:sz w:val="20"/>
+              </w:rPr>
+              <w:t>2:</w:t>
+            </w:r>
+          </w:p>
+        </w:tc>
+        <w:tc>
+          <w:tcPr>
+            <w:tcW w:type="dxa" w:w="7992"/>
+            <w:tcBorders>
+              <w:top w:val="nil"/>
+              <w:bottom w:val="nil"/>
+              <w:left w:val="nil"/>
+              <w:right w:val="nil"/>
+            </w:tcBorders>
+          </w:tcPr>
+          <w:p>
+            <w:pPr>
+              <w:spacing w:after="0"/>
+            </w:pPr>
+            <w:r/>
+            <w:r>
+              <w:rPr>
+                <w:rFonts w:ascii="Times New Roman" w:hAnsi="Times New Roman"/>
+                <w:b/>
+                <w:sz w:val="20"/>
+              </w:rPr>
+              <w:t>initialize</w:t>
+            </w:r>
+            <w:r>
+              <w:rPr>
+                <w:rFonts w:ascii="Times New Roman" w:hAnsi="Times New Roman"/>
+                <w:b w:val="0"/>
+                <w:sz w:val="20"/>
+              </w:rPr>
+              <w:t xml:space="preserve"> C_rc ← 0 and trait lists T_rc ← ∅ for all cells G_rc</w:t>
+            </w:r>
+          </w:p>
+        </w:tc>
+      </w:tr>
+      <w:tr>
+        <w:tc>
+          <w:tcPr>
+            <w:tcW w:type="dxa" w:w="604"/>
+            <w:tcBorders>
+              <w:top w:val="nil"/>
+              <w:bottom w:val="nil"/>
+              <w:left w:val="nil"/>
+              <w:right w:val="nil"/>
+            </w:tcBorders>
+          </w:tcPr>
+          <w:p>
+            <w:pPr>
+              <w:spacing w:after="0"/>
+            </w:pPr>
+            <w:r/>
+            <w:r>
+              <w:rPr>
+                <w:rFonts w:ascii="Times New Roman" w:hAnsi="Times New Roman"/>
+                <w:sz w:val="20"/>
+              </w:rPr>
+              <w:t>3:</w:t>
+            </w:r>
+          </w:p>
+        </w:tc>
+        <w:tc>
+          <w:tcPr>
+            <w:tcW w:type="dxa" w:w="7992"/>
+            <w:tcBorders>
+              <w:top w:val="nil"/>
+              <w:bottom w:val="nil"/>
+              <w:left w:val="nil"/>
+              <w:right w:val="nil"/>
+            </w:tcBorders>
+          </w:tcPr>
+          <w:p>
+            <w:pPr>
+              <w:spacing w:after="0"/>
+            </w:pPr>
+            <w:r/>
+            <w:r>
+              <w:rPr>
+                <w:rFonts w:ascii="Times New Roman" w:hAnsi="Times New Roman"/>
+                <w:b/>
+                <w:sz w:val="20"/>
+              </w:rPr>
+              <w:t>for</w:t>
+            </w:r>
+            <w:r>
+              <w:rPr>
+                <w:rFonts w:ascii="Times New Roman" w:hAnsi="Times New Roman"/>
+                <w:b w:val="0"/>
+                <w:sz w:val="20"/>
+              </w:rPr>
+              <w:t xml:space="preserve"> each candidate i ∈ R </w:t>
+            </w:r>
+            <w:r>
+              <w:rPr>
+                <w:rFonts w:ascii="Times New Roman" w:hAnsi="Times New Roman"/>
+                <w:b/>
+                <w:sz w:val="20"/>
+              </w:rPr>
+              <w:t>do</w:t>
+            </w:r>
+          </w:p>
+        </w:tc>
+      </w:tr>
+      <w:tr>
+        <w:tc>
+          <w:tcPr>
+            <w:tcW w:type="dxa" w:w="604"/>
+            <w:tcBorders>
+              <w:top w:val="nil"/>
+              <w:bottom w:val="nil"/>
+              <w:left w:val="nil"/>
+              <w:right w:val="nil"/>
+            </w:tcBorders>
+          </w:tcPr>
+          <w:p>
+            <w:pPr>
+              <w:spacing w:after="0"/>
+            </w:pPr>
+            <w:r/>
+            <w:r>
+              <w:rPr>
+                <w:rFonts w:ascii="Times New Roman" w:hAnsi="Times New Roman"/>
+                <w:sz w:val="20"/>
+              </w:rPr>
+              <w:t>4:</w:t>
+            </w:r>
+          </w:p>
+        </w:tc>
+        <w:tc>
+          <w:tcPr>
+            <w:tcW w:type="dxa" w:w="7992"/>
+            <w:tcBorders>
+              <w:top w:val="nil"/>
+              <w:bottom w:val="nil"/>
+              <w:left w:val="nil"/>
+              <w:right w:val="nil"/>
+            </w:tcBorders>
+          </w:tcPr>
+          <w:p>
+            <w:pPr>
+              <w:spacing w:after="0"/>
+            </w:pPr>
+            <w:r/>
+            <w:r>
+              <w:rPr>
+                <w:rFonts w:ascii="Times New Roman" w:hAnsi="Times New Roman"/>
+                <w:b w:val="0"/>
+                <w:sz w:val="20"/>
+              </w:rPr>
+              <w:t xml:space="preserve">    center_i ← centroid(M_i) or center(b_i)</w:t>
+            </w:r>
+            <w:r>
+              <w:rPr>
+                <w:sz w:val="20"/>
+              </w:rPr>
+              <w:tab/>
+              <w:t xml:space="preserve">▷ </w:t>
+            </w:r>
+            <w:r>
+              <w:rPr>
+                <w:rFonts w:ascii="Times New Roman" w:hAnsi="Times New Roman"/>
+                <w:sz w:val="20"/>
+              </w:rPr>
+              <w:t>candidate location</w:t>
+            </w:r>
+          </w:p>
+        </w:tc>
+      </w:tr>
+      <w:tr>
+        <w:tc>
+          <w:tcPr>
+            <w:tcW w:type="dxa" w:w="604"/>
+            <w:tcBorders>
+              <w:top w:val="nil"/>
+              <w:bottom w:val="nil"/>
+              <w:left w:val="nil"/>
+              <w:right w:val="nil"/>
+            </w:tcBorders>
+          </w:tcPr>
+          <w:p>
+            <w:pPr>
+              <w:spacing w:after="0"/>
+            </w:pPr>
+            <w:r/>
+            <w:r>
+              <w:rPr>
+                <w:rFonts w:ascii="Times New Roman" w:hAnsi="Times New Roman"/>
+                <w:sz w:val="20"/>
+              </w:rPr>
+              <w:t>5:</w:t>
+            </w:r>
+          </w:p>
+        </w:tc>
+        <w:tc>
+          <w:tcPr>
+            <w:tcW w:type="dxa" w:w="7992"/>
+            <w:tcBorders>
+              <w:top w:val="nil"/>
+              <w:bottom w:val="nil"/>
+              <w:left w:val="nil"/>
+              <w:right w:val="nil"/>
+            </w:tcBorders>
+          </w:tcPr>
+          <w:p>
+            <w:pPr>
+              <w:spacing w:after="0"/>
+            </w:pPr>
+            <w:r/>
+            <w:r>
+              <w:rPr>
+                <w:rFonts w:ascii="Times New Roman" w:hAnsi="Times New Roman"/>
+                <w:b w:val="0"/>
+                <w:sz w:val="20"/>
+              </w:rPr>
+              <w:t xml:space="preserve">    Find cell G_rc such that center_i ∈ G_rc</w:t>
+            </w:r>
+            <w:r>
+              <w:rPr>
+                <w:sz w:val="20"/>
+              </w:rPr>
+              <w:tab/>
+              <w:t xml:space="preserve">▷ </w:t>
+            </w:r>
+            <w:r>
+              <w:rPr>
+                <w:rFonts w:ascii="Times New Roman" w:hAnsi="Times New Roman"/>
+                <w:sz w:val="20"/>
+              </w:rPr>
+              <w:t>grid assignment</w:t>
+            </w:r>
+          </w:p>
+        </w:tc>
+      </w:tr>
+      <w:tr>
+        <w:tc>
+          <w:tcPr>
+            <w:tcW w:type="dxa" w:w="604"/>
+            <w:tcBorders>
+              <w:top w:val="nil"/>
+              <w:bottom w:val="nil"/>
+              <w:left w:val="nil"/>
+              <w:right w:val="nil"/>
+            </w:tcBorders>
+          </w:tcPr>
+          <w:p>
+            <w:pPr>
+              <w:spacing w:after="0"/>
+            </w:pPr>
+            <w:r/>
+            <w:r>
+              <w:rPr>
+                <w:rFonts w:ascii="Times New Roman" w:hAnsi="Times New Roman"/>
+                <w:sz w:val="20"/>
+              </w:rPr>
+              <w:t>6:</w:t>
+            </w:r>
+          </w:p>
+        </w:tc>
+        <w:tc>
+          <w:tcPr>
+            <w:tcW w:type="dxa" w:w="7992"/>
+            <w:tcBorders>
+              <w:top w:val="nil"/>
+              <w:bottom w:val="nil"/>
+              <w:left w:val="nil"/>
+              <w:right w:val="nil"/>
+            </w:tcBorders>
+          </w:tcPr>
+          <w:p>
+            <w:pPr>
+              <w:spacing w:after="0"/>
+            </w:pPr>
+            <w:r/>
+            <w:r>
+              <w:rPr>
+                <w:rFonts w:ascii="Times New Roman" w:hAnsi="Times New Roman"/>
+                <w:b w:val="0"/>
+                <w:sz w:val="20"/>
+              </w:rPr>
+              <w:t xml:space="preserve">    C_rc ← C_rc + 1</w:t>
+            </w:r>
+            <w:r>
+              <w:rPr>
+                <w:sz w:val="20"/>
+              </w:rPr>
+              <w:tab/>
+              <w:t xml:space="preserve">▷ </w:t>
+            </w:r>
+            <w:r>
+              <w:rPr>
+                <w:rFonts w:ascii="Times New Roman" w:hAnsi="Times New Roman"/>
+                <w:sz w:val="20"/>
+              </w:rPr>
+              <w:t>cell count</w:t>
+            </w:r>
+          </w:p>
+        </w:tc>
+      </w:tr>
+      <w:tr>
+        <w:tc>
+          <w:tcPr>
+            <w:tcW w:type="dxa" w:w="604"/>
+            <w:tcBorders>
+              <w:top w:val="nil"/>
+              <w:bottom w:val="nil"/>
+              <w:left w:val="nil"/>
+              <w:right w:val="nil"/>
+            </w:tcBorders>
+          </w:tcPr>
+          <w:p>
+            <w:pPr>
+              <w:spacing w:after="0"/>
+            </w:pPr>
+            <w:r/>
+            <w:r>
+              <w:rPr>
+                <w:rFonts w:ascii="Times New Roman" w:hAnsi="Times New Roman"/>
+                <w:sz w:val="20"/>
+              </w:rPr>
+              <w:t>7:</w:t>
+            </w:r>
+          </w:p>
+        </w:tc>
+        <w:tc>
+          <w:tcPr>
+            <w:tcW w:type="dxa" w:w="7992"/>
+            <w:tcBorders>
+              <w:top w:val="nil"/>
+              <w:bottom w:val="nil"/>
+              <w:left w:val="nil"/>
+              <w:right w:val="nil"/>
+            </w:tcBorders>
+          </w:tcPr>
+          <w:p>
+            <w:pPr>
+              <w:spacing w:after="0"/>
+            </w:pPr>
+            <w:r/>
+            <w:r>
+              <w:rPr>
+                <w:rFonts w:ascii="Times New Roman" w:hAnsi="Times New Roman"/>
+                <w:b w:val="0"/>
+                <w:sz w:val="20"/>
+              </w:rPr>
+              <w:t xml:space="preserve">    T_rc ← T_rc ∪ {L_i, W_i, D_i, V_i, q_i}</w:t>
+            </w:r>
+            <w:r>
+              <w:rPr>
+                <w:sz w:val="20"/>
+              </w:rPr>
+              <w:tab/>
+              <w:t xml:space="preserve">▷ </w:t>
+            </w:r>
+            <w:r>
+              <w:rPr>
+                <w:rFonts w:ascii="Times New Roman" w:hAnsi="Times New Roman"/>
+                <w:sz w:val="20"/>
+              </w:rPr>
+              <w:t>cell traits</w:t>
+            </w:r>
+          </w:p>
+        </w:tc>
+      </w:tr>
+      <w:tr>
+        <w:tc>
+          <w:tcPr>
+            <w:tcW w:type="dxa" w:w="604"/>
+            <w:tcBorders>
+              <w:top w:val="nil"/>
+              <w:bottom w:val="nil"/>
+              <w:left w:val="nil"/>
+              <w:right w:val="nil"/>
+            </w:tcBorders>
+          </w:tcPr>
+          <w:p>
+            <w:pPr>
+              <w:spacing w:after="0"/>
+            </w:pPr>
+            <w:r/>
+            <w:r>
+              <w:rPr>
+                <w:rFonts w:ascii="Times New Roman" w:hAnsi="Times New Roman"/>
+                <w:sz w:val="20"/>
+              </w:rPr>
+              <w:t>8:</w:t>
+            </w:r>
+          </w:p>
+        </w:tc>
+        <w:tc>
+          <w:tcPr>
+            <w:tcW w:type="dxa" w:w="7992"/>
+            <w:tcBorders>
+              <w:top w:val="nil"/>
+              <w:bottom w:val="nil"/>
+              <w:left w:val="nil"/>
+              <w:right w:val="nil"/>
+            </w:tcBorders>
+          </w:tcPr>
+          <w:p>
+            <w:pPr>
+              <w:spacing w:after="0"/>
+            </w:pPr>
+            <w:r/>
+            <w:r>
+              <w:rPr>
+                <w:rFonts w:ascii="Times New Roman" w:hAnsi="Times New Roman"/>
+                <w:b/>
+                <w:sz w:val="20"/>
+              </w:rPr>
+              <w:t>end for</w:t>
+            </w:r>
+          </w:p>
+        </w:tc>
+      </w:tr>
+      <w:tr>
+        <w:tc>
+          <w:tcPr>
+            <w:tcW w:type="dxa" w:w="604"/>
+            <w:tcBorders>
+              <w:top w:val="nil"/>
+              <w:bottom w:val="nil"/>
+              <w:left w:val="nil"/>
+              <w:right w:val="nil"/>
+            </w:tcBorders>
+          </w:tcPr>
+          <w:p>
+            <w:pPr>
+              <w:spacing w:after="0"/>
+            </w:pPr>
+            <w:r/>
+            <w:r>
+              <w:rPr>
+                <w:rFonts w:ascii="Times New Roman" w:hAnsi="Times New Roman"/>
+                <w:sz w:val="20"/>
+              </w:rPr>
+              <w:t>9:</w:t>
+            </w:r>
+          </w:p>
+        </w:tc>
+        <w:tc>
+          <w:tcPr>
+            <w:tcW w:type="dxa" w:w="7992"/>
+            <w:tcBorders>
+              <w:top w:val="nil"/>
+              <w:bottom w:val="nil"/>
+              <w:left w:val="nil"/>
+              <w:right w:val="nil"/>
+            </w:tcBorders>
+          </w:tcPr>
+          <w:p>
+            <w:pPr>
+              <w:spacing w:after="0"/>
+            </w:pPr>
+            <w:r/>
+            <w:r>
+              <w:rPr>
+                <w:rFonts w:ascii="Times New Roman" w:hAnsi="Times New Roman"/>
+                <w:b w:val="0"/>
+                <w:sz w:val="20"/>
+              </w:rPr>
+              <w:t>Compute mean traits, coverage, and uncertainty for each occupied G_rc</w:t>
+            </w:r>
+            <w:r>
+              <w:rPr>
+                <w:sz w:val="20"/>
+              </w:rPr>
+              <w:tab/>
+              <w:t xml:space="preserve">▷ </w:t>
+            </w:r>
+            <w:r>
+              <w:rPr>
+                <w:rFonts w:ascii="Times New Roman" w:hAnsi="Times New Roman"/>
+                <w:sz w:val="20"/>
+              </w:rPr>
+              <w:t>cell summary</w:t>
+            </w:r>
+          </w:p>
+        </w:tc>
+      </w:tr>
+      <w:tr>
+        <w:tc>
+          <w:tcPr>
+            <w:tcW w:type="dxa" w:w="604"/>
+            <w:tcBorders>
+              <w:top w:val="nil"/>
+              <w:bottom w:val="nil"/>
+              <w:left w:val="nil"/>
+              <w:right w:val="nil"/>
+            </w:tcBorders>
+          </w:tcPr>
+          <w:p>
+            <w:pPr>
+              <w:spacing w:after="0"/>
+            </w:pPr>
+            <w:r/>
+            <w:r>
+              <w:rPr>
+                <w:rFonts w:ascii="Times New Roman" w:hAnsi="Times New Roman"/>
+                <w:sz w:val="20"/>
+              </w:rPr>
+              <w:t>10:</w:t>
+            </w:r>
+          </w:p>
+        </w:tc>
+        <w:tc>
+          <w:tcPr>
+            <w:tcW w:type="dxa" w:w="7992"/>
+            <w:tcBorders>
+              <w:top w:val="nil"/>
+              <w:bottom w:val="nil"/>
+              <w:left w:val="nil"/>
+              <w:right w:val="nil"/>
+            </w:tcBorders>
+          </w:tcPr>
+          <w:p>
+            <w:pPr>
+              <w:spacing w:after="0"/>
+            </w:pPr>
+            <w:r/>
+            <w:r>
+              <w:rPr>
+                <w:rFonts w:ascii="Times New Roman" w:hAnsi="Times New Roman"/>
+                <w:b/>
+                <w:sz w:val="20"/>
+              </w:rPr>
+              <w:t>output</w:t>
+            </w:r>
+            <w:r>
+              <w:rPr>
+                <w:rFonts w:ascii="Times New Roman" w:hAnsi="Times New Roman"/>
+                <w:b w:val="0"/>
+                <w:sz w:val="20"/>
+              </w:rPr>
+              <w:t xml:space="preserve"> {C_rc, mean(T_rc), confidence_rc} for all occupied cells</w:t>
+            </w:r>
+          </w:p>
+        </w:tc>
+      </w:tr>
+      <w:tr>
+        <w:tc>
+          <w:tcPr>
+            <w:tcW w:type="dxa" w:w="8596"/>
+            <w:gridSpan w:val="2"/>
+            <w:tcBorders>
+              <w:top w:val="single" w:sz="8" w:space="0" w:color="000000"/>
+              <w:bottom w:val="nil"/>
+              <w:left w:val="nil"/>
+              <w:right w:val="nil"/>
+            </w:tcBorders>
+          </w:tcPr>
+          <w:p>
+            <w:r/>
+          </w:p>
+        </w:tc>
+      </w:tr>
+    </w:tbl>
     <w:p>
       <w:pPr>
-        <w:pStyle w:val="ListNumber"/>
         <w:spacing w:after="40"/>
       </w:pPr>
-      <w:r>
-        <w:t>Resolve the image phase from metadata or greenness-based phase inference.</w:t>
-      </w:r>
-    </w:p>
-    <w:p>
-      <w:pPr>
-        <w:pStyle w:val="ListNumber"/>
-        <w:spacing w:after="40"/>
-      </w:pPr>
-      <w:r>
-        <w:t>Detect raw cotton boll candidates with the phase-aware detector.</w:t>
-      </w:r>
-    </w:p>
-    <w:p>
-      <w:pPr>
-        <w:pStyle w:val="ListNumber"/>
-        <w:spacing w:after="40"/>
-      </w:pPr>
-      <w:r>
-        <w:t>For each candidate, extract a prompt-style lint mask and compute mask statistics.</w:t>
-      </w:r>
-    </w:p>
-    <w:p>
-      <w:pPr>
-        <w:pStyle w:val="ListNumber"/>
-        <w:spacing w:after="40"/>
-      </w:pPr>
-      <w:r>
-        <w:t>Score extraction quality using lint fraction, green penalty, visibility, size prior, brightness, and depth evidence.</w:t>
-      </w:r>
-    </w:p>
-    <w:p>
-      <w:pPr>
-        <w:pStyle w:val="ListNumber"/>
-        <w:spacing w:after="40"/>
-      </w:pPr>
-      <w:r>
-        <w:t>Keep a measurement-ready subset for trait estimation and quality-control visualization.</w:t>
-      </w:r>
-    </w:p>
-    <w:p>
-      <w:pPr>
-        <w:pStyle w:val="ListNumber"/>
-        <w:spacing w:after="40"/>
-      </w:pPr>
-      <w:r>
-        <w:t>Project selected mask pixels into the 3D review coordinate system.</w:t>
-      </w:r>
-    </w:p>
-    <w:p>
-      <w:pPr>
-        <w:pStyle w:val="ListNumber"/>
-        <w:spacing w:after="40"/>
-      </w:pPr>
-      <w:r>
-        <w:t>Export image overlays, CSV trait records, full-scene PLY, boll-mask PLY, and plot-cell summaries.</w:t>
-      </w:r>
-    </w:p>
-    <w:p>
-      <w:pPr>
-        <w:spacing w:before="120" w:after="40"/>
-      </w:pPr>
-      <w:r>
-        <w:rPr>
-          <w:b/>
-        </w:rPr>
-        <w:t>Algorithm 2. SAM-style boll mask extraction.</w:t>
-      </w:r>
-    </w:p>
-    <w:p>
-      <w:pPr>
-        <w:spacing w:after="80"/>
-      </w:pPr>
-      <w:r>
-        <w:rPr>
-          <w:i/>
-        </w:rPr>
-        <w:t>Input: Candidate crop C and detector box b.</w:t>
-      </w:r>
-    </w:p>
-    <w:p>
-      <w:pPr>
-        <w:spacing w:after="80"/>
-      </w:pPr>
-      <w:r>
-        <w:rPr>
-          <w:i/>
-        </w:rPr>
-        <w:t>Output: Binary lint mask M and mask-shape statistics.</w:t>
-      </w:r>
-    </w:p>
-    <w:p>
-      <w:pPr>
-        <w:pStyle w:val="ListNumber"/>
-        <w:spacing w:after="40"/>
-      </w:pPr>
-      <w:r>
-        <w:t>Pad the detector box to include local context around the candidate.</w:t>
-      </w:r>
-    </w:p>
-    <w:p>
-      <w:pPr>
-        <w:pStyle w:val="ListNumber"/>
-        <w:spacing w:after="40"/>
-      </w:pPr>
-      <w:r>
-        <w:t>Convert the crop to HSV color space and compute excess-green suppression.</w:t>
-      </w:r>
-    </w:p>
-    <w:p>
-      <w:pPr>
-        <w:pStyle w:val="ListNumber"/>
-        <w:spacing w:after="40"/>
-      </w:pPr>
-      <w:r>
-        <w:t>Select low-saturation, high-value pixels consistent with cotton lint.</w:t>
-      </w:r>
-    </w:p>
-    <w:p>
-      <w:pPr>
-        <w:pStyle w:val="ListNumber"/>
-        <w:spacing w:after="40"/>
-      </w:pPr>
-      <w:r>
-        <w:t>Apply morphological opening and closing to remove isolated noise and fill small gaps.</w:t>
-      </w:r>
-    </w:p>
-    <w:p>
-      <w:pPr>
-        <w:pStyle w:val="ListNumber"/>
-        <w:spacing w:after="40"/>
-      </w:pPr>
-      <w:r>
-        <w:t>Compute connected components and retain the largest plausible lint component.</w:t>
-      </w:r>
-    </w:p>
-    <w:p>
-      <w:pPr>
-        <w:pStyle w:val="ListNumber"/>
-        <w:spacing w:after="40"/>
-      </w:pPr>
-      <w:r>
-        <w:t>Estimate mask area, oriented length, and oriented width from the retained component.</w:t>
-      </w:r>
-    </w:p>
-    <w:p>
-      <w:pPr>
-        <w:spacing w:before="120" w:after="40"/>
-      </w:pPr>
-      <w:r>
-        <w:rPr>
-          <w:b/>
-        </w:rPr>
-        <w:t>Algorithm 3. Mask-to-3D projection and trait estimation.</w:t>
-      </w:r>
-    </w:p>
-    <w:p>
-      <w:pPr>
-        <w:spacing w:after="80"/>
-      </w:pPr>
-      <w:r>
-        <w:rPr>
-          <w:i/>
-        </w:rPr>
-        <w:t>Input: Mask M, depth or calibrated geometry Z, scale s, and candidate metadata.</w:t>
-      </w:r>
-    </w:p>
-    <w:p>
-      <w:pPr>
-        <w:spacing w:after="80"/>
-      </w:pPr>
-      <w:r>
-        <w:rPr>
-          <w:i/>
-        </w:rPr>
-        <w:t>Output: Projected boll-mask points and proxy trait vector.</w:t>
-      </w:r>
-    </w:p>
-    <w:p>
-      <w:pPr>
-        <w:pStyle w:val="ListNumber"/>
-        <w:spacing w:after="40"/>
-      </w:pPr>
-      <w:r>
-        <w:t>Collect all foreground pixels from the mask and subsample if necessary for interactive rendering.</w:t>
-      </w:r>
-    </w:p>
-    <w:p>
-      <w:pPr>
-        <w:pStyle w:val="ListNumber"/>
-        <w:spacing w:after="40"/>
-      </w:pPr>
-      <w:r>
-        <w:t>Map original image coordinates to the depth or reconstruction grid.</w:t>
-      </w:r>
-    </w:p>
-    <w:p>
-      <w:pPr>
-        <w:pStyle w:val="ListNumber"/>
-        <w:spacing w:after="40"/>
-      </w:pPr>
-      <w:r>
-        <w:t>Back-project each selected pixel into the review coordinate system.</w:t>
-      </w:r>
-    </w:p>
-    <w:p>
-      <w:pPr>
-        <w:pStyle w:val="ListNumber"/>
-        <w:spacing w:after="40"/>
-      </w:pPr>
-      <w:r>
-        <w:t>Assign candidate-specific colors for visualization and export a boll-mask PLY.</w:t>
-      </w:r>
-    </w:p>
-    <w:p>
-      <w:pPr>
-        <w:pStyle w:val="ListNumber"/>
-        <w:spacing w:after="40"/>
-      </w:pPr>
-      <w:r>
-        <w:t>Compute L, W, D, V, v, and q using the mask, detector box, scale, and confidence terms.</w:t>
-      </w:r>
-    </w:p>
-    <w:p>
-      <w:pPr>
-        <w:pStyle w:val="ListNumber"/>
-        <w:spacing w:after="40"/>
-      </w:pPr>
-      <w:r>
-        <w:t>Store the resulting trait vector with candidate identity and phase metadata.</w:t>
-      </w:r>
-    </w:p>
-    <w:p>
-      <w:pPr>
-        <w:spacing w:before="120" w:after="40"/>
-      </w:pPr>
-      <w:r>
-        <w:rPr>
-          <w:b/>
-        </w:rPr>
-        <w:t>Algorithm 4. Plot-cell aggregation.</w:t>
-      </w:r>
-    </w:p>
-    <w:p>
-      <w:pPr>
-        <w:spacing w:after="80"/>
-      </w:pPr>
-      <w:r>
-        <w:rPr>
-          <w:i/>
-        </w:rPr>
-        <w:t>Input: Measurement-ready candidates R and plot grid G.</w:t>
-      </w:r>
-    </w:p>
-    <w:p>
-      <w:pPr>
-        <w:spacing w:after="80"/>
-      </w:pPr>
-      <w:r>
-        <w:rPr>
-          <w:i/>
-        </w:rPr>
-        <w:t>Output: Cell-level count, trait means, and confidence summaries.</w:t>
-      </w:r>
-    </w:p>
-    <w:p>
-      <w:pPr>
-        <w:pStyle w:val="ListNumber"/>
-        <w:spacing w:after="40"/>
-      </w:pPr>
-      <w:r>
-        <w:t>Define the row-column grid in image coordinates or calibrated field coordinates.</w:t>
-      </w:r>
-    </w:p>
-    <w:p>
-      <w:pPr>
-        <w:pStyle w:val="ListNumber"/>
-        <w:spacing w:after="40"/>
-      </w:pPr>
-      <w:r>
-        <w:t>For each candidate, compute the center point from the detector box or mask centroid.</w:t>
-      </w:r>
-    </w:p>
-    <w:p>
-      <w:pPr>
-        <w:pStyle w:val="ListNumber"/>
-        <w:spacing w:after="40"/>
-      </w:pPr>
-      <w:r>
-        <w:t>Assign the candidate to the corresponding grid cell when the center lies inside the study region.</w:t>
-      </w:r>
-    </w:p>
-    <w:p>
-      <w:pPr>
-        <w:pStyle w:val="ListNumber"/>
-        <w:spacing w:after="40"/>
-      </w:pPr>
-      <w:r>
-        <w:t>For each occupied cell, compute count, mean trait values, mean confidence, and coverage.</w:t>
-      </w:r>
-    </w:p>
-    <w:p>
-      <w:pPr>
-        <w:pStyle w:val="ListNumber"/>
-        <w:spacing w:after="40"/>
-      </w:pPr>
-      <w:r>
-        <w:t>Rank cells by count, uncertainty, or pre/post change for inspection and reporting.</w:t>
-      </w:r>
     </w:p>
     <w:p>
       <w:pPr>

</xml_diff>

<commit_message>
Tighten ICPA paper to submission standards
</commit_message>
<xml_diff>
--- a/paper/word/icpa_2026_mask_guided_cotton_until_algorithms.docx
+++ b/paper/word/icpa_2026_mask_guided_cotton_until_algorithms.docx
@@ -1277,7 +1277,7 @@
         <w:rPr>
           <w:i w:val="0"/>
         </w:rPr>
-        <w:t>Let s denote the image scale in cm per pixel, l_i and w_i denote the major and minor axes of the extracted mask for candidate i, and w_i^box and h_i^box denote the detector-box width and height. The pipeline reports mask length L_i, mask width W_i, coarse detector diameter D_i, ellipsoid volume proxy U_i, visibility V_i^vis, extraction confidence M_i, and plot-cell count C_rc. Equations (1)-(11) define the current trait computations and phase-comparison diagnostics.</w:t>
+        <w:t>Let s denote the image scale in mm per pixel, a_i and b_i denote the major and minor axes of the extracted mask for candidate i, and w_i and h_i denote the detector-box width and height in pixels. The pipeline reports mask length L_i, mask width W_i, coarse detector diameter D_i, ellipsoid volume proxy U_i, visibility V_i^vis, extraction confidence M_i, and plot-cell count C_rc. Equations (1)-(12) define the current trait computations and phase-comparison diagnostics. In the readiness score, ell_i is normalized lint fraction, b_i^bright is normalized brightness, g_i is green-canopy fraction, and 1[p_i = post] is an indicator for the post-defoliation phase.</w:t>
       </w:r>
     </w:p>
     <w:p>
@@ -1342,7 +1342,7 @@
           <w:rFonts w:ascii="Times New Roman" w:hAnsi="Times New Roman"/>
           <w:sz w:val="21"/>
         </w:rPr>
-        <w:t>(5)   R_i = max(0, 1 - (ρ_i - 1)/3.5),     ρ_i = max(w_i,h_i)/min(w_i,h_i)</w:t>
+        <w:t>(5)   ρ_i = max(w_i,h_i)/(min(w_i,h_i) + ε)</w:t>
       </w:r>
     </w:p>
     <w:p>
@@ -1355,7 +1355,7 @@
           <w:rFonts w:ascii="Times New Roman" w:hAnsi="Times New Roman"/>
           <w:sz w:val="21"/>
         </w:rPr>
-        <w:t>(6)   S_i = min(sqrt(A_i^mask)/20, 1)</w:t>
+        <w:t>(6)   R_i = max(0, 1 - (ρ_i - 1)/3.5)</w:t>
       </w:r>
     </w:p>
     <w:p>
@@ -1368,7 +1368,7 @@
           <w:rFonts w:ascii="Times New Roman" w:hAnsi="Times New Roman"/>
           <w:sz w:val="21"/>
         </w:rPr>
-        <w:t>(7)   M_i = 0.32 l_i + 0.20 V_i^vis + 0.16 q_i^bright + 0.14 R_i + 0.12 S_i + 0.06(1 - g_i) + 0.08 1[p_i = post]</w:t>
+        <w:t>(7)   S_i = min(sqrt(A_i^mask)/20, 1)</w:t>
       </w:r>
     </w:p>
     <w:p>
@@ -1381,7 +1381,7 @@
           <w:rFonts w:ascii="Times New Roman" w:hAnsi="Times New Roman"/>
           <w:sz w:val="21"/>
         </w:rPr>
-        <w:t>(8)   Δ_μ(x) = mean_post(x) - mean_pre(x)</w:t>
+        <w:t>(8)   M_i = 0.32 ell_i + 0.20 V_i^vis + 0.16 b_i^bright + 0.14 R_i + 0.12 S_i + 0.06(1 - g_i) + 0.08 1[p_i = post]</w:t>
       </w:r>
     </w:p>
     <w:p>
@@ -1394,7 +1394,7 @@
           <w:rFonts w:ascii="Times New Roman" w:hAnsi="Times New Roman"/>
           <w:sz w:val="21"/>
         </w:rPr>
-        <w:t>(9)   Δ_%(x) = 100 · (mean_post(x) - mean_pre(x)) / max(|mean_pre(x)|, ε)</w:t>
+        <w:t>(9)   Δ_μ(x) = mean_post(x) - mean_pre(x)</w:t>
       </w:r>
     </w:p>
     <w:p>
@@ -1407,7 +1407,7 @@
           <w:rFonts w:ascii="Times New Roman" w:hAnsi="Times New Roman"/>
           <w:sz w:val="21"/>
         </w:rPr>
-        <w:t>(10)   U_i^99 = min(U_i, percentile_99(U)),     D_thr = 5 mean(diff(sort(U^99)))</w:t>
+        <w:t>(10)   Δ_%(x) = 100 · (mean_post(x) - mean_pre(x)) / max(|mean_pre(x)|, ε)</w:t>
       </w:r>
     </w:p>
     <w:p>
@@ -1420,7 +1420,20 @@
           <w:rFonts w:ascii="Times New Roman" w:hAnsi="Times New Roman"/>
           <w:sz w:val="21"/>
         </w:rPr>
-        <w:t>(11)   C_rc = Σ_i 1[center_i ∈ G_rc]</w:t>
+        <w:t>(11)   U_i^99 = min(U_i, percentile_99(U)),     D_thr = 5 mean(diff(sort(U^99)))</w:t>
+      </w:r>
+    </w:p>
+    <w:p>
+      <w:pPr>
+        <w:spacing w:after="40"/>
+        <w:jc w:val="center"/>
+      </w:pPr>
+      <w:r>
+        <w:rPr>
+          <w:rFonts w:ascii="Times New Roman" w:hAnsi="Times New Roman"/>
+          <w:sz w:val="21"/>
+        </w:rPr>
+        <w:t>(12)   C_rc = Σ_i 1[center_i ∈ G_rc]</w:t>
       </w:r>
     </w:p>
     <w:p>
@@ -1990,7 +2003,7 @@
                 <w:rFonts w:ascii="Times New Roman" w:hAnsi="Times New Roman"/>
                 <w:sz w:val="20"/>
               </w:rPr>
-              <w:t>Equations (1)-(11)</w:t>
+              <w:t>Equations (1)-(12)</w:t>
             </w:r>
           </w:p>
         </w:tc>
@@ -3629,7 +3642,7 @@
                 <w:rFonts w:ascii="Times New Roman" w:hAnsi="Times New Roman"/>
                 <w:sz w:val="20"/>
               </w:rPr>
-              <w:t>Equations (1)-(11)</w:t>
+              <w:t>Equations (1)-(12)</w:t>
             </w:r>
           </w:p>
         </w:tc>
@@ -4486,7 +4499,7 @@
         <w:rPr>
           <w:i w:val="0"/>
         </w:rPr>
-        <w:t>This section reports the current experimental outputs generated from the available UAV folders. The values are useful for writing the results section and for deciding what must be validated next, but they should be interpreted with the calibration boundary stated earlier. Counts are produced by the current detector, while length, diameter, and volume are proxy traits derived from mask geometry and a provisional image scale. The final submission should add manual labels, physical boll measurements, or calibrated geometry before claiming metric accuracy.</w:t>
+        <w:t>This section reports the current experimental outputs generated from the available UAV folders. The values are useful for writing the results section and for deciding what must be validated next, but they should be interpreted with the calibration boundary stated earlier. Counts are produced by the current detector, while length, diameter, and volume are proxy traits derived from mask geometry and a provisional image scale. The final submission should add manual labels, physical boll measurements, or calibrated geometry before claiming metric accuracy. Detailed CSV outputs and expanded ablations are retained as supplementary repository artifacts to keep the main manuscript within the ICPA full-paper page budget.</w:t>
       </w:r>
     </w:p>
     <w:p>
@@ -5035,7 +5048,7 @@
                 <w:b/>
                 <w:sz w:val="17"/>
               </w:rPr>
-              <w:t>Diam. proxy (cm)</w:t>
+              <w:t>Diam. proxy (mm)</w:t>
             </w:r>
           </w:p>
         </w:tc>
@@ -5055,7 +5068,7 @@
                 <w:b/>
                 <w:sz w:val="17"/>
               </w:rPr>
-              <w:t>Vol. proxy (cm3)</w:t>
+              <w:t>Vol. proxy (10^3 mm3)</w:t>
             </w:r>
           </w:p>
         </w:tc>
@@ -5190,7 +5203,7 @@
                 <w:b w:val="0"/>
                 <w:sz w:val="17"/>
               </w:rPr>
-              <w:t>21.13</w:t>
+              <w:t>211.35</w:t>
             </w:r>
           </w:p>
         </w:tc>
@@ -5344,7 +5357,7 @@
                 <w:b w:val="0"/>
                 <w:sz w:val="17"/>
               </w:rPr>
-              <w:t>15.19</w:t>
+              <w:t>151.86</w:t>
             </w:r>
           </w:p>
         </w:tc>
@@ -5517,7 +5530,7 @@
                 <w:b w:val="0"/>
                 <w:sz w:val="17"/>
               </w:rPr>
-              <w:t>measurement_ready_score</w:t>
+              <w:t>Measurement-readiness score</w:t>
             </w:r>
           </w:p>
         </w:tc>
@@ -5614,7 +5627,7 @@
                 <w:b w:val="0"/>
                 <w:sz w:val="17"/>
               </w:rPr>
-              <w:t>lint_fraction</w:t>
+              <w:t>Lint fraction</w:t>
             </w:r>
           </w:p>
         </w:tc>
@@ -5711,7 +5724,7 @@
                 <w:b w:val="0"/>
                 <w:sz w:val="17"/>
               </w:rPr>
-              <w:t>green_fraction</w:t>
+              <w:t>Green fraction</w:t>
             </w:r>
           </w:p>
         </w:tc>
@@ -5808,7 +5821,7 @@
                 <w:b w:val="0"/>
                 <w:sz w:val="17"/>
               </w:rPr>
-              <w:t>visibility</w:t>
+              <w:t>Visibility</w:t>
             </w:r>
           </w:p>
         </w:tc>
@@ -5905,7 +5918,7 @@
                 <w:b w:val="0"/>
                 <w:sz w:val="17"/>
               </w:rPr>
-              <w:t>diameter_cm_proxy</w:t>
+              <w:t>Diameter proxy (mm)</w:t>
             </w:r>
           </w:p>
         </w:tc>
@@ -5924,7 +5937,7 @@
                 <w:b w:val="0"/>
                 <w:sz w:val="17"/>
               </w:rPr>
-              <w:t>15.186</w:t>
+              <w:t>151.86</w:t>
             </w:r>
           </w:p>
         </w:tc>
@@ -5943,7 +5956,7 @@
                 <w:b w:val="0"/>
                 <w:sz w:val="17"/>
               </w:rPr>
-              <w:t>21.135</w:t>
+              <w:t>211.35</w:t>
             </w:r>
           </w:p>
         </w:tc>
@@ -5962,7 +5975,7 @@
                 <w:b w:val="0"/>
                 <w:sz w:val="17"/>
               </w:rPr>
-              <w:t>5.949</w:t>
+              <w:t>59.49</w:t>
             </w:r>
           </w:p>
         </w:tc>
@@ -6002,7 +6015,7 @@
                 <w:b w:val="0"/>
                 <w:sz w:val="17"/>
               </w:rPr>
-              <w:t>ellipsoid_volume_cm3_proxy</w:t>
+              <w:t>Volume proxy (10^3 mm3)</w:t>
             </w:r>
           </w:p>
         </w:tc>
@@ -6021,7 +6034,7 @@
                 <w:b w:val="0"/>
                 <w:sz w:val="17"/>
               </w:rPr>
-              <w:t>10726.132</w:t>
+              <w:t>10726.1</w:t>
             </w:r>
           </w:p>
         </w:tc>
@@ -6040,7 +6053,7 @@
                 <w:b w:val="0"/>
                 <w:sz w:val="17"/>
               </w:rPr>
-              <w:t>16105.320</w:t>
+              <w:t>16105.3</w:t>
             </w:r>
           </w:p>
         </w:tc>
@@ -6059,7 +6072,7 @@
                 <w:b w:val="0"/>
                 <w:sz w:val="17"/>
               </w:rPr>
-              <w:t>5379.188</w:t>
+              <w:t>5379.2</w:t>
             </w:r>
           </w:p>
         </w:tc>
@@ -6134,7 +6147,7 @@
         <w:t xml:space="preserve">Figure 1 </w:t>
       </w:r>
       <w:r>
-        <w:t>Distribution of measurement-readiness scores for pre- and post-defoliation candidates. The current proxy favors candidates that are bright, compact, visible, and low in green canopy contamination.</w:t>
+        <w:t>Measurement-readiness distribution across pre- and post-defoliation imagery. The histogram shows how the proposed ranking score separates candidates that are compact, visible, bright, and low in green-canopy contamination. It is used to select local reconstruction targets rather than to claim instance-level accuracy.</w:t>
       </w:r>
     </w:p>
     <w:p>
@@ -6187,7 +6200,7 @@
         <w:t xml:space="preserve">Figure 2 </w:t>
       </w:r>
       <w:r>
-        <w:t>Proxy trait distributions for visibility, diameter, and ellipsoid volume. These plots should be retained as exploratory results until physical trait measurements are collected.</w:t>
+        <w:t>Proxy trait distributions for visibility, diameter, and ellipsoid volume. The spread in the volume panel is expected because volume scales cubically with mask dimensions; therefore, these exploratory values require physical validation before being interpreted as true boll volume.</w:t>
       </w:r>
     </w:p>
     <w:p>
@@ -6355,7 +6368,7 @@
                 <w:b w:val="0"/>
                 <w:sz w:val="17"/>
               </w:rPr>
-              <w:t>measurement_ready_score</w:t>
+              <w:t>Measurement-readiness score</w:t>
             </w:r>
           </w:p>
         </w:tc>
@@ -6374,7 +6387,7 @@
                 <w:b w:val="0"/>
                 <w:sz w:val="17"/>
               </w:rPr>
-              <w:t>0.6350</w:t>
+              <w:t>0.635</w:t>
             </w:r>
           </w:p>
         </w:tc>
@@ -6393,7 +6406,7 @@
                 <w:b w:val="0"/>
                 <w:sz w:val="17"/>
               </w:rPr>
-              <w:t>0.6364</w:t>
+              <w:t>0.636</w:t>
             </w:r>
           </w:p>
         </w:tc>
@@ -6433,7 +6446,7 @@
                 <w:b w:val="0"/>
                 <w:sz w:val="17"/>
               </w:rPr>
-              <w:t>visibility</w:t>
+              <w:t>Visibility</w:t>
             </w:r>
           </w:p>
         </w:tc>
@@ -6452,7 +6465,7 @@
                 <w:b w:val="0"/>
                 <w:sz w:val="17"/>
               </w:rPr>
-              <w:t>0.4576</w:t>
+              <w:t>0.458</w:t>
             </w:r>
           </w:p>
         </w:tc>
@@ -6471,7 +6484,7 @@
                 <w:b w:val="0"/>
                 <w:sz w:val="17"/>
               </w:rPr>
-              <w:t>0.4607</w:t>
+              <w:t>0.461</w:t>
             </w:r>
           </w:p>
         </w:tc>
@@ -6511,7 +6524,7 @@
                 <w:b w:val="0"/>
                 <w:sz w:val="17"/>
               </w:rPr>
-              <w:t>diameter_cm_proxy</w:t>
+              <w:t>Diameter proxy (mm)</w:t>
             </w:r>
           </w:p>
         </w:tc>
@@ -6530,7 +6543,7 @@
                 <w:b w:val="0"/>
                 <w:sz w:val="17"/>
               </w:rPr>
-              <w:t>20.8222</w:t>
+              <w:t>208.22</w:t>
             </w:r>
           </w:p>
         </w:tc>
@@ -6549,7 +6562,7 @@
                 <w:b w:val="0"/>
                 <w:sz w:val="17"/>
               </w:rPr>
-              <w:t>21.4477</w:t>
+              <w:t>214.48</w:t>
             </w:r>
           </w:p>
         </w:tc>
@@ -6589,7 +6602,7 @@
                 <w:b w:val="0"/>
                 <w:sz w:val="17"/>
               </w:rPr>
-              <w:t>ellipsoid_volume_cm3_proxy</w:t>
+              <w:t>Volume proxy (10^3 mm3)</w:t>
             </w:r>
           </w:p>
         </w:tc>
@@ -6608,7 +6621,7 @@
                 <w:b w:val="0"/>
                 <w:sz w:val="17"/>
               </w:rPr>
-              <w:t>10198.1434</w:t>
+              <w:t>10198.1</w:t>
             </w:r>
           </w:p>
         </w:tc>
@@ -6627,7 +6640,7 @@
                 <w:b w:val="0"/>
                 <w:sz w:val="17"/>
               </w:rPr>
-              <w:t>22012.4970</w:t>
+              <w:t>22012.5</w:t>
             </w:r>
           </w:p>
         </w:tc>
@@ -6667,7 +6680,7 @@
                 <w:b w:val="0"/>
                 <w:sz w:val="17"/>
               </w:rPr>
-              <w:t>measurement_ready_score</w:t>
+              <w:t>Measurement-readiness score</w:t>
             </w:r>
           </w:p>
         </w:tc>
@@ -6686,7 +6699,7 @@
                 <w:b w:val="0"/>
                 <w:sz w:val="17"/>
               </w:rPr>
-              <w:t>0.5831</w:t>
+              <w:t>0.583</w:t>
             </w:r>
           </w:p>
         </w:tc>
@@ -6705,7 +6718,7 @@
                 <w:b w:val="0"/>
                 <w:sz w:val="17"/>
               </w:rPr>
-              <w:t>0.5850</w:t>
+              <w:t>0.585</w:t>
             </w:r>
           </w:p>
         </w:tc>
@@ -6745,7 +6758,7 @@
                 <w:b w:val="0"/>
                 <w:sz w:val="17"/>
               </w:rPr>
-              <w:t>visibility</w:t>
+              <w:t>Visibility</w:t>
             </w:r>
           </w:p>
         </w:tc>
@@ -6764,7 +6777,7 @@
                 <w:b w:val="0"/>
                 <w:sz w:val="17"/>
               </w:rPr>
-              <w:t>0.5065</w:t>
+              <w:t>0.507</w:t>
             </w:r>
           </w:p>
         </w:tc>
@@ -6783,7 +6796,7 @@
                 <w:b w:val="0"/>
                 <w:sz w:val="17"/>
               </w:rPr>
-              <w:t>0.5106</w:t>
+              <w:t>0.511</w:t>
             </w:r>
           </w:p>
         </w:tc>
@@ -6823,7 +6836,7 @@
                 <w:b w:val="0"/>
                 <w:sz w:val="17"/>
               </w:rPr>
-              <w:t>diameter_cm_proxy</w:t>
+              <w:t>Diameter proxy (mm)</w:t>
             </w:r>
           </w:p>
         </w:tc>
@@ -6842,7 +6855,7 @@
                 <w:b w:val="0"/>
                 <w:sz w:val="17"/>
               </w:rPr>
-              <w:t>14.8816</w:t>
+              <w:t>148.82</w:t>
             </w:r>
           </w:p>
         </w:tc>
@@ -6861,7 +6874,7 @@
                 <w:b w:val="0"/>
                 <w:sz w:val="17"/>
               </w:rPr>
-              <w:t>15.4912</w:t>
+              <w:t>154.91</w:t>
             </w:r>
           </w:p>
         </w:tc>
@@ -6901,7 +6914,7 @@
                 <w:b w:val="0"/>
                 <w:sz w:val="17"/>
               </w:rPr>
-              <w:t>ellipsoid_volume_cm3_proxy</w:t>
+              <w:t>Volume proxy (10^3 mm3)</w:t>
             </w:r>
           </w:p>
         </w:tc>
@@ -6920,7 +6933,7 @@
                 <w:b w:val="0"/>
                 <w:sz w:val="17"/>
               </w:rPr>
-              <w:t>8466.3536</w:t>
+              <w:t>8466.4</w:t>
             </w:r>
           </w:p>
         </w:tc>
@@ -6939,7 +6952,7 @@
                 <w:b w:val="0"/>
                 <w:sz w:val="17"/>
               </w:rPr>
-              <w:t>12985.9109</w:t>
+              <w:t>12985.9</w:t>
             </w:r>
           </w:p>
         </w:tc>
@@ -6961,7 +6974,7 @@
         <w:rPr>
           <w:i w:val="0"/>
         </w:rPr>
-        <w:t>The ablation study removes one term at a time from the candidate ranking score and compares the resulting ranking with the full score. Spearman correlation measures whether global ranking order is preserved, while top-five overlap asks whether the same highest-priority candidates would be selected for local 2.5D reconstruction.</w:t>
+        <w:t>The ablation study removes one term at a time from the candidate ranking score and compares the resulting ranking with the full score. Spearman correlation measures whether global ranking order is preserved, while top-five overlap asks whether the same highest-priority candidates would be selected for local 2.5D reconstruction. To respect the 15-page ICPA limit, the main manuscript reports the compact ablation table and one summary figure; the full per-image ablation outputs remain in the supplementary experiment package.</w:t>
       </w:r>
     </w:p>
     <w:p>
@@ -7750,7 +7763,7 @@
         <w:t xml:space="preserve">Figure 3 </w:t>
       </w:r>
       <w:r>
-        <w:t>Ablation behavior of the candidate-ranking score. Lint fraction and visibility have the strongest practical effect on which candidates are selected for local review.</w:t>
+        <w:t>Ablation of the measurement-readiness score. Removing lint fraction or visibility most strongly changes candidate selection, supporting the method design: the system should prioritize bolls that are not merely bright, but also compact, separable, and plausibly measurable.</w:t>
       </w:r>
     </w:p>
     <w:p>
@@ -8090,7 +8103,7 @@
         <w:t xml:space="preserve">Figure 4 </w:t>
       </w:r>
       <w:r>
-        <w:t>Image-coordinate grid maps for candidate density and proxy traits. This figure is intended to become a metric plot map once orthomosaic coordinates and field boundaries are added.</w:t>
+        <w:t>Image-coordinate plot-grid maps for candidate density and proxy traits. The grid turns dense UAV detections into row-column summaries that can later be registered to field plots when orthomosaic coordinates and plot boundaries are available.</w:t>
       </w:r>
     </w:p>
     <w:p>
@@ -8607,7 +8620,7 @@
         <w:t xml:space="preserve">Figure 5 </w:t>
       </w:r>
       <w:r>
-        <w:t>Sorted proxy-volume curves and first mutation positions after p99 capping. The analysis is inspired by cotton boll point-cloud volume diagnostics but remains proxy-based in the current UAV MVP.</w:t>
+        <w:t>Sorted proxy-volume curves and first mutation positions after p99 capping. This diagnostic follows the logic of cotton point-cloud volume studies: unusually large jumps often indicate merged or adherent boll regions that should be inspected before they enter yield-related analysis.</w:t>
       </w:r>
     </w:p>
     <w:p>
@@ -9934,7 +9947,7 @@
         <w:t xml:space="preserve">Figure 6 </w:t>
       </w:r>
       <w:r>
-        <w:t>Relationship between measurement-readiness score and local 2.5D statistics for selected candidates. The selected candidates are inspection targets for the next calibrated reconstruction pass.</w:t>
+        <w:t>Relationship between measurement-readiness score and local 2.5D statistics for selected candidates. High-ranked crops are not treated as final 3D geometry; they define where calibrated reconstruction, manual inspection, or multi-view follow-up should be concentrated.</w:t>
       </w:r>
     </w:p>
     <w:p>
@@ -9995,6 +10008,119 @@
         <w:pStyle w:val="Heading1"/>
       </w:pPr>
       <w:r>
+        <w:t>7 Discussion</w:t>
+      </w:r>
+    </w:p>
+    <w:p>
+      <w:pPr>
+        <w:spacing w:after="80"/>
+      </w:pPr>
+      <w:r>
+        <w:rPr>
+          <w:i w:val="0"/>
+        </w:rPr>
+        <w:t>The current results support the central argument of the paper: defoliation changes not only the number of visible bright lint regions, but also the measurement readiness of the detected candidates. Post-defoliation imagery shows a higher mean readiness score and lower green contamination, suggesting that defoliation can be treated as a visibility intervention for organ-scale phenotyping. This is a different claim from simply reporting a pre/post count difference. It connects the agronomic treatment to the statistical quality of the measurement evidence.</w:t>
+      </w:r>
+    </w:p>
+    <w:p>
+      <w:pPr>
+        <w:spacing w:after="80"/>
+      </w:pPr>
+      <w:r>
+        <w:rPr>
+          <w:i w:val="0"/>
+        </w:rPr>
+        <w:t>The main technical contribution is the separation between detection, mask formation, and 3D review. A conventional counting pipeline would stop after candidate boxes. Here, each box is converted into a lint mask, scored for measurement readiness, projected into a reviewable 2.5D space, and aggregated into plot-grid summaries. This design makes failure visible. Merged bolls, overly large proxy volumes, low-visibility masks, and green-contaminated candidates can be isolated before they become yield claims.</w:t>
+      </w:r>
+    </w:p>
+    <w:p>
+      <w:pPr>
+        <w:spacing w:after="80"/>
+      </w:pPr>
+      <w:r>
+        <w:rPr>
+          <w:i w:val="0"/>
+        </w:rPr>
+        <w:t>The most important limitation is scale. A single orthomosaic or near-nadir UAV image cannot, by itself, guarantee calibrated organ-scale 3D geometry. True metric diameter and volume require ground sampling distance, camera intrinsics, ground control, multi-view pose, RGB-D sensing, or physical boll measurements. The current manuscript therefore uses proxy units and reports volume-mutation diagnostics as a quality-control tool. This conservative framing is essential because recent cotton 3D work shows that complete boll characterization improves when multi-view geometry is available (Sun et al., 2020; Xiao et al., 2024; Jiang et al., 2025).</w:t>
+      </w:r>
+    </w:p>
+    <w:p>
+      <w:pPr>
+        <w:pStyle w:val="Heading1"/>
+      </w:pPr>
+      <w:r>
+        <w:t>8 Limitations</w:t>
+      </w:r>
+    </w:p>
+    <w:p>
+      <w:pPr>
+        <w:pStyle w:val="ListBullet"/>
+        <w:spacing w:after="40"/>
+      </w:pPr>
+      <w:r>
+        <w:t>The present 3D output is a proxy review space and should not be described as calibrated Gaussian Splatting, SfM/MVS, or metric 3D reconstruction until camera geometry and scale are validated.</w:t>
+      </w:r>
+    </w:p>
+    <w:p>
+      <w:pPr>
+        <w:pStyle w:val="ListBullet"/>
+        <w:spacing w:after="40"/>
+      </w:pPr>
+      <w:r>
+        <w:t>The current detector can confuse cotton lint with bright soil, residue, glare, or exposed background objects; manual labels are needed for detection precision, recall, F1, MAE, and RMSE.</w:t>
+      </w:r>
+    </w:p>
+    <w:p>
+      <w:pPr>
+        <w:pStyle w:val="ListBullet"/>
+        <w:spacing w:after="40"/>
+      </w:pPr>
+      <w:r>
+        <w:t>Proxy volume assumes an ellipsoid geometry and is sensitive to merged or adherent boll masks.</w:t>
+      </w:r>
+    </w:p>
+    <w:p>
+      <w:pPr>
+        <w:pStyle w:val="ListBullet"/>
+        <w:spacing w:after="40"/>
+      </w:pPr>
+      <w:r>
+        <w:t>Plot-grid summaries are image-coordinate summaries, not georeferenced field maps, until orthomosaic coordinates, plot boundaries, or GCPs are added.</w:t>
+      </w:r>
+    </w:p>
+    <w:p>
+      <w:pPr>
+        <w:pStyle w:val="ListBullet"/>
+        <w:spacing w:after="40"/>
+      </w:pPr>
+      <w:r>
+        <w:t>Any LLM reporting layer should be evaluated only as a structured summarization component and not as an agronomic authority without expert review.</w:t>
+      </w:r>
+    </w:p>
+    <w:p>
+      <w:pPr>
+        <w:pStyle w:val="Heading1"/>
+      </w:pPr>
+      <w:r>
+        <w:t>9 Conclusion</w:t>
+      </w:r>
+    </w:p>
+    <w:p>
+      <w:pPr>
+        <w:spacing w:after="80"/>
+      </w:pPr>
+      <w:r>
+        <w:rPr>
+          <w:i w:val="0"/>
+        </w:rPr>
+        <w:t>This paper formulates pre- and post-defoliation cotton boll phenotyping as a measurement-readiness problem. The proposed framework combines phase-aware detection, SAM-style lint-mask extraction, proxy mask-to-3D review, plot-grid aggregation, and conservative trait reporting. The current experimental package shows that the method can audit more than 1,500 UAV frames, summarize millions of candidate detections, rank measurement-ready bolls, and identify local reconstruction targets. The next step is not to overstate the proxy geometry, but to add calibrated scale, manual labels, and physical measurements so that the same architecture can mature into validated organ-scale 3D cotton phenotyping.</w:t>
+      </w:r>
+    </w:p>
+    <w:p>
+      <w:pPr>
+        <w:pStyle w:val="Heading1"/>
+      </w:pPr>
+      <w:r>
         <w:t>References</w:t>
       </w:r>
     </w:p>
@@ -10018,17 +10144,6 @@
           <w:i w:val="0"/>
         </w:rPr>
         <w:t>DeTone, D., Malisiewicz, T., and Rabinovich, A. 2018. SuperPoint: Self-supervised interest point detection and description. Proceedings of the IEEE/CVF Conference on Computer Vision and Pattern Recognition Workshops.</w:t>
-      </w:r>
-    </w:p>
-    <w:p>
-      <w:pPr>
-        <w:spacing w:after="80"/>
-      </w:pPr>
-      <w:r>
-        <w:rPr>
-          <w:i w:val="0"/>
-        </w:rPr>
-        <w:t>Edelsbrunner, H., Kirkpatrick, D., and Seidel, R. 1983. On the shape of a set of points in the plane. IEEE Transactions on Information Theory 29(4):551-559.</w:t>
       </w:r>
     </w:p>
     <w:p>
@@ -10084,17 +10199,6 @@
           <w:i w:val="0"/>
         </w:rPr>
         <w:t>Mildenhall, B., Srinivasan, P. P., Tancik, M., Barron, J. T., Ramamoorthi, R., and Ng, R. 2020. NeRF: Representing scenes as neural radiance fields for view synthesis. Proceedings of the European Conference on Computer Vision.</w:t>
-      </w:r>
-    </w:p>
-    <w:p>
-      <w:pPr>
-        <w:spacing w:after="80"/>
-      </w:pPr>
-      <w:r>
-        <w:rPr>
-          <w:i w:val="0"/>
-        </w:rPr>
-        <w:t>Oquab, M., Darcet, T., Moutakanni, T., Vo, H., Szafraniec, M., Khalidov, V., et al. 2023. DINOv2: Learning robust visual features without supervision. arXiv:2304.07193.</w:t>
       </w:r>
     </w:p>
     <w:p>

</xml_diff>

<commit_message>
Add paper-ready architecture overview
</commit_message>
<xml_diff>
--- a/paper/word/icpa_2026_mask_guided_cotton_until_algorithms.docx
+++ b/paper/word/icpa_2026_mask_guided_cotton_until_algorithms.docx
@@ -1191,6 +1191,59 @@
           <w:i w:val="0"/>
         </w:rPr>
         <w:t>The proposed pipeline proceeds from a UAV frame to a structured phenotyping record. First, the image phase is taken from the dataset folder or inferred from canopy greenness. Second, candidate bolls are detected using a phase-aware computer vision detector. Third, each candidate is refined with a SAM-style lint mask. Fourth, a morphology-aware depth proxy or a calibrated reconstruction module maps image evidence into a 3D review space. Fifth, mask shape and projected 3D points are used to compute proxy traits. Finally, measurement-ready candidates are summarized at image and plot-cell levels.</w:t>
+      </w:r>
+    </w:p>
+    <w:p>
+      <w:pPr>
+        <w:jc w:val="center"/>
+      </w:pPr>
+      <w:r>
+        <w:drawing>
+          <wp:inline xmlns:a="http://schemas.openxmlformats.org/drawingml/2006/main" xmlns:pic="http://schemas.openxmlformats.org/drawingml/2006/picture">
+            <wp:extent cx="6035040" cy="3270297"/>
+            <wp:docPr id="1" name="Picture 1"/>
+            <wp:cNvGraphicFramePr>
+              <a:graphicFrameLocks noChangeAspect="1"/>
+            </wp:cNvGraphicFramePr>
+            <a:graphic>
+              <a:graphicData uri="http://schemas.openxmlformats.org/drawingml/2006/picture">
+                <pic:pic>
+                  <pic:nvPicPr>
+                    <pic:cNvPr id="0" name="icpa_cotton_architecture_overview.png"/>
+                    <pic:cNvPicPr/>
+                  </pic:nvPicPr>
+                  <pic:blipFill>
+                    <a:blip r:embed="rId11"/>
+                    <a:stretch>
+                      <a:fillRect/>
+                    </a:stretch>
+                  </pic:blipFill>
+                  <pic:spPr>
+                    <a:xfrm>
+                      <a:off x="0" y="0"/>
+                      <a:ext cx="6035040" cy="3270297"/>
+                    </a:xfrm>
+                    <a:prstGeom prst="rect"/>
+                  </pic:spPr>
+                </pic:pic>
+              </a:graphicData>
+            </a:graphic>
+          </wp:inline>
+        </w:drawing>
+      </w:r>
+    </w:p>
+    <w:p>
+      <w:pPr>
+        <w:spacing w:after="120"/>
+      </w:pPr>
+      <w:r>
+        <w:rPr>
+          <w:b/>
+        </w:rPr>
+        <w:t xml:space="preserve">Figure 1 </w:t>
+      </w:r>
+      <w:r>
+        <w:t>Overview of the proposed mask-guided cotton boll phenotyping framework. The architecture separates UAV evidence, candidate detection, SAM-style mask extraction, proxy 3D review, structured trait outputs, and downstream evaluation/reporting. The dashed claim boundary is intentionally included to distinguish the current proxy MVP from future calibrated 3D metrology.</w:t>
       </w:r>
     </w:p>
     <w:p>
@@ -6105,7 +6158,7 @@
         <w:drawing>
           <wp:inline xmlns:a="http://schemas.openxmlformats.org/drawingml/2006/main" xmlns:pic="http://schemas.openxmlformats.org/drawingml/2006/picture">
             <wp:extent cx="6035040" cy="3425293"/>
-            <wp:docPr id="1" name="Picture 1"/>
+            <wp:docPr id="2" name="Picture 2"/>
             <wp:cNvGraphicFramePr>
               <a:graphicFrameLocks noChangeAspect="1"/>
             </wp:cNvGraphicFramePr>
@@ -6117,7 +6170,7 @@
                     <pic:cNvPicPr/>
                   </pic:nvPicPr>
                   <pic:blipFill>
-                    <a:blip r:embed="rId11"/>
+                    <a:blip r:embed="rId12"/>
                     <a:stretch>
                       <a:fillRect/>
                     </a:stretch>
@@ -6144,7 +6197,7 @@
         <w:rPr>
           <w:b/>
         </w:rPr>
-        <w:t xml:space="preserve">Figure 1 </w:t>
+        <w:t xml:space="preserve">Figure 2 </w:t>
       </w:r>
       <w:r>
         <w:t>Measurement-readiness distribution across pre- and post-defoliation imagery. The histogram shows how the proposed ranking score separates candidates that are compact, visible, bright, and low in green-canopy contamination. It is used to select local reconstruction targets rather than to claim instance-level accuracy.</w:t>
@@ -6158,7 +6211,7 @@
         <w:drawing>
           <wp:inline xmlns:a="http://schemas.openxmlformats.org/drawingml/2006/main" xmlns:pic="http://schemas.openxmlformats.org/drawingml/2006/picture">
             <wp:extent cx="6035040" cy="2049636"/>
-            <wp:docPr id="2" name="Picture 2"/>
+            <wp:docPr id="3" name="Picture 3"/>
             <wp:cNvGraphicFramePr>
               <a:graphicFrameLocks noChangeAspect="1"/>
             </wp:cNvGraphicFramePr>
@@ -6170,7 +6223,7 @@
                     <pic:cNvPicPr/>
                   </pic:nvPicPr>
                   <pic:blipFill>
-                    <a:blip r:embed="rId12"/>
+                    <a:blip r:embed="rId13"/>
                     <a:stretch>
                       <a:fillRect/>
                     </a:stretch>
@@ -6197,7 +6250,7 @@
         <w:rPr>
           <w:b/>
         </w:rPr>
-        <w:t xml:space="preserve">Figure 2 </w:t>
+        <w:t xml:space="preserve">Figure 3 </w:t>
       </w:r>
       <w:r>
         <w:t>Proxy trait distributions for visibility, diameter, and ellipsoid volume. The spread in the volume panel is expected because volume scales cubically with mask dimensions; therefore, these exploratory values require physical validation before being interpreted as true boll volume.</w:t>
@@ -7721,7 +7774,7 @@
         <w:drawing>
           <wp:inline xmlns:a="http://schemas.openxmlformats.org/drawingml/2006/main" xmlns:pic="http://schemas.openxmlformats.org/drawingml/2006/picture">
             <wp:extent cx="6035040" cy="3017520"/>
-            <wp:docPr id="3" name="Picture 3"/>
+            <wp:docPr id="4" name="Picture 4"/>
             <wp:cNvGraphicFramePr>
               <a:graphicFrameLocks noChangeAspect="1"/>
             </wp:cNvGraphicFramePr>
@@ -7733,7 +7786,7 @@
                     <pic:cNvPicPr/>
                   </pic:nvPicPr>
                   <pic:blipFill>
-                    <a:blip r:embed="rId13"/>
+                    <a:blip r:embed="rId14"/>
                     <a:stretch>
                       <a:fillRect/>
                     </a:stretch>
@@ -7760,7 +7813,7 @@
         <w:rPr>
           <w:b/>
         </w:rPr>
-        <w:t xml:space="preserve">Figure 3 </w:t>
+        <w:t xml:space="preserve">Figure 4 </w:t>
       </w:r>
       <w:r>
         <w:t>Ablation of the measurement-readiness score. Removing lint fraction or visibility most strongly changes candidate selection, supporting the method design: the system should prioritize bolls that are not merely bright, but also compact, separable, and plausibly measurable.</w:t>
@@ -8061,7 +8114,7 @@
         <w:drawing>
           <wp:inline xmlns:a="http://schemas.openxmlformats.org/drawingml/2006/main" xmlns:pic="http://schemas.openxmlformats.org/drawingml/2006/picture">
             <wp:extent cx="6035040" cy="2633472"/>
-            <wp:docPr id="4" name="Picture 4"/>
+            <wp:docPr id="5" name="Picture 5"/>
             <wp:cNvGraphicFramePr>
               <a:graphicFrameLocks noChangeAspect="1"/>
             </wp:cNvGraphicFramePr>
@@ -8073,7 +8126,7 @@
                     <pic:cNvPicPr/>
                   </pic:nvPicPr>
                   <pic:blipFill>
-                    <a:blip r:embed="rId14"/>
+                    <a:blip r:embed="rId15"/>
                     <a:stretch>
                       <a:fillRect/>
                     </a:stretch>
@@ -8100,7 +8153,7 @@
         <w:rPr>
           <w:b/>
         </w:rPr>
-        <w:t xml:space="preserve">Figure 4 </w:t>
+        <w:t xml:space="preserve">Figure 5 </w:t>
       </w:r>
       <w:r>
         <w:t>Image-coordinate plot-grid maps for candidate density and proxy traits. The grid turns dense UAV detections into row-column summaries that can later be registered to field plots when orthomosaic coordinates and plot boundaries are available.</w:t>
@@ -8578,7 +8631,7 @@
         <w:drawing>
           <wp:inline xmlns:a="http://schemas.openxmlformats.org/drawingml/2006/main" xmlns:pic="http://schemas.openxmlformats.org/drawingml/2006/picture">
             <wp:extent cx="6035040" cy="4526280"/>
-            <wp:docPr id="5" name="Picture 5"/>
+            <wp:docPr id="6" name="Picture 6"/>
             <wp:cNvGraphicFramePr>
               <a:graphicFrameLocks noChangeAspect="1"/>
             </wp:cNvGraphicFramePr>
@@ -8590,7 +8643,7 @@
                     <pic:cNvPicPr/>
                   </pic:nvPicPr>
                   <pic:blipFill>
-                    <a:blip r:embed="rId15"/>
+                    <a:blip r:embed="rId16"/>
                     <a:stretch>
                       <a:fillRect/>
                     </a:stretch>
@@ -8617,7 +8670,7 @@
         <w:rPr>
           <w:b/>
         </w:rPr>
-        <w:t xml:space="preserve">Figure 5 </w:t>
+        <w:t xml:space="preserve">Figure 6 </w:t>
       </w:r>
       <w:r>
         <w:t>Sorted proxy-volume curves and first mutation positions after p99 capping. This diagnostic follows the logic of cotton point-cloud volume studies: unusually large jumps often indicate merged or adherent boll regions that should be inspected before they enter yield-related analysis.</w:t>
@@ -9905,7 +9958,7 @@
         <w:drawing>
           <wp:inline xmlns:a="http://schemas.openxmlformats.org/drawingml/2006/main" xmlns:pic="http://schemas.openxmlformats.org/drawingml/2006/picture">
             <wp:extent cx="6035040" cy="3727525"/>
-            <wp:docPr id="6" name="Picture 6"/>
+            <wp:docPr id="7" name="Picture 7"/>
             <wp:cNvGraphicFramePr>
               <a:graphicFrameLocks noChangeAspect="1"/>
             </wp:cNvGraphicFramePr>
@@ -9917,7 +9970,7 @@
                     <pic:cNvPicPr/>
                   </pic:nvPicPr>
                   <pic:blipFill>
-                    <a:blip r:embed="rId16"/>
+                    <a:blip r:embed="rId17"/>
                     <a:stretch>
                       <a:fillRect/>
                     </a:stretch>
@@ -9944,7 +9997,7 @@
         <w:rPr>
           <w:b/>
         </w:rPr>
-        <w:t xml:space="preserve">Figure 6 </w:t>
+        <w:t xml:space="preserve">Figure 7 </w:t>
       </w:r>
       <w:r>
         <w:t>Relationship between measurement-readiness score and local 2.5D statistics for selected candidates. High-ranked crops are not treated as final 3D geometry; they define where calibrated reconstruction, manual inspection, or multi-view follow-up should be concentrated.</w:t>

</xml_diff>

<commit_message>
Refine architecture figure for paper clarity
</commit_message>
<xml_diff>
--- a/paper/word/icpa_2026_mask_guided_cotton_until_algorithms.docx
+++ b/paper/word/icpa_2026_mask_guided_cotton_until_algorithms.docx
@@ -1200,7 +1200,7 @@
       <w:r>
         <w:drawing>
           <wp:inline xmlns:a="http://schemas.openxmlformats.org/drawingml/2006/main" xmlns:pic="http://schemas.openxmlformats.org/drawingml/2006/picture">
-            <wp:extent cx="6035040" cy="3270297"/>
+            <wp:extent cx="6035040" cy="2506648"/>
             <wp:docPr id="1" name="Picture 1"/>
             <wp:cNvGraphicFramePr>
               <a:graphicFrameLocks noChangeAspect="1"/>
@@ -1221,7 +1221,7 @@
                   <pic:spPr>
                     <a:xfrm>
                       <a:off x="0" y="0"/>
-                      <a:ext cx="6035040" cy="3270297"/>
+                      <a:ext cx="6035040" cy="2506648"/>
                     </a:xfrm>
                     <a:prstGeom prst="rect"/>
                   </pic:spPr>

</xml_diff>

<commit_message>
Remove ICPA template header from manuscript
</commit_message>
<xml_diff>
--- a/paper/word/icpa_2026_mask_guided_cotton_until_algorithms.docx
+++ b/paper/word/icpa_2026_mask_guided_cotton_until_algorithms.docx
@@ -149,7 +149,7 @@
         <w:rPr>
           <w:i w:val="0"/>
         </w:rPr>
-        <w:t>The difficulty is that organ-scale 3D measurement is not automatically obtained from UAV imagery. Classical structure-from-motion pipelines such as COLMAP rely on stable local texture and sufficient view overlap, conditions that are not guaranteed for repeated white cotton lint (Schoenberger and Frahm, 2016; Schoenberger et al., 2016). Neural view synthesis and 3D Gaussian Splatting can produce visually compelling scene representations, but photorealistic rendering alone does not prove accurate boll length or volume (Mildenhall et al., 2020; Kerbl et al., 2023). Recent foundation models for segmentation and visual geometry, including Segment Anything, SAM 2, DUSt3R, MASt3R, and VGGT, suggest useful components for promptable masks and geometry-aware reconstruction, but they must be adapted carefully to agricultural imagery (Kirillov et al., 2023; Ravi et al., 2024; Wang et al., 2024; Wang et al., 2025).</w:t>
+        <w:t>The difficulty is that organ-scale 3D measurement is not automatically obtained from UAV imagery. Classical structure-from-motion pipelines such as COLMAP rely on stable local texture and sufficient view overlap, conditions that are not guaranteed for repeated white cotton lint (Schoenberger and Frahm 2016; Schoenberger et al. 2016). Neural view synthesis and 3D Gaussian Splatting can produce visually compelling scene representations, but photorealistic rendering alone does not prove accurate boll length or volume (Mildenhall et al. 2020; Kerbl et al. 2023). Recent foundation models for segmentation and visual geometry, including Segment Anything, SAM 2, DUSt3R, MASt3R, and VGGT, suggest useful components for promptable masks and geometry-aware reconstruction, but they must be adapted carefully to agricultural imagery (Kirillov et al. 2023; Ravi et al. 2024; Wang et al. 2024; Wang et al. 2025).</w:t>
       </w:r>
     </w:p>
     <w:p>
@@ -242,7 +242,7 @@
         <w:rPr>
           <w:i w:val="0"/>
         </w:rPr>
-        <w:t>Cotton boll counting has been studied with classical image processing, supervised object detectors, weak supervision, region-based semantic segmentation, and density-map learning (Li et al., 2016; Adke et al., 2022; Tan et al., 2025). The current project inherits a phase-aware detector based on contrast enhancement, multi-scale top-hat morphology, thresholding, contour filtering, and color gates. This detector is useful because it produces candidate regions without dense manual annotation, but a detector box is not a physical measurement. The gap addressed here is the conversion of detection evidence into masks, proxy traits, and 3D review objects.</w:t>
+        <w:t>Cotton boll counting has been studied with classical image processing, supervised object detectors, weak supervision, region-based semantic segmentation, and density-map learning (Li et al. 2016; Adke et al. 2022; Tan et al. 2025). The current project inherits a phase-aware detector based on contrast enhancement, multi-scale top-hat morphology, thresholding, contour filtering, and color gates. This detector is useful because it produces candidate regions without dense manual annotation, but a detector box is not a physical measurement. The gap addressed here is the conversion of detection evidence into masks, proxy traits, and 3D review objects.</w:t>
       </w:r>
     </w:p>
     <w:p>
@@ -261,7 +261,7 @@
         <w:rPr>
           <w:i w:val="0"/>
         </w:rPr>
-        <w:t>Structure-from-motion and multi-view stereo remain standard tools for image-based 3D reconstruction (Schoenberger and Frahm, 2016; Schoenberger et al., 2016). Learned local features and matchers, including SuperPoint and SuperGlue, improve correspondence in many settings but still require texture and viewpoint consistency (DeTone et al., 2018; Sarlin et al., 2020). Newer geometry models such as DUSt3R, MASt3R, and VGGT reduce some of the engineering burden by predicting geometric relationships more directly, but their use in dense cotton scenes must be validated rather than assumed (Wang et al., 2024; Wang et al., 2025).</w:t>
+        <w:t>Structure-from-motion and multi-view stereo remain standard tools for image-based 3D reconstruction (Schoenberger and Frahm 2016; Schoenberger et al. 2016). Learned local features and matchers, including SuperPoint and SuperGlue, improve correspondence in many settings but still require texture and viewpoint consistency (DeTone et al. 2018; Sarlin et al. 2020). Newer geometry models such as DUSt3R, MASt3R, and VGGT reduce some of the engineering burden by predicting geometric relationships more directly, but their use in dense cotton scenes must be validated rather than assumed (Wang et al. 2024; Wang et al. 2025).</w:t>
       </w:r>
     </w:p>
     <w:p>
@@ -280,7 +280,7 @@
         <w:rPr>
           <w:i w:val="0"/>
         </w:rPr>
-        <w:t>Segment Anything introduced promptable segmentation at large scale and made point-, box-, and mask-conditioned extraction a practical design pattern for downstream systems (Kirillov et al., 2023). SAM 2 extended this idea to images and video, making temporal or sequential mask propagation more accessible (Ravi et al., 2024). In this paper, the term SAM-style refers to the prompt-first design: a detector box identifies a candidate, and a mask stage isolates lint-like pixels. The current implementation does not claim to run official SAM/SAM 2 unless those models are integrated and evaluated.</w:t>
+        <w:t>Segment Anything introduced promptable segmentation at large scale and made point-, box-, and mask-conditioned extraction a practical design pattern for downstream systems (Kirillov et al. 2023). SAM 2 extended this idea to images and video, making temporal or sequential mask propagation more accessible (Ravi et al. 2024). In this paper, the term SAM-style refers to the prompt-first design: a detector box identifies a candidate, and a mask stage isolates lint-like pixels. The current implementation does not claim to run official SAM/SAM 2 unless those models are integrated and evaluated.</w:t>
       </w:r>
     </w:p>
     <w:p>
@@ -299,7 +299,7 @@
         <w:rPr>
           <w:i w:val="0"/>
         </w:rPr>
-        <w:t>NeRF and 3D Gaussian Splatting have changed how scenes are represented for novel-view synthesis (Mildenhall et al., 2020; Kerbl et al., 2023). Cotton3DGaussians is particularly relevant because it connects Gaussian scene representation with cotton boll phenotyping, including the mapping of segmentation masks into a multi-view 3DGS representation (Jiang et al., 2025). The distinction for this manuscript is scale and evidence: the present work starts from UAV field imagery and paired defoliation, and it treats mask-to-3D review as a measurement-support layer rather than a rendering-only objective.</w:t>
+        <w:t>NeRF and 3D Gaussian Splatting have changed how scenes are represented for novel-view synthesis (Mildenhall et al. 2020; Kerbl et al. 2023). Cotton3DGaussians is particularly relevant because it connects Gaussian scene representation with cotton boll phenotyping, including the mapping of segmentation masks into a multi-view 3DGS representation (Jiang et al. 2025). The distinction for this manuscript is scale and evidence: the present work starts from UAV field imagery and paired defoliation, and it treats mask-to-3D review as a measurement-support layer rather than a rendering-only objective.</w:t>
       </w:r>
     </w:p>
     <w:p>
@@ -311,10 +311,10 @@
         <w:rPr>
           <w:b/>
         </w:rPr>
-        <w:t xml:space="preserve">Table </w:t>
-      </w:r>
-      <w:r>
-        <w:t>1 Closest-prior positioning for the current manuscript.</w:t>
+        <w:t xml:space="preserve">Table 1. </w:t>
+      </w:r>
+      <w:r>
+        <w:t>Closest-prior positioning for the current manuscript.</w:t>
       </w:r>
     </w:p>
     <w:tbl>
@@ -797,10 +797,10 @@
         <w:rPr>
           <w:b/>
         </w:rPr>
-        <w:t xml:space="preserve">Table </w:t>
-      </w:r>
-      <w:r>
-        <w:t>2 Dataset fields required before final submission.</w:t>
+        <w:t xml:space="preserve">Table 2. </w:t>
+      </w:r>
+      <w:r>
+        <w:t>Dataset fields required before final submission.</w:t>
       </w:r>
     </w:p>
     <w:tbl>
@@ -1302,7 +1302,7 @@
                     <pic:cNvPicPr/>
                   </pic:nvPicPr>
                   <pic:blipFill>
-                    <a:blip r:embed="rId16"/>
+                    <a:blip r:embed="rId17"/>
                     <a:stretch>
                       <a:fillRect/>
                     </a:stretch>
@@ -1330,7 +1330,7 @@
         <w:rPr>
           <w:b/>
         </w:rPr>
-        <w:t xml:space="preserve">Figure 1 </w:t>
+        <w:t xml:space="preserve">Fig. 1 </w:t>
       </w:r>
       <w:r>
         <w:t>Overview of the proposed mask-guided cotton boll phenotyping framework. The architecture separates UAV evidence, candidate detection, SAM-style mask extraction, proxy 3D review, structured trait outputs, and downstream evaluation/reporting. The dashed claim boundary is intentionally included to distinguish the current proxy MVP from future calibrated 3D metrology.</w:t>
@@ -4681,10 +4681,10 @@
         <w:rPr>
           <w:b/>
         </w:rPr>
-        <w:t xml:space="preserve">Table </w:t>
-      </w:r>
-      <w:r>
-        <w:t>3 Phase-level detector audit on the current UAV folders.</w:t>
+        <w:t xml:space="preserve">Table 3. </w:t>
+      </w:r>
+      <w:r>
+        <w:t>Phase-level detector audit on the current UAV folders.</w:t>
       </w:r>
     </w:p>
     <w:tbl>
@@ -5054,10 +5054,10 @@
         <w:rPr>
           <w:b/>
         </w:rPr>
-        <w:t xml:space="preserve">Table </w:t>
-      </w:r>
-      <w:r>
-        <w:t>4 Measurement-ready candidate statistics. Diameter and volume are proxy values under the current scale assumption.</w:t>
+        <w:t xml:space="preserve">Table 4. </w:t>
+      </w:r>
+      <w:r>
+        <w:t>Measurement-ready candidate statistics. Diameter and volume are proxy values under the current scale assumption.</w:t>
       </w:r>
     </w:p>
     <w:tbl>
@@ -5583,10 +5583,10 @@
         <w:rPr>
           <w:b/>
         </w:rPr>
-        <w:t xml:space="preserve">Table </w:t>
-      </w:r>
-      <w:r>
-        <w:t>5 Phase contrast in proxy morphology and visibility.</w:t>
+        <w:t xml:space="preserve">Table 5. </w:t>
+      </w:r>
+      <w:r>
+        <w:t>Phase contrast in proxy morphology and visibility.</w:t>
       </w:r>
     </w:p>
     <w:tbl>
@@ -6345,7 +6345,7 @@
                     <pic:cNvPicPr/>
                   </pic:nvPicPr>
                   <pic:blipFill>
-                    <a:blip r:embed="rId17"/>
+                    <a:blip r:embed="rId18"/>
                     <a:stretch>
                       <a:fillRect/>
                     </a:stretch>
@@ -6373,7 +6373,7 @@
         <w:rPr>
           <w:b/>
         </w:rPr>
-        <w:t xml:space="preserve">Figure 2 </w:t>
+        <w:t xml:space="preserve">Fig. 2 </w:t>
       </w:r>
       <w:r>
         <w:t>Measurement-readiness distribution across pre- and post-defoliation imagery. The histogram shows how the proposed ranking score separates candidates that are compact, visible, bright, and low in green-canopy contamination. It is used to select local reconstruction targets rather than to claim instance-level accuracy.</w:t>
@@ -6399,7 +6399,7 @@
                     <pic:cNvPicPr/>
                   </pic:nvPicPr>
                   <pic:blipFill>
-                    <a:blip r:embed="rId18"/>
+                    <a:blip r:embed="rId19"/>
                     <a:stretch>
                       <a:fillRect/>
                     </a:stretch>
@@ -6427,7 +6427,7 @@
         <w:rPr>
           <w:b/>
         </w:rPr>
-        <w:t xml:space="preserve">Figure 3 </w:t>
+        <w:t xml:space="preserve">Fig. 3 </w:t>
       </w:r>
       <w:r>
         <w:t>Proxy trait distributions for visibility, diameter, and ellipsoid volume. The spread in the volume panel is expected because volume scales cubically with mask dimensions; therefore, these exploratory values require physical validation before being interpreted as true boll volume.</w:t>
@@ -6461,10 +6461,10 @@
         <w:rPr>
           <w:b/>
         </w:rPr>
-        <w:t xml:space="preserve">Table </w:t>
-      </w:r>
-      <w:r>
-        <w:t>6 Ninety-five percent confidence intervals for selected proxy traits.</w:t>
+        <w:t xml:space="preserve">Table 6. </w:t>
+      </w:r>
+      <w:r>
+        <w:t>Ninety-five percent confidence intervals for selected proxy traits.</w:t>
       </w:r>
     </w:p>
     <w:tbl>
@@ -7253,10 +7253,10 @@
         <w:rPr>
           <w:b/>
         </w:rPr>
-        <w:t xml:space="preserve">Table </w:t>
-      </w:r>
-      <w:r>
-        <w:t>7 Candidate-ranking ablation. Higher Spearman and top-five overlap indicate closer agreement with the full score.</w:t>
+        <w:t xml:space="preserve">Table 7. </w:t>
+      </w:r>
+      <w:r>
+        <w:t>Candidate-ranking ablation. Higher Spearman and top-five overlap indicate closer agreement with the full score.</w:t>
       </w:r>
     </w:p>
     <w:tbl>
@@ -8037,7 +8037,7 @@
                     <pic:cNvPicPr/>
                   </pic:nvPicPr>
                   <pic:blipFill>
-                    <a:blip r:embed="rId19"/>
+                    <a:blip r:embed="rId20"/>
                     <a:stretch>
                       <a:fillRect/>
                     </a:stretch>
@@ -8065,7 +8065,7 @@
         <w:rPr>
           <w:b/>
         </w:rPr>
-        <w:t xml:space="preserve">Figure 4 </w:t>
+        <w:t xml:space="preserve">Fig. 4 </w:t>
       </w:r>
       <w:r>
         <w:t>Ablation of the measurement-readiness score. Removing lint fraction or visibility most strongly changes candidate selection, supporting the method design: the system should prioritize bolls that are not merely bright, but also compact, separable, and plausibly measurable.</w:t>
@@ -8099,10 +8099,10 @@
         <w:rPr>
           <w:b/>
         </w:rPr>
-        <w:t xml:space="preserve">Table </w:t>
-      </w:r>
-      <w:r>
-        <w:t>8 Image-coordinate plot-grid summary.</w:t>
+        <w:t xml:space="preserve">Table 8. </w:t>
+      </w:r>
+      <w:r>
+        <w:t>Image-coordinate plot-grid summary.</w:t>
       </w:r>
     </w:p>
     <w:tbl>
@@ -8391,7 +8391,7 @@
                     <pic:cNvPicPr/>
                   </pic:nvPicPr>
                   <pic:blipFill>
-                    <a:blip r:embed="rId20"/>
+                    <a:blip r:embed="rId21"/>
                     <a:stretch>
                       <a:fillRect/>
                     </a:stretch>
@@ -8419,7 +8419,7 @@
         <w:rPr>
           <w:b/>
         </w:rPr>
-        <w:t xml:space="preserve">Figure 5 </w:t>
+        <w:t xml:space="preserve">Fig. 5 </w:t>
       </w:r>
       <w:r>
         <w:t>Image-coordinate plot-grid maps for candidate density and proxy traits. The grid turns dense UAV detections into row-column summaries that can later be registered to field plots when orthomosaic coordinates and plot boundaries are available.</w:t>
@@ -8453,10 +8453,10 @@
         <w:rPr>
           <w:b/>
         </w:rPr>
-        <w:t xml:space="preserve">Table </w:t>
-      </w:r>
-      <w:r>
-        <w:t>9 P99-capped proxy volume mutation analysis.</w:t>
+        <w:t xml:space="preserve">Table 9. </w:t>
+      </w:r>
+      <w:r>
+        <w:t>P99-capped proxy volume mutation analysis.</w:t>
       </w:r>
     </w:p>
     <w:tbl>
@@ -8931,7 +8931,7 @@
                     <pic:cNvPicPr/>
                   </pic:nvPicPr>
                   <pic:blipFill>
-                    <a:blip r:embed="rId21"/>
+                    <a:blip r:embed="rId22"/>
                     <a:stretch>
                       <a:fillRect/>
                     </a:stretch>
@@ -8959,7 +8959,7 @@
         <w:rPr>
           <w:b/>
         </w:rPr>
-        <w:t xml:space="preserve">Figure 6 </w:t>
+        <w:t xml:space="preserve">Fig. 6 </w:t>
       </w:r>
       <w:r>
         <w:t>Sorted proxy-volume curves and first mutation positions after p99 capping. This diagnostic follows the logic of cotton point-cloud volume studies: unusually large jumps often indicate merged or adherent boll regions that should be inspected before they enter yield-related analysis.</w:t>
@@ -8993,10 +8993,10 @@
         <w:rPr>
           <w:b/>
         </w:rPr>
-        <w:t xml:space="preserve">Table </w:t>
-      </w:r>
-      <w:r>
-        <w:t>10 Highest-ranked local 2.5D reconstruction candidates.</w:t>
+        <w:t xml:space="preserve">Table 10. </w:t>
+      </w:r>
+      <w:r>
+        <w:t>Highest-ranked local 2.5D reconstruction candidates.</w:t>
       </w:r>
     </w:p>
     <w:tbl>
@@ -10323,7 +10323,7 @@
                     <pic:cNvPicPr/>
                   </pic:nvPicPr>
                   <pic:blipFill>
-                    <a:blip r:embed="rId22"/>
+                    <a:blip r:embed="rId23"/>
                     <a:stretch>
                       <a:fillRect/>
                     </a:stretch>
@@ -10351,7 +10351,7 @@
         <w:rPr>
           <w:b/>
         </w:rPr>
-        <w:t xml:space="preserve">Figure 7 </w:t>
+        <w:t xml:space="preserve">Fig. 7 </w:t>
       </w:r>
       <w:r>
         <w:t>Relationship between measurement-readiness score and local 2.5D statistics for selected candidates. High-ranked crops are not treated as final 3D geometry; they define where calibrated reconstruction, manual inspection, or multi-view follow-up should be concentrated.</w:t>
@@ -10448,7 +10448,7 @@
         <w:rPr>
           <w:i w:val="0"/>
         </w:rPr>
-        <w:t>The most important limitation is scale. A single orthomosaic or near-nadir UAV image cannot, by itself, guarantee calibrated organ-scale 3D geometry. True metric diameter and volume require ground sampling distance, camera intrinsics, ground control, multi-view pose, RGB-D sensing, or physical boll measurements. The current manuscript therefore uses proxy units and reports volume-mutation diagnostics as a quality-control tool. This conservative framing is essential because recent cotton 3D work shows that complete boll characterization improves when multi-view geometry is available (Sun et al., 2020; Xiao et al., 2024; Jiang et al., 2025).</w:t>
+        <w:t>The most important limitation is scale. A single orthomosaic or near-nadir UAV image cannot, by itself, guarantee calibrated organ-scale 3D geometry. True metric diameter and volume require ground sampling distance, camera intrinsics, ground control, multi-view pose, RGB-D sensing, or physical boll measurements. The current manuscript therefore uses proxy units and reports volume-mutation diagnostics as a quality-control tool. This conservative framing is essential because recent cotton 3D work shows that complete boll characterization improves when multi-view geometry is available (Sun et al. 2020; Xiao et al. 2024; Jiang et al. 2025).</w:t>
       </w:r>
     </w:p>
     <w:p>
@@ -10539,7 +10539,7 @@
         <w:rPr>
           <w:i w:val="0"/>
         </w:rPr>
-        <w:t>Adke, S., Li, C., Rasheed, K. M., and Maier, F. W. 2022. Supervised and weakly supervised deep learning for segmentation and counting of cotton bolls using proximal imagery. Sensors 22(10):3688.</w:t>
+        <w:t>Adke, S., Li, C., Rasheed, K. M., and Maier, F. W. (2022). Supervised and weakly supervised deep learning for segmentation and counting of cotton bolls using proximal imagery. Sensors, 22(10), 3688.</w:t>
       </w:r>
     </w:p>
     <w:p>
@@ -10550,7 +10550,7 @@
         <w:rPr>
           <w:i w:val="0"/>
         </w:rPr>
-        <w:t>DeTone, D., Malisiewicz, T., and Rabinovich, A. 2018. SuperPoint: Self-supervised interest point detection and description. Proceedings of the IEEE/CVF Conference on Computer Vision and Pattern Recognition Workshops.</w:t>
+        <w:t>DeTone, D., Malisiewicz, T., and Rabinovich, A. (2018). SuperPoint: Self-supervised interest point detection and description. Proceedings of the IEEE/CVF Conference on Computer Vision and Pattern Recognition Workshops.</w:t>
       </w:r>
     </w:p>
     <w:p>
@@ -10561,7 +10561,7 @@
         <w:rPr>
           <w:i w:val="0"/>
         </w:rPr>
-        <w:t>Jiang, L., Sun, J., Chee, P. W., Li, C., and Fu, L. 2025. Cotton3DGaussians: Multiview 3D Gaussian Splatting for boll mapping and plant architecture analysis. Computers and Electronics in Agriculture 234:110293.</w:t>
+        <w:t>Jiang, L., Sun, J., Chee, P. W., Li, C., and Fu, L. (2025). Cotton3DGaussians: Multiview 3D Gaussian Splatting for boll mapping and plant architecture analysis. Computers and Electronics in Agriculture, 234, 110293.</w:t>
       </w:r>
     </w:p>
     <w:p>
@@ -10572,7 +10572,7 @@
         <w:rPr>
           <w:i w:val="0"/>
         </w:rPr>
-        <w:t>Kerbl, B., Kopanas, G., Leimkuehler, T., and Drettakis, G. 2023. 3D Gaussian Splatting for real-time radiance field rendering. ACM Transactions on Graphics 42(4):1-14.</w:t>
+        <w:t>Kerbl, B., Kopanas, G., Leimkuehler, T., and Drettakis, G. (2023). 3D Gaussian Splatting for real-time radiance field rendering. ACM Transactions on Graphics, 42(4), 1-14.</w:t>
       </w:r>
     </w:p>
     <w:p>
@@ -10583,7 +10583,7 @@
         <w:rPr>
           <w:i w:val="0"/>
         </w:rPr>
-        <w:t>Kirillov, A., Mintun, E., Ravi, N., Mao, H., Rolland, C., Gustafson, L., et al. 2023. Segment Anything. Proceedings of the IEEE/CVF International Conference on Computer Vision.</w:t>
+        <w:t>Kirillov, A., Mintun, E., Ravi, N., Mao, H., Rolland, C., Gustafson, L., et al. (2023). Segment Anything. Proceedings of the IEEE/CVF International Conference on Computer Vision.</w:t>
       </w:r>
     </w:p>
     <w:p>
@@ -10594,7 +10594,7 @@
         <w:rPr>
           <w:i w:val="0"/>
         </w:rPr>
-        <w:t>Li, Y., Cao, Z., Lu, H., Xiao, Y., Zhu, Y., and Cremers, A. B. 2016. In-field cotton detection via region-based semantic image segmentation. Computers and Electronics in Agriculture 127:475-486.</w:t>
+        <w:t>Li, Y., Cao, Z., Lu, H., Xiao, Y., Zhu, Y., and Cremers, A. B. (2016). In-field cotton detection via region-based semantic image segmentation. Computers and Electronics in Agriculture, 127, 475-486.</w:t>
       </w:r>
     </w:p>
     <w:p>
@@ -10605,7 +10605,7 @@
         <w:rPr>
           <w:i w:val="0"/>
         </w:rPr>
-        <w:t>Mildenhall, B., Srinivasan, P. P., Tancik, M., Barron, J. T., Ramamoorthi, R., and Ng, R. 2020. NeRF: Representing scenes as neural radiance fields for view synthesis. Proceedings of the European Conference on Computer Vision.</w:t>
+        <w:t>Mildenhall, B., Srinivasan, P. P., Tancik, M., Barron, J. T., Ramamoorthi, R., and Ng, R. (2020). NeRF: Representing scenes as neural radiance fields for view synthesis. Proceedings of the European Conference on Computer Vision.</w:t>
       </w:r>
     </w:p>
     <w:p>
@@ -10616,7 +10616,7 @@
         <w:rPr>
           <w:i w:val="0"/>
         </w:rPr>
-        <w:t>Ravi, N., Gabeur, V., Hu, Y.-T., Hu, R., Ryali, C., Ma, T., et al. 2024. SAM 2: Segment Anything in Images and Videos. arXiv:2408.00714.</w:t>
+        <w:t>Ravi, N., Gabeur, V., Hu, Y.-T., Hu, R., Ryali, C., Ma, T., et al. (2024). SAM 2: Segment Anything in Images and Videos. arXiv:2408.00714.</w:t>
       </w:r>
     </w:p>
     <w:p>
@@ -10627,7 +10627,7 @@
         <w:rPr>
           <w:i w:val="0"/>
         </w:rPr>
-        <w:t>Sarlin, P.-E., DeTone, D., Malisiewicz, T., and Rabinovich, A. 2020. SuperGlue: Learning feature matching with graph neural networks. Proceedings of the IEEE/CVF Conference on Computer Vision and Pattern Recognition.</w:t>
+        <w:t>Sarlin, P.-E., DeTone, D., Malisiewicz, T., and Rabinovich, A. (2020). SuperGlue: Learning feature matching with graph neural networks. Proceedings of the IEEE/CVF Conference on Computer Vision and Pattern Recognition.</w:t>
       </w:r>
     </w:p>
     <w:p>
@@ -10638,7 +10638,7 @@
         <w:rPr>
           <w:i w:val="0"/>
         </w:rPr>
-        <w:t>Schoenberger, J. L., and Frahm, J.-M. 2016. Structure-from-Motion revisited. Proceedings of the IEEE Conference on Computer Vision and Pattern Recognition.</w:t>
+        <w:t>Schoenberger, J. L., and Frahm, J.-M. (2016). Structure-from-Motion revisited. Proceedings of the IEEE Conference on Computer Vision and Pattern Recognition.</w:t>
       </w:r>
     </w:p>
     <w:p>
@@ -10649,7 +10649,7 @@
         <w:rPr>
           <w:i w:val="0"/>
         </w:rPr>
-        <w:t>Schoenberger, J. L., Zheng, E., Frahm, J.-M., and Pollefeys, M. 2016. Pixelwise view selection for unstructured multi-view stereo. Proceedings of the European Conference on Computer Vision.</w:t>
+        <w:t>Schoenberger, J. L., Zheng, E., Frahm, J.-M., and Pollefeys, M. (2016). Pixelwise view selection for unstructured multi-view stereo. Proceedings of the European Conference on Computer Vision.</w:t>
       </w:r>
     </w:p>
     <w:p>
@@ -10660,7 +10660,7 @@
         <w:rPr>
           <w:i w:val="0"/>
         </w:rPr>
-        <w:t>Sun, S., Li, C., Paterson, A. H., Jiang, Y., Xu, R., Robertson, J. S., et al. 2020. Three-dimensional photogrammetric mapping of cotton bolls in situ based on point cloud segmentation and clustering. ISPRS Journal of Photogrammetry and Remote Sensing 160:195-207.</w:t>
+        <w:t>Sun, S., Li, C., Paterson, A. H., Jiang, Y., Xu, R., Robertson, J. S., et al. (2020). Three-dimensional photogrammetric mapping of cotton bolls in situ based on point cloud segmentation and clustering. ISPRS Journal of Photogrammetry and Remote Sensing, 160, 195-207.</w:t>
       </w:r>
     </w:p>
     <w:p>
@@ -10671,7 +10671,7 @@
         <w:rPr>
           <w:i w:val="0"/>
         </w:rPr>
-        <w:t>Tan, C., Sun, J., Song, H., and Li, C. 2025. A customized density map model and Segment Anything model for cotton boll number, size, and yield prediction in aerial images. Computers and Electronics in Agriculture 232:110065.</w:t>
+        <w:t>Tan, C., Sun, J., Song, H., and Li, C. (2025). A customized density map model and Segment Anything model for cotton boll number, size, and yield prediction in aerial images. Computers and Electronics in Agriculture, 232, 110065.</w:t>
       </w:r>
     </w:p>
     <w:p>
@@ -10682,7 +10682,7 @@
         <w:rPr>
           <w:i w:val="0"/>
         </w:rPr>
-        <w:t>Wang, S., Leroy, V., Cabon, Y., Chidlovskii, B., and Revaud, J. 2024. DUSt3R: Geometric 3D vision made easy. Proceedings of the IEEE/CVF Conference on Computer Vision and Pattern Recognition.</w:t>
+        <w:t>Wang, J., Chen, M., Karaev, N., Vedaldi, A., Rupprecht, C., and Novotny, D. (2025). VGGT: Visual Geometry Grounded Transformer. Proceedings of the IEEE/CVF Conference on Computer Vision and Pattern Recognition.</w:t>
       </w:r>
     </w:p>
     <w:p>
@@ -10693,7 +10693,7 @@
         <w:rPr>
           <w:i w:val="0"/>
         </w:rPr>
-        <w:t>Wang, S., Leroy, V., Cabon, Y., Chidlovskii, B., and Revaud, J. 2024. MASt3R: Grounding image matching in 3D with mast3r. Proceedings of the European Conference on Computer Vision.</w:t>
+        <w:t>Wang, S., Leroy, V., Cabon, Y., Chidlovskii, B., and Revaud, J. (2024). DUSt3R: Geometric 3D vision made easy. Proceedings of the IEEE/CVF Conference on Computer Vision and Pattern Recognition.</w:t>
       </w:r>
     </w:p>
     <w:p>
@@ -10704,7 +10704,7 @@
         <w:rPr>
           <w:i w:val="0"/>
         </w:rPr>
-        <w:t>Wang, J., Chen, M., Karaev, N., Vedaldi, A., Rupprecht, C., and Novotny, D. 2025. VGGT: Visual Geometry Grounded Transformer. Proceedings of the IEEE/CVF Conference on Computer Vision and Pattern Recognition.</w:t>
+        <w:t>Wang, S., Leroy, V., Cabon, Y., Chidlovskii, B., and Revaud, J. (2024). MASt3R: Grounding image matching in 3D with mast3r. Proceedings of the European Conference on Computer Vision.</w:t>
       </w:r>
     </w:p>
     <w:p>
@@ -10715,7 +10715,7 @@
         <w:rPr>
           <w:i w:val="0"/>
         </w:rPr>
-        <w:t>Xiao, S., Fei, S., Ye, Y., Xu, D., Xie, Z., Bi, K., et al. 2024. 3D reconstruction and characterization of cotton bolls in situ based on UAV technology. ISPRS Journal of Photogrammetry and Remote Sensing 209:101-116.</w:t>
+        <w:t>Xiao, S., Fei, S., Ye, Y., Xu, D., Xie, Z., Bi, K., et al. (2024). 3D reconstruction and characterization of cotton bolls in situ based on UAV technology. ISPRS Journal of Photogrammetry and Remote Sensing, 209, 101-116.</w:t>
       </w:r>
     </w:p>
     <w:sectPr>
@@ -10724,6 +10724,7 @@
       <w:headerReference w:type="first" r:id="rId10"/>
       <w:footerReference w:type="first" r:id="rId11"/>
       <w:headerReference w:type="default" r:id="rId15"/>
+      <w:headerReference w:type="even" r:id="rId16"/>
       <w:type w:val="continuous"/>
       <w:pgSz w:w="12240" w:h="15840" w:code="1"/>
       <w:pgMar w:top="720" w:right="1440" w:bottom="806" w:left="1440" w:header="403" w:footer="720" w:gutter="0"/>
@@ -10759,473 +10760,19 @@
 
 <file path=word/footer1.xml><?xml version="1.0" encoding="utf-8"?>
 <w:ftr xmlns:wpc="http://schemas.microsoft.com/office/word/2010/wordprocessingCanvas" xmlns:cx="http://schemas.microsoft.com/office/drawing/2014/chartex" xmlns:cx1="http://schemas.microsoft.com/office/drawing/2015/9/8/chartex" xmlns:cx2="http://schemas.microsoft.com/office/drawing/2015/10/21/chartex" xmlns:cx3="http://schemas.microsoft.com/office/drawing/2016/5/9/chartex" xmlns:cx4="http://schemas.microsoft.com/office/drawing/2016/5/10/chartex" xmlns:cx5="http://schemas.microsoft.com/office/drawing/2016/5/11/chartex" xmlns:cx6="http://schemas.microsoft.com/office/drawing/2016/5/12/chartex" xmlns:cx7="http://schemas.microsoft.com/office/drawing/2016/5/13/chartex" xmlns:cx8="http://schemas.microsoft.com/office/drawing/2016/5/14/chartex" xmlns:mc="http://schemas.openxmlformats.org/markup-compatibility/2006" xmlns:aink="http://schemas.microsoft.com/office/drawing/2016/ink" xmlns:am3d="http://schemas.microsoft.com/office/drawing/2017/model3d" xmlns:o="urn:schemas-microsoft-com:office:office" xmlns:oel="http://schemas.microsoft.com/office/2019/extlst" xmlns:r="http://schemas.openxmlformats.org/officeDocument/2006/relationships" xmlns:m="http://schemas.openxmlformats.org/officeDocument/2006/math" xmlns:v="urn:schemas-microsoft-com:vml" xmlns:wp14="http://schemas.microsoft.com/office/word/2010/wordprocessingDrawing" xmlns:wp="http://schemas.openxmlformats.org/drawingml/2006/wordprocessingDrawing" xmlns:w10="urn:schemas-microsoft-com:office:word" xmlns:w="http://schemas.openxmlformats.org/wordprocessingml/2006/main" xmlns:w14="http://schemas.microsoft.com/office/word/2010/wordml" xmlns:w15="http://schemas.microsoft.com/office/word/2012/wordml" xmlns:w16cex="http://schemas.microsoft.com/office/word/2018/wordml/cex" xmlns:w16cid="http://schemas.microsoft.com/office/word/2016/wordml/cid" xmlns:w16="http://schemas.microsoft.com/office/word/2018/wordml" xmlns:w16du="http://schemas.microsoft.com/office/word/2023/wordml/word16du" xmlns:w16sdtdh="http://schemas.microsoft.com/office/word/2020/wordml/sdtdatahash" xmlns:w16sdtfl="http://schemas.microsoft.com/office/word/2024/wordml/sdtformatlock" xmlns:w16se="http://schemas.microsoft.com/office/word/2015/wordml/symex" xmlns:wpg="http://schemas.microsoft.com/office/word/2010/wordprocessingGroup" xmlns:wpi="http://schemas.microsoft.com/office/word/2010/wordprocessingInk" xmlns:wne="http://schemas.microsoft.com/office/word/2006/wordml" xmlns:wps="http://schemas.microsoft.com/office/word/2010/wordprocessingShape" mc:Ignorable="w14 w15 w16se w16cid w16 w16cex w16sdtdh w16sdtfl w16du wp14">
-  <w:sdt>
-    <w:sdtPr>
-      <w:rPr>
-        <w:rStyle w:val="PageNumber"/>
-      </w:rPr>
-      <w:id w:val="-1951769275"/>
-      <w:docPartObj>
-        <w:docPartGallery w:val="Page Numbers (Bottom of Page)"/>
-        <w:docPartUnique/>
-      </w:docPartObj>
-    </w:sdtPr>
-    <w:sdtEndPr>
-      <w:rPr>
-        <w:rStyle w:val="PageNumber"/>
-      </w:rPr>
-    </w:sdtEndPr>
-    <w:sdtContent>
-      <w:p>
-        <w:pPr>
-          <w:pStyle w:val="Footer"/>
-          <w:framePr w:wrap="none" w:vAnchor="text" w:hAnchor="margin" w:xAlign="right" w:y="1"/>
-          <w:rPr>
-            <w:rStyle w:val="PageNumber"/>
-          </w:rPr>
-        </w:pPr>
-        <w:r>
-          <w:rPr>
-            <w:rStyle w:val="PageNumber"/>
-          </w:rPr>
-          <w:fldChar w:fldCharType="begin"/>
-        </w:r>
-        <w:r>
-          <w:rPr>
-            <w:rStyle w:val="PageNumber"/>
-          </w:rPr>
-          <w:instrText xml:space="preserve"> PAGE </w:instrText>
-        </w:r>
-        <w:r>
-          <w:rPr>
-            <w:rStyle w:val="PageNumber"/>
-          </w:rPr>
-          <w:fldChar w:fldCharType="separate"/>
-        </w:r>
-        <w:r>
-          <w:rPr>
-            <w:rStyle w:val="PageNumber"/>
-            <w:noProof/>
-          </w:rPr>
-          <w:t>3</w:t>
-        </w:r>
-        <w:r>
-          <w:rPr>
-            <w:rStyle w:val="PageNumber"/>
-          </w:rPr>
-          <w:fldChar w:fldCharType="end"/>
-        </w:r>
-      </w:p>
-    </w:sdtContent>
-  </w:sdt>
-  <w:p>
-    <w:pPr>
-      <w:pStyle w:val="Footer"/>
-      <w:ind w:right="360"/>
-      <w:pPrChange w:id="0" w:author="Mary Laurx" w:date="2022-02-17T11:24:00Z">
-        <w:pPr>
-          <w:pStyle w:val="Footer"/>
-        </w:pPr>
-      </w:pPrChange>
-    </w:pPr>
-  </w:p>
+  <w:p/>
 </w:ftr>
 </file>
 
 <file path=word/footer2.xml><?xml version="1.0" encoding="utf-8"?>
 <w:ftr xmlns:wpc="http://schemas.microsoft.com/office/word/2010/wordprocessingCanvas" xmlns:cx="http://schemas.microsoft.com/office/drawing/2014/chartex" xmlns:cx1="http://schemas.microsoft.com/office/drawing/2015/9/8/chartex" xmlns:cx2="http://schemas.microsoft.com/office/drawing/2015/10/21/chartex" xmlns:cx3="http://schemas.microsoft.com/office/drawing/2016/5/9/chartex" xmlns:cx4="http://schemas.microsoft.com/office/drawing/2016/5/10/chartex" xmlns:cx5="http://schemas.microsoft.com/office/drawing/2016/5/11/chartex" xmlns:cx6="http://schemas.microsoft.com/office/drawing/2016/5/12/chartex" xmlns:cx7="http://schemas.microsoft.com/office/drawing/2016/5/13/chartex" xmlns:cx8="http://schemas.microsoft.com/office/drawing/2016/5/14/chartex" xmlns:mc="http://schemas.openxmlformats.org/markup-compatibility/2006" xmlns:aink="http://schemas.microsoft.com/office/drawing/2016/ink" xmlns:am3d="http://schemas.microsoft.com/office/drawing/2017/model3d" xmlns:o="urn:schemas-microsoft-com:office:office" xmlns:oel="http://schemas.microsoft.com/office/2019/extlst" xmlns:r="http://schemas.openxmlformats.org/officeDocument/2006/relationships" xmlns:m="http://schemas.openxmlformats.org/officeDocument/2006/math" xmlns:v="urn:schemas-microsoft-com:vml" xmlns:wp14="http://schemas.microsoft.com/office/word/2010/wordprocessingDrawing" xmlns:wp="http://schemas.openxmlformats.org/drawingml/2006/wordprocessingDrawing" xmlns:w10="urn:schemas-microsoft-com:office:word" xmlns:w="http://schemas.openxmlformats.org/wordprocessingml/2006/main" xmlns:w14="http://schemas.microsoft.com/office/word/2010/wordml" xmlns:w15="http://schemas.microsoft.com/office/word/2012/wordml" xmlns:w16cex="http://schemas.microsoft.com/office/word/2018/wordml/cex" xmlns:w16cid="http://schemas.microsoft.com/office/word/2016/wordml/cid" xmlns:w16="http://schemas.microsoft.com/office/word/2018/wordml" xmlns:w16du="http://schemas.microsoft.com/office/word/2023/wordml/word16du" xmlns:w16sdtdh="http://schemas.microsoft.com/office/word/2020/wordml/sdtdatahash" xmlns:w16sdtfl="http://schemas.microsoft.com/office/word/2024/wordml/sdtformatlock" xmlns:w16se="http://schemas.microsoft.com/office/word/2015/wordml/symex" xmlns:wpg="http://schemas.microsoft.com/office/word/2010/wordprocessingGroup" xmlns:wpi="http://schemas.microsoft.com/office/word/2010/wordprocessingInk" xmlns:wne="http://schemas.microsoft.com/office/word/2006/wordml" xmlns:wps="http://schemas.microsoft.com/office/word/2010/wordprocessingShape" mc:Ignorable="w14 w15 w16se w16cid w16 w16cex w16sdtdh w16sdtfl w16du wp14">
-  <w:sdt>
-    <w:sdtPr>
-      <w:rPr>
-        <w:rStyle w:val="PageNumber"/>
-      </w:rPr>
-      <w:id w:val="-2022930326"/>
-      <w:docPartObj>
-        <w:docPartGallery w:val="Page Numbers (Bottom of Page)"/>
-        <w:docPartUnique/>
-      </w:docPartObj>
-    </w:sdtPr>
-    <w:sdtEndPr>
-      <w:rPr>
-        <w:rStyle w:val="PageNumber"/>
-      </w:rPr>
-    </w:sdtEndPr>
-    <w:sdtContent>
-      <w:p>
-        <w:pPr>
-          <w:pStyle w:val="Footer"/>
-          <w:framePr w:wrap="none" w:vAnchor="text" w:hAnchor="margin" w:xAlign="right" w:y="1"/>
-          <w:rPr>
-            <w:rStyle w:val="PageNumber"/>
-          </w:rPr>
-        </w:pPr>
-        <w:r>
-          <w:rPr>
-            <w:rStyle w:val="PageNumber"/>
-          </w:rPr>
-          <w:fldChar w:fldCharType="begin"/>
-        </w:r>
-        <w:r>
-          <w:rPr>
-            <w:rStyle w:val="PageNumber"/>
-          </w:rPr>
-          <w:instrText xml:space="preserve"> PAGE </w:instrText>
-        </w:r>
-        <w:r>
-          <w:rPr>
-            <w:rStyle w:val="PageNumber"/>
-          </w:rPr>
-          <w:fldChar w:fldCharType="separate"/>
-        </w:r>
-        <w:r>
-          <w:rPr>
-            <w:rStyle w:val="PageNumber"/>
-            <w:noProof/>
-          </w:rPr>
-          <w:t>2</w:t>
-        </w:r>
-        <w:r>
-          <w:rPr>
-            <w:rStyle w:val="PageNumber"/>
-          </w:rPr>
-          <w:fldChar w:fldCharType="end"/>
-        </w:r>
-      </w:p>
-    </w:sdtContent>
-  </w:sdt>
-  <w:sdt>
-    <w:sdtPr>
-      <w:rPr>
-        <w:szCs w:val="14"/>
-      </w:rPr>
-      <w:id w:val="1685552808"/>
-      <w:docPartObj>
-        <w:docPartGallery w:val="Page Numbers (Bottom of Page)"/>
-        <w:docPartUnique/>
-      </w:docPartObj>
-    </w:sdtPr>
-    <w:sdtEndPr>
-      <w:rPr>
-        <w:b/>
-        <w:i/>
-        <w:sz w:val="18"/>
-        <w:szCs w:val="16"/>
-      </w:rPr>
-    </w:sdtEndPr>
-    <w:sdtContent>
-      <w:sdt>
-        <w:sdtPr>
-          <w:rPr>
-            <w:szCs w:val="14"/>
-          </w:rPr>
-          <w:id w:val="98381352"/>
-          <w:docPartObj>
-            <w:docPartGallery w:val="Page Numbers (Top of Page)"/>
-            <w:docPartUnique/>
-          </w:docPartObj>
-        </w:sdtPr>
-        <w:sdtEndPr>
-          <w:rPr>
-            <w:b/>
-            <w:i/>
-            <w:sz w:val="18"/>
-            <w:szCs w:val="16"/>
-          </w:rPr>
-        </w:sdtEndPr>
-        <w:sdtContent>
-          <w:p>
-            <w:pPr>
-              <w:pStyle w:val="Footer"/>
-              <w:spacing w:before="0" w:line="240" w:lineRule="auto"/>
-              <w:ind w:right="360"/>
-              <w:rPr>
-                <w:b/>
-                <w:color w:val="1F497D" w:themeColor="text2"/>
-                <w:sz w:val="18"/>
-              </w:rPr>
-            </w:pPr>
-            <w:r>
-              <w:rPr>
-                <w:b/>
-                <w:color w:val="1F497D" w:themeColor="text2"/>
-                <w:sz w:val="18"/>
-              </w:rPr>
-              <w:t>Proceedings of the 1</w:t>
-            </w:r>
-            <w:r>
-              <w:rPr>
-                <w:b/>
-                <w:color w:val="1F497D" w:themeColor="text2"/>
-                <w:sz w:val="18"/>
-              </w:rPr>
-              <w:t>7</w:t>
-            </w:r>
-            <w:r>
-              <w:rPr>
-                <w:b/>
-                <w:color w:val="1F497D" w:themeColor="text2"/>
-                <w:sz w:val="18"/>
-                <w:vertAlign w:val="superscript"/>
-              </w:rPr>
-              <w:t>th</w:t>
-            </w:r>
-            <w:r>
-              <w:rPr>
-                <w:b/>
-                <w:color w:val="1F497D" w:themeColor="text2"/>
-                <w:sz w:val="18"/>
-              </w:rPr>
-              <w:t xml:space="preserve"> International Conference on Precision Agriculture</w:t>
-            </w:r>
-            <w:r>
-              <w:rPr>
-                <w:b/>
-                <w:color w:val="1F497D" w:themeColor="text2"/>
-                <w:sz w:val="18"/>
-              </w:rPr>
-              <w:t xml:space="preserve"> and 11</w:t>
-            </w:r>
-            <w:r>
-              <w:rPr>
-                <w:b/>
-                <w:color w:val="1F497D" w:themeColor="text2"/>
-                <w:sz w:val="18"/>
-                <w:vertAlign w:val="superscript"/>
-              </w:rPr>
-              <w:t>th</w:t>
-            </w:r>
-            <w:r>
-              <w:rPr>
-                <w:b/>
-                <w:color w:val="1F497D" w:themeColor="text2"/>
-                <w:sz w:val="18"/>
-              </w:rPr>
-              <w:t xml:space="preserve"> </w:t>
-            </w:r>
-            <w:r>
-              <w:rPr>
-                <w:b/>
-                <w:color w:val="1F497D" w:themeColor="text2"/>
-                <w:sz w:val="18"/>
-              </w:rPr>
-              <w:t>Brazilian Congress on Precision and Digital Agriculture</w:t>
-            </w:r>
-            <w:r>
-              <w:rPr>
-                <w:b/>
-                <w:color w:val="1F497D" w:themeColor="text2"/>
-                <w:sz w:val="18"/>
-              </w:rPr>
-              <w:t>:</w:t>
-            </w:r>
-            <w:r>
-              <w:rPr>
-                <w:b/>
-                <w:color w:val="1F497D" w:themeColor="text2"/>
-                <w:sz w:val="18"/>
-              </w:rPr>
-              <w:t xml:space="preserve"> 13-15 </w:t>
-            </w:r>
-            <w:proofErr w:type="gramStart"/>
-            <w:r>
-              <w:rPr>
-                <w:b/>
-                <w:color w:val="1F497D" w:themeColor="text2"/>
-                <w:sz w:val="18"/>
-              </w:rPr>
-              <w:t>July</w:t>
-            </w:r>
-            <w:r>
-              <w:rPr>
-                <w:b/>
-                <w:color w:val="1F497D" w:themeColor="text2"/>
-                <w:sz w:val="18"/>
-              </w:rPr>
-              <w:t>,</w:t>
-            </w:r>
-            <w:proofErr w:type="gramEnd"/>
-            <w:r>
-              <w:rPr>
-                <w:b/>
-                <w:color w:val="1F497D" w:themeColor="text2"/>
-                <w:sz w:val="18"/>
-              </w:rPr>
-              <w:t xml:space="preserve"> 202</w:t>
-            </w:r>
-            <w:r>
-              <w:rPr>
-                <w:b/>
-                <w:color w:val="1F497D" w:themeColor="text2"/>
-                <w:sz w:val="18"/>
-              </w:rPr>
-              <w:t>6</w:t>
-            </w:r>
-            <w:r>
-              <w:rPr>
-                <w:b/>
-                <w:color w:val="1F497D" w:themeColor="text2"/>
-                <w:sz w:val="18"/>
-              </w:rPr>
-              <w:t xml:space="preserve">, </w:t>
-            </w:r>
-            <w:r>
-              <w:rPr>
-                <w:b/>
-                <w:color w:val="1F497D" w:themeColor="text2"/>
-                <w:sz w:val="18"/>
-              </w:rPr>
-              <w:t>Porto Alegre</w:t>
-            </w:r>
-            <w:r>
-              <w:rPr>
-                <w:b/>
-                <w:color w:val="1F497D" w:themeColor="text2"/>
-                <w:sz w:val="18"/>
-              </w:rPr>
-              <w:t xml:space="preserve">, </w:t>
-            </w:r>
-            <w:r>
-              <w:rPr>
-                <w:b/>
-                <w:color w:val="1F497D" w:themeColor="text2"/>
-                <w:sz w:val="18"/>
-              </w:rPr>
-              <w:t>Brazil</w:t>
-            </w:r>
-          </w:p>
-          <w:p>
-            <w:pPr>
-              <w:pStyle w:val="Footer"/>
-              <w:spacing w:before="0" w:line="240" w:lineRule="auto"/>
-              <w:rPr>
-                <w:b/>
-                <w:i/>
-                <w:sz w:val="18"/>
-              </w:rPr>
-            </w:pPr>
-            <w:r>
-              <w:rPr>
-                <w:b/>
-                <w:i/>
-                <w:sz w:val="18"/>
-              </w:rPr>
-              <w:tab/>
-            </w:r>
-          </w:p>
-        </w:sdtContent>
-      </w:sdt>
-    </w:sdtContent>
-  </w:sdt>
-  <w:p>
-    <w:r/>
-  </w:p>
+  <w:p/>
 </w:ftr>
 </file>
 
 <file path=word/footer3.xml><?xml version="1.0" encoding="utf-8"?>
 <w:ftr xmlns:wpc="http://schemas.microsoft.com/office/word/2010/wordprocessingCanvas" xmlns:cx="http://schemas.microsoft.com/office/drawing/2014/chartex" xmlns:cx1="http://schemas.microsoft.com/office/drawing/2015/9/8/chartex" xmlns:cx2="http://schemas.microsoft.com/office/drawing/2015/10/21/chartex" xmlns:cx3="http://schemas.microsoft.com/office/drawing/2016/5/9/chartex" xmlns:cx4="http://schemas.microsoft.com/office/drawing/2016/5/10/chartex" xmlns:cx5="http://schemas.microsoft.com/office/drawing/2016/5/11/chartex" xmlns:cx6="http://schemas.microsoft.com/office/drawing/2016/5/12/chartex" xmlns:cx7="http://schemas.microsoft.com/office/drawing/2016/5/13/chartex" xmlns:cx8="http://schemas.microsoft.com/office/drawing/2016/5/14/chartex" xmlns:mc="http://schemas.openxmlformats.org/markup-compatibility/2006" xmlns:aink="http://schemas.microsoft.com/office/drawing/2016/ink" xmlns:am3d="http://schemas.microsoft.com/office/drawing/2017/model3d" xmlns:o="urn:schemas-microsoft-com:office:office" xmlns:oel="http://schemas.microsoft.com/office/2019/extlst" xmlns:r="http://schemas.openxmlformats.org/officeDocument/2006/relationships" xmlns:m="http://schemas.openxmlformats.org/officeDocument/2006/math" xmlns:v="urn:schemas-microsoft-com:vml" xmlns:wp14="http://schemas.microsoft.com/office/word/2010/wordprocessingDrawing" xmlns:wp="http://schemas.openxmlformats.org/drawingml/2006/wordprocessingDrawing" xmlns:w10="urn:schemas-microsoft-com:office:word" xmlns:w="http://schemas.openxmlformats.org/wordprocessingml/2006/main" xmlns:w14="http://schemas.microsoft.com/office/word/2010/wordml" xmlns:w15="http://schemas.microsoft.com/office/word/2012/wordml" xmlns:w16cex="http://schemas.microsoft.com/office/word/2018/wordml/cex" xmlns:w16cid="http://schemas.microsoft.com/office/word/2016/wordml/cid" xmlns:w16="http://schemas.microsoft.com/office/word/2018/wordml" xmlns:w16du="http://schemas.microsoft.com/office/word/2023/wordml/word16du" xmlns:w16sdtdh="http://schemas.microsoft.com/office/word/2020/wordml/sdtdatahash" xmlns:w16sdtfl="http://schemas.microsoft.com/office/word/2024/wordml/sdtformatlock" xmlns:w16se="http://schemas.microsoft.com/office/word/2015/wordml/symex" xmlns:wpg="http://schemas.microsoft.com/office/word/2010/wordprocessingGroup" xmlns:wpi="http://schemas.microsoft.com/office/word/2010/wordprocessingInk" xmlns:wne="http://schemas.microsoft.com/office/word/2006/wordml" xmlns:wps="http://schemas.microsoft.com/office/word/2010/wordprocessingShape" mc:Ignorable="w14 w15 w16se w16cid w16 w16cex w16sdtdh w16sdtfl w16du wp14">
-  <w:p>
-    <w:pPr>
-      <w:pStyle w:val="Footer"/>
-      <w:pBdr>
-        <w:top w:val="single" w:sz="4" w:space="1" w:color="auto"/>
-        <w:bottom w:val="single" w:sz="4" w:space="1" w:color="auto"/>
-      </w:pBdr>
-    </w:pPr>
-    <w:r>
-      <w:t>The authors are solely responsible for the content of this paper, which is not a refereed publication. Citation of this work should state that it is from the Proceedings of the 1</w:t>
-    </w:r>
-    <w:r>
-      <w:t>7</w:t>
-    </w:r>
-    <w:r>
-      <w:rPr>
-        <w:vertAlign w:val="superscript"/>
-      </w:rPr>
-      <w:t>th</w:t>
-    </w:r>
-    <w:r>
-      <w:t xml:space="preserve"> </w:t>
-    </w:r>
-    <w:r>
-      <w:t xml:space="preserve"> International Conference on Precision Agriculture</w:t>
-    </w:r>
-    <w:r>
-      <w:t xml:space="preserve"> and 11</w:t>
-    </w:r>
-    <w:r>
-      <w:rPr>
-        <w:vertAlign w:val="superscript"/>
-      </w:rPr>
-      <w:t>th</w:t>
-    </w:r>
-    <w:r>
-      <w:t xml:space="preserve"> </w:t>
-    </w:r>
-    <w:r>
-      <w:t>Brazilian Congress on Precision and Digital Agriculture</w:t>
-    </w:r>
-    <w:r>
-      <w:t>. EXAMPLE: Last</w:t>
-    </w:r>
-    <w:r>
-      <w:t xml:space="preserve"> N</w:t>
-    </w:r>
-    <w:r>
-      <w:t>ame, A. B. &amp; Coauthor, C. D. (2</w:t>
-    </w:r>
-    <w:r>
-      <w:t>02</w:t>
-    </w:r>
-    <w:r>
-      <w:t>6</w:t>
-    </w:r>
-    <w:r>
-      <w:t>). Title of paper. In Proceedings of the 1</w:t>
-    </w:r>
-    <w:r>
-      <w:t>7</w:t>
-    </w:r>
-    <w:r>
-      <w:rPr>
-        <w:vertAlign w:val="superscript"/>
-      </w:rPr>
-      <w:t>th</w:t>
-    </w:r>
-    <w:r>
-      <w:t xml:space="preserve"> International Conference on Precision Agriculture</w:t>
-    </w:r>
-    <w:r>
-      <w:t xml:space="preserve"> and 11</w:t>
-    </w:r>
-    <w:r>
-      <w:rPr>
-        <w:vertAlign w:val="superscript"/>
-      </w:rPr>
-      <w:t>th</w:t>
-    </w:r>
-    <w:r>
-      <w:t xml:space="preserve"> </w:t>
-    </w:r>
-    <w:r>
-      <w:t>Brazilian Congress on Precision and Digital Agriculture</w:t>
-    </w:r>
-    <w:r>
-      <w:t xml:space="preserve"> (unpaginated, online). Monticello, IL: International Society of Precision Agriculture</w:t>
-    </w:r>
-    <w:r>
-      <w:t xml:space="preserve"> and</w:t>
-    </w:r>
-    <w:r>
-      <w:t xml:space="preserve"> </w:t>
-    </w:r>
-    <w:r>
-      <w:t>Brazilian Congress on Precision and Digital Agriculture</w:t>
-    </w:r>
-    <w:r>
-      <w:t xml:space="preserve">. </w:t>
-    </w:r>
-  </w:p>
+  <w:p/>
 </w:ftr>
 </file>
 
@@ -11252,93 +10799,19 @@
 
 <file path=word/header1.xml><?xml version="1.0" encoding="utf-8"?>
 <w:hdr xmlns:wpc="http://schemas.microsoft.com/office/word/2010/wordprocessingCanvas" xmlns:cx="http://schemas.microsoft.com/office/drawing/2014/chartex" xmlns:cx1="http://schemas.microsoft.com/office/drawing/2015/9/8/chartex" xmlns:cx2="http://schemas.microsoft.com/office/drawing/2015/10/21/chartex" xmlns:cx3="http://schemas.microsoft.com/office/drawing/2016/5/9/chartex" xmlns:cx4="http://schemas.microsoft.com/office/drawing/2016/5/10/chartex" xmlns:cx5="http://schemas.microsoft.com/office/drawing/2016/5/11/chartex" xmlns:cx6="http://schemas.microsoft.com/office/drawing/2016/5/12/chartex" xmlns:cx7="http://schemas.microsoft.com/office/drawing/2016/5/13/chartex" xmlns:cx8="http://schemas.microsoft.com/office/drawing/2016/5/14/chartex" xmlns:mc="http://schemas.openxmlformats.org/markup-compatibility/2006" xmlns:aink="http://schemas.microsoft.com/office/drawing/2016/ink" xmlns:am3d="http://schemas.microsoft.com/office/drawing/2017/model3d" xmlns:o="urn:schemas-microsoft-com:office:office" xmlns:oel="http://schemas.microsoft.com/office/2019/extlst" xmlns:r="http://schemas.openxmlformats.org/officeDocument/2006/relationships" xmlns:m="http://schemas.openxmlformats.org/officeDocument/2006/math" xmlns:v="urn:schemas-microsoft-com:vml" xmlns:wp14="http://schemas.microsoft.com/office/word/2010/wordprocessingDrawing" xmlns:wp="http://schemas.openxmlformats.org/drawingml/2006/wordprocessingDrawing" xmlns:w10="urn:schemas-microsoft-com:office:word" xmlns:w="http://schemas.openxmlformats.org/wordprocessingml/2006/main" xmlns:w14="http://schemas.microsoft.com/office/word/2010/wordml" xmlns:w15="http://schemas.microsoft.com/office/word/2012/wordml" xmlns:w16cex="http://schemas.microsoft.com/office/word/2018/wordml/cex" xmlns:w16cid="http://schemas.microsoft.com/office/word/2016/wordml/cid" xmlns:w16="http://schemas.microsoft.com/office/word/2018/wordml" xmlns:w16du="http://schemas.microsoft.com/office/word/2023/wordml/word16du" xmlns:w16sdtdh="http://schemas.microsoft.com/office/word/2020/wordml/sdtdatahash" xmlns:w16sdtfl="http://schemas.microsoft.com/office/word/2024/wordml/sdtformatlock" xmlns:w16se="http://schemas.microsoft.com/office/word/2015/wordml/symex" xmlns:wpg="http://schemas.microsoft.com/office/word/2010/wordprocessingGroup" xmlns:wpi="http://schemas.microsoft.com/office/word/2010/wordprocessingInk" xmlns:wne="http://schemas.microsoft.com/office/word/2006/wordml" xmlns:wps="http://schemas.microsoft.com/office/word/2010/wordprocessingShape" mc:Ignorable="w14 w15 w16se w16cid w16 w16cex w16sdtdh w16sdtfl w16du wp14">
-  <w:p>
-    <w:pPr>
-      <w:pStyle w:val="Header"/>
-      <w:ind w:hanging="720"/>
-      <w:jc w:val="center"/>
-    </w:pPr>
-    <w:r>
-      <w:rPr>
-        <w:noProof/>
-      </w:rPr>
-      <w:drawing>
-        <wp:anchor distT="0" distB="0" distL="114300" distR="114300" simplePos="0" relativeHeight="251658240" behindDoc="1" locked="0" layoutInCell="1" allowOverlap="1" wp14:anchorId="01D8CAF4" wp14:editId="388611D7">
-          <wp:simplePos x="0" y="0"/>
-          <wp:positionH relativeFrom="margin">
-            <wp:align>right</wp:align>
-          </wp:positionH>
-          <wp:positionV relativeFrom="paragraph">
-            <wp:posOffset>1270</wp:posOffset>
-          </wp:positionV>
-          <wp:extent cx="5943600" cy="1190625"/>
-          <wp:effectExtent l="0" t="0" r="0" b="9525"/>
-          <wp:wrapThrough wrapText="bothSides">
-            <wp:wrapPolygon edited="0">
-              <wp:start x="0" y="0"/>
-              <wp:lineTo x="0" y="21427"/>
-              <wp:lineTo x="21531" y="21427"/>
-              <wp:lineTo x="21531" y="0"/>
-              <wp:lineTo x="0" y="0"/>
-            </wp:wrapPolygon>
-          </wp:wrapThrough>
-          <wp:docPr id="719055097" name="Picture 1"/>
-          <wp:cNvGraphicFramePr>
-            <a:graphicFrameLocks xmlns:a="http://schemas.openxmlformats.org/drawingml/2006/main" noChangeAspect="1"/>
-          </wp:cNvGraphicFramePr>
-          <a:graphic xmlns:a="http://schemas.openxmlformats.org/drawingml/2006/main">
-            <a:graphicData uri="http://schemas.openxmlformats.org/drawingml/2006/picture">
-              <pic:pic xmlns:pic="http://schemas.openxmlformats.org/drawingml/2006/picture">
-                <pic:nvPicPr>
-                  <pic:cNvPr id="0" name="Picture 1"/>
-                  <pic:cNvPicPr>
-                    <a:picLocks noChangeAspect="1" noChangeArrowheads="1"/>
-                  </pic:cNvPicPr>
-                </pic:nvPicPr>
-                <pic:blipFill>
-                  <a:blip r:embed="rId1">
-                    <a:extLst>
-                      <a:ext uri="{28A0092B-C50C-407E-A947-70E740481C1C}">
-                        <a14:useLocalDpi xmlns:a14="http://schemas.microsoft.com/office/drawing/2010/main" val="0"/>
-                      </a:ext>
-                    </a:extLst>
-                  </a:blip>
-                  <a:srcRect/>
-                  <a:stretch>
-                    <a:fillRect/>
-                  </a:stretch>
-                </pic:blipFill>
-                <pic:spPr bwMode="auto">
-                  <a:xfrm>
-                    <a:off x="0" y="0"/>
-                    <a:ext cx="5943600" cy="1190625"/>
-                  </a:xfrm>
-                  <a:prstGeom prst="rect">
-                    <a:avLst/>
-                  </a:prstGeom>
-                  <a:noFill/>
-                  <a:ln>
-                    <a:noFill/>
-                  </a:ln>
-                </pic:spPr>
-              </pic:pic>
-            </a:graphicData>
-          </a:graphic>
-        </wp:anchor>
-      </w:drawing>
-    </w:r>
-  </w:p>
+  <w:p/>
 </w:hdr>
 </file>
 
 <file path=word/header2.xml><?xml version="1.0" encoding="utf-8"?>
 <w:hdr xmlns:m="http://schemas.openxmlformats.org/officeDocument/2006/math" xmlns:mc="http://schemas.openxmlformats.org/markup-compatibility/2006" xmlns:mo="http://schemas.microsoft.com/office/mac/office/2008/main" xmlns:mv="urn:schemas-microsoft-com:mac:vml" xmlns:o="urn:schemas-microsoft-com:office:office" xmlns:r="http://schemas.openxmlformats.org/officeDocument/2006/relationships" xmlns:v="urn:schemas-microsoft-com:vml" xmlns:w10="urn:schemas-microsoft-com:office:word" xmlns:w14="http://schemas.microsoft.com/office/word/2010/wordml" xmlns:w="http://schemas.openxmlformats.org/wordprocessingml/2006/main" xmlns:wne="http://schemas.microsoft.com/office/word/2006/wordml" xmlns:wp14="http://schemas.microsoft.com/office/word/2010/wordprocessingDrawing" xmlns:wp="http://schemas.openxmlformats.org/drawingml/2006/wordprocessingDrawing" xmlns:wpc="http://schemas.microsoft.com/office/word/2010/wordprocessingCanvas" xmlns:wpg="http://schemas.microsoft.com/office/word/2010/wordprocessingGroup" xmlns:wpi="http://schemas.microsoft.com/office/word/2010/wordprocessingInk" xmlns:wps="http://schemas.microsoft.com/office/word/2010/wordprocessingShape" mc:Ignorable="w14 wp14">
-  <w:p>
-    <w:pPr>
-      <w:pStyle w:val="Header"/>
-    </w:pPr>
-    <w:r/>
-  </w:p>
+  <w:p/>
+</w:hdr>
+</file>
+
+<file path=word/header3.xml><?xml version="1.0" encoding="utf-8"?>
+<w:hdr xmlns:m="http://schemas.openxmlformats.org/officeDocument/2006/math" xmlns:mc="http://schemas.openxmlformats.org/markup-compatibility/2006" xmlns:mo="http://schemas.microsoft.com/office/mac/office/2008/main" xmlns:mv="urn:schemas-microsoft-com:mac:vml" xmlns:o="urn:schemas-microsoft-com:office:office" xmlns:r="http://schemas.openxmlformats.org/officeDocument/2006/relationships" xmlns:v="urn:schemas-microsoft-com:vml" xmlns:w10="urn:schemas-microsoft-com:office:word" xmlns:w14="http://schemas.microsoft.com/office/word/2010/wordml" xmlns:w="http://schemas.openxmlformats.org/wordprocessingml/2006/main" xmlns:wne="http://schemas.microsoft.com/office/word/2006/wordml" xmlns:wp14="http://schemas.microsoft.com/office/word/2010/wordprocessingDrawing" xmlns:wp="http://schemas.openxmlformats.org/drawingml/2006/wordprocessingDrawing" xmlns:wpc="http://schemas.microsoft.com/office/word/2010/wordprocessingCanvas" xmlns:wpg="http://schemas.microsoft.com/office/word/2010/wordprocessingGroup" xmlns:wpi="http://schemas.microsoft.com/office/word/2010/wordprocessingInk" xmlns:wps="http://schemas.microsoft.com/office/word/2010/wordprocessingShape" mc:Ignorable="w14 wp14">
+  <w:p/>
 </w:hdr>
 </file>
 

</xml_diff>

<commit_message>
Strip ICPA header footer artifacts
</commit_message>
<xml_diff>
--- a/paper/word/icpa_2026_mask_guided_cotton_until_algorithms.docx
+++ b/paper/word/icpa_2026_mask_guided_cotton_until_algorithms.docx
@@ -1,6 +1,6 @@
 
 <file path=word/document.xml><?xml version="1.0" encoding="utf-8"?>
-<w:document xmlns:wpc="http://schemas.microsoft.com/office/word/2010/wordprocessingCanvas" xmlns:cx="http://schemas.microsoft.com/office/drawing/2014/chartex" xmlns:cx1="http://schemas.microsoft.com/office/drawing/2015/9/8/chartex" xmlns:cx2="http://schemas.microsoft.com/office/drawing/2015/10/21/chartex" xmlns:cx3="http://schemas.microsoft.com/office/drawing/2016/5/9/chartex" xmlns:cx4="http://schemas.microsoft.com/office/drawing/2016/5/10/chartex" xmlns:cx5="http://schemas.microsoft.com/office/drawing/2016/5/11/chartex" xmlns:cx6="http://schemas.microsoft.com/office/drawing/2016/5/12/chartex" xmlns:cx7="http://schemas.microsoft.com/office/drawing/2016/5/13/chartex" xmlns:cx8="http://schemas.microsoft.com/office/drawing/2016/5/14/chartex" xmlns:mc="http://schemas.openxmlformats.org/markup-compatibility/2006" xmlns:aink="http://schemas.microsoft.com/office/drawing/2016/ink" xmlns:am3d="http://schemas.microsoft.com/office/drawing/2017/model3d" xmlns:o="urn:schemas-microsoft-com:office:office" xmlns:oel="http://schemas.microsoft.com/office/2019/extlst" xmlns:r="http://schemas.openxmlformats.org/officeDocument/2006/relationships" xmlns:m="http://schemas.openxmlformats.org/officeDocument/2006/math" xmlns:v="urn:schemas-microsoft-com:vml" xmlns:wp14="http://schemas.microsoft.com/office/word/2010/wordprocessingDrawing" xmlns:wp="http://schemas.openxmlformats.org/drawingml/2006/wordprocessingDrawing" xmlns:w10="urn:schemas-microsoft-com:office:word" xmlns:w="http://schemas.openxmlformats.org/wordprocessingml/2006/main" xmlns:w14="http://schemas.microsoft.com/office/word/2010/wordml" xmlns:w15="http://schemas.microsoft.com/office/word/2012/wordml" xmlns:w16cex="http://schemas.microsoft.com/office/word/2018/wordml/cex" xmlns:w16cid="http://schemas.microsoft.com/office/word/2016/wordml/cid" xmlns:w16="http://schemas.microsoft.com/office/word/2018/wordml" xmlns:w16du="http://schemas.microsoft.com/office/word/2023/wordml/word16du" xmlns:w16sdtdh="http://schemas.microsoft.com/office/word/2020/wordml/sdtdatahash" xmlns:w16sdtfl="http://schemas.microsoft.com/office/word/2024/wordml/sdtformatlock" xmlns:w16se="http://schemas.microsoft.com/office/word/2015/wordml/symex" xmlns:wpg="http://schemas.microsoft.com/office/word/2010/wordprocessingGroup" xmlns:wpi="http://schemas.microsoft.com/office/word/2010/wordprocessingInk" xmlns:wne="http://schemas.microsoft.com/office/word/2006/wordml" xmlns:wps="http://schemas.microsoft.com/office/word/2010/wordprocessingShape" mc:Ignorable="w14 w15 w16se w16cid w16 w16cex w16sdtdh w16sdtfl w16du wp14">
+<w:document xmlns:ns1="http://schemas.openxmlformats.org/markup-compatibility/2006" xmlns:ns2="http://schemas.openxmlformats.org/drawingml/2006/wordprocessingDrawing" xmlns:ns3="http://schemas.openxmlformats.org/drawingml/2006/main" xmlns:ns4="http://schemas.openxmlformats.org/drawingml/2006/picture" xmlns:ns5="http://schemas.openxmlformats.org/officeDocument/2006/relationships" xmlns:w="http://schemas.openxmlformats.org/wordprocessingml/2006/main" ns1:Ignorable="w14 w15 w16se w16cid w16 w16cex w16sdtdh w16sdtfl w16du wp14">
   <w:body>
     <w:p>
       <w:pPr>
@@ -33,54 +33,6 @@
           <w:i w:val="0"/>
         </w:rPr>
         <w:t>Corresponding author: to be inserted.</w:t>
-      </w:r>
-    </w:p>
-    <w:p>
-      <w:pPr>
-        <w:pStyle w:val="ConfName"/>
-        <w:spacing w:after="0"/>
-      </w:pPr>
-      <w:r>
-        <w:rPr>
-          <w:i w:val="0"/>
-        </w:rPr>
-        <w:t>A paper from the Proceedings of the</w:t>
-      </w:r>
-    </w:p>
-    <w:p>
-      <w:pPr>
-        <w:pStyle w:val="ConfName"/>
-        <w:spacing w:after="0"/>
-      </w:pPr>
-      <w:r>
-        <w:rPr>
-          <w:i w:val="0"/>
-        </w:rPr>
-        <w:t>17th International Conference on Precision Agriculture and 11th Brazilian Congress on Precision and Digital Agriculture</w:t>
-      </w:r>
-    </w:p>
-    <w:p>
-      <w:pPr>
-        <w:pStyle w:val="ConfDate"/>
-        <w:spacing w:after="0"/>
-      </w:pPr>
-      <w:r>
-        <w:rPr>
-          <w:i w:val="0"/>
-        </w:rPr>
-        <w:t>13-15 July 2026</w:t>
-      </w:r>
-    </w:p>
-    <w:p>
-      <w:pPr>
-        <w:pStyle w:val="ConfDate"/>
-        <w:spacing w:after="0"/>
-      </w:pPr>
-      <w:r>
-        <w:rPr>
-          <w:i w:val="0"/>
-        </w:rPr>
-        <w:t>Porto Alegre, Brazil</w:t>
       </w:r>
     </w:p>
     <w:p>
@@ -1288,36 +1240,36 @@
       </w:pPr>
       <w:r>
         <w:drawing>
-          <wp:inline xmlns:a="http://schemas.openxmlformats.org/drawingml/2006/main" xmlns:pic="http://schemas.openxmlformats.org/drawingml/2006/picture">
-            <wp:extent cx="6035040" cy="2506648"/>
-            <wp:docPr id="1" name="Picture 1"/>
-            <wp:cNvGraphicFramePr>
-              <a:graphicFrameLocks noChangeAspect="1"/>
-            </wp:cNvGraphicFramePr>
-            <a:graphic>
-              <a:graphicData uri="http://schemas.openxmlformats.org/drawingml/2006/picture">
-                <pic:pic>
-                  <pic:nvPicPr>
-                    <pic:cNvPr id="0" name="icpa_cotton_architecture_overview.png"/>
-                    <pic:cNvPicPr/>
-                  </pic:nvPicPr>
-                  <pic:blipFill>
-                    <a:blip r:embed="rId17"/>
-                    <a:stretch>
-                      <a:fillRect/>
-                    </a:stretch>
-                  </pic:blipFill>
-                  <pic:spPr>
-                    <a:xfrm>
-                      <a:off x="0" y="0"/>
-                      <a:ext cx="6035040" cy="2506648"/>
-                    </a:xfrm>
-                    <a:prstGeom prst="rect"/>
-                  </pic:spPr>
-                </pic:pic>
-              </a:graphicData>
-            </a:graphic>
-          </wp:inline>
+          <ns2:inline>
+            <ns2:extent cx="6035040" cy="2506648"/>
+            <ns2:docPr id="1" name="Picture 1"/>
+            <ns2:cNvGraphicFramePr>
+              <ns3:graphicFrameLocks noChangeAspect="1"/>
+            </ns2:cNvGraphicFramePr>
+            <ns3:graphic>
+              <ns3:graphicData uri="http://schemas.openxmlformats.org/drawingml/2006/picture">
+                <ns4:pic>
+                  <ns4:nvPicPr>
+                    <ns4:cNvPr id="0" name="icpa_cotton_architecture_overview.png"/>
+                    <ns4:cNvPicPr/>
+                  </ns4:nvPicPr>
+                  <ns4:blipFill>
+                    <ns3:blip ns5:embed="rId17"/>
+                    <ns3:stretch>
+                      <ns3:fillRect/>
+                    </ns3:stretch>
+                  </ns4:blipFill>
+                  <ns4:spPr>
+                    <ns3:xfrm>
+                      <ns3:off x="0" y="0"/>
+                      <ns3:ext cx="6035040" cy="2506648"/>
+                    </ns3:xfrm>
+                    <ns3:prstGeom prst="rect"/>
+                  </ns4:spPr>
+                </ns4:pic>
+              </ns3:graphicData>
+            </ns3:graphic>
+          </ns2:inline>
         </w:drawing>
       </w:r>
     </w:p>
@@ -6331,36 +6283,36 @@
       </w:pPr>
       <w:r>
         <w:drawing>
-          <wp:inline xmlns:a="http://schemas.openxmlformats.org/drawingml/2006/main" xmlns:pic="http://schemas.openxmlformats.org/drawingml/2006/picture">
-            <wp:extent cx="6035040" cy="3425293"/>
-            <wp:docPr id="2" name="Picture 2"/>
-            <wp:cNvGraphicFramePr>
-              <a:graphicFrameLocks noChangeAspect="1"/>
-            </wp:cNvGraphicFramePr>
-            <a:graphic>
-              <a:graphicData uri="http://schemas.openxmlformats.org/drawingml/2006/picture">
-                <pic:pic>
-                  <pic:nvPicPr>
-                    <pic:cNvPr id="0" name="readiness_distribution.png"/>
-                    <pic:cNvPicPr/>
-                  </pic:nvPicPr>
-                  <pic:blipFill>
-                    <a:blip r:embed="rId18"/>
-                    <a:stretch>
-                      <a:fillRect/>
-                    </a:stretch>
-                  </pic:blipFill>
-                  <pic:spPr>
-                    <a:xfrm>
-                      <a:off x="0" y="0"/>
-                      <a:ext cx="6035040" cy="3425293"/>
-                    </a:xfrm>
-                    <a:prstGeom prst="rect"/>
-                  </pic:spPr>
-                </pic:pic>
-              </a:graphicData>
-            </a:graphic>
-          </wp:inline>
+          <ns2:inline>
+            <ns2:extent cx="6035040" cy="3425293"/>
+            <ns2:docPr id="2" name="Picture 2"/>
+            <ns2:cNvGraphicFramePr>
+              <ns3:graphicFrameLocks noChangeAspect="1"/>
+            </ns2:cNvGraphicFramePr>
+            <ns3:graphic>
+              <ns3:graphicData uri="http://schemas.openxmlformats.org/drawingml/2006/picture">
+                <ns4:pic>
+                  <ns4:nvPicPr>
+                    <ns4:cNvPr id="0" name="readiness_distribution.png"/>
+                    <ns4:cNvPicPr/>
+                  </ns4:nvPicPr>
+                  <ns4:blipFill>
+                    <ns3:blip ns5:embed="rId18"/>
+                    <ns3:stretch>
+                      <ns3:fillRect/>
+                    </ns3:stretch>
+                  </ns4:blipFill>
+                  <ns4:spPr>
+                    <ns3:xfrm>
+                      <ns3:off x="0" y="0"/>
+                      <ns3:ext cx="6035040" cy="3425293"/>
+                    </ns3:xfrm>
+                    <ns3:prstGeom prst="rect"/>
+                  </ns4:spPr>
+                </ns4:pic>
+              </ns3:graphicData>
+            </ns3:graphic>
+          </ns2:inline>
         </w:drawing>
       </w:r>
     </w:p>
@@ -6385,36 +6337,36 @@
       </w:pPr>
       <w:r>
         <w:drawing>
-          <wp:inline xmlns:a="http://schemas.openxmlformats.org/drawingml/2006/main" xmlns:pic="http://schemas.openxmlformats.org/drawingml/2006/picture">
-            <wp:extent cx="6035040" cy="2049636"/>
-            <wp:docPr id="3" name="Picture 3"/>
-            <wp:cNvGraphicFramePr>
-              <a:graphicFrameLocks noChangeAspect="1"/>
-            </wp:cNvGraphicFramePr>
-            <a:graphic>
-              <a:graphicData uri="http://schemas.openxmlformats.org/drawingml/2006/picture">
-                <pic:pic>
-                  <pic:nvPicPr>
-                    <pic:cNvPr id="0" name="proxy_trait_boxplots.png"/>
-                    <pic:cNvPicPr/>
-                  </pic:nvPicPr>
-                  <pic:blipFill>
-                    <a:blip r:embed="rId19"/>
-                    <a:stretch>
-                      <a:fillRect/>
-                    </a:stretch>
-                  </pic:blipFill>
-                  <pic:spPr>
-                    <a:xfrm>
-                      <a:off x="0" y="0"/>
-                      <a:ext cx="6035040" cy="2049636"/>
-                    </a:xfrm>
-                    <a:prstGeom prst="rect"/>
-                  </pic:spPr>
-                </pic:pic>
-              </a:graphicData>
-            </a:graphic>
-          </wp:inline>
+          <ns2:inline>
+            <ns2:extent cx="6035040" cy="2049636"/>
+            <ns2:docPr id="3" name="Picture 3"/>
+            <ns2:cNvGraphicFramePr>
+              <ns3:graphicFrameLocks noChangeAspect="1"/>
+            </ns2:cNvGraphicFramePr>
+            <ns3:graphic>
+              <ns3:graphicData uri="http://schemas.openxmlformats.org/drawingml/2006/picture">
+                <ns4:pic>
+                  <ns4:nvPicPr>
+                    <ns4:cNvPr id="0" name="proxy_trait_boxplots.png"/>
+                    <ns4:cNvPicPr/>
+                  </ns4:nvPicPr>
+                  <ns4:blipFill>
+                    <ns3:blip ns5:embed="rId19"/>
+                    <ns3:stretch>
+                      <ns3:fillRect/>
+                    </ns3:stretch>
+                  </ns4:blipFill>
+                  <ns4:spPr>
+                    <ns3:xfrm>
+                      <ns3:off x="0" y="0"/>
+                      <ns3:ext cx="6035040" cy="2049636"/>
+                    </ns3:xfrm>
+                    <ns3:prstGeom prst="rect"/>
+                  </ns4:spPr>
+                </ns4:pic>
+              </ns3:graphicData>
+            </ns3:graphic>
+          </ns2:inline>
         </w:drawing>
       </w:r>
     </w:p>
@@ -8023,36 +7975,36 @@
       </w:pPr>
       <w:r>
         <w:drawing>
-          <wp:inline xmlns:a="http://schemas.openxmlformats.org/drawingml/2006/main" xmlns:pic="http://schemas.openxmlformats.org/drawingml/2006/picture">
-            <wp:extent cx="6035040" cy="3017520"/>
-            <wp:docPr id="4" name="Picture 4"/>
-            <wp:cNvGraphicFramePr>
-              <a:graphicFrameLocks noChangeAspect="1"/>
-            </wp:cNvGraphicFramePr>
-            <a:graphic>
-              <a:graphicData uri="http://schemas.openxmlformats.org/drawingml/2006/picture">
-                <pic:pic>
-                  <pic:nvPicPr>
-                    <pic:cNvPr id="0" name="readiness_ablation.png"/>
-                    <pic:cNvPicPr/>
-                  </pic:nvPicPr>
-                  <pic:blipFill>
-                    <a:blip r:embed="rId20"/>
-                    <a:stretch>
-                      <a:fillRect/>
-                    </a:stretch>
-                  </pic:blipFill>
-                  <pic:spPr>
-                    <a:xfrm>
-                      <a:off x="0" y="0"/>
-                      <a:ext cx="6035040" cy="3017520"/>
-                    </a:xfrm>
-                    <a:prstGeom prst="rect"/>
-                  </pic:spPr>
-                </pic:pic>
-              </a:graphicData>
-            </a:graphic>
-          </wp:inline>
+          <ns2:inline>
+            <ns2:extent cx="6035040" cy="3017520"/>
+            <ns2:docPr id="4" name="Picture 4"/>
+            <ns2:cNvGraphicFramePr>
+              <ns3:graphicFrameLocks noChangeAspect="1"/>
+            </ns2:cNvGraphicFramePr>
+            <ns3:graphic>
+              <ns3:graphicData uri="http://schemas.openxmlformats.org/drawingml/2006/picture">
+                <ns4:pic>
+                  <ns4:nvPicPr>
+                    <ns4:cNvPr id="0" name="readiness_ablation.png"/>
+                    <ns4:cNvPicPr/>
+                  </ns4:nvPicPr>
+                  <ns4:blipFill>
+                    <ns3:blip ns5:embed="rId20"/>
+                    <ns3:stretch>
+                      <ns3:fillRect/>
+                    </ns3:stretch>
+                  </ns4:blipFill>
+                  <ns4:spPr>
+                    <ns3:xfrm>
+                      <ns3:off x="0" y="0"/>
+                      <ns3:ext cx="6035040" cy="3017520"/>
+                    </ns3:xfrm>
+                    <ns3:prstGeom prst="rect"/>
+                  </ns4:spPr>
+                </ns4:pic>
+              </ns3:graphicData>
+            </ns3:graphic>
+          </ns2:inline>
         </w:drawing>
       </w:r>
     </w:p>
@@ -8377,36 +8329,36 @@
       </w:pPr>
       <w:r>
         <w:drawing>
-          <wp:inline xmlns:a="http://schemas.openxmlformats.org/drawingml/2006/main" xmlns:pic="http://schemas.openxmlformats.org/drawingml/2006/picture">
-            <wp:extent cx="6035040" cy="2633472"/>
-            <wp:docPr id="5" name="Picture 5"/>
-            <wp:cNvGraphicFramePr>
-              <a:graphicFrameLocks noChangeAspect="1"/>
-            </wp:cNvGraphicFramePr>
-            <a:graphic>
-              <a:graphicData uri="http://schemas.openxmlformats.org/drawingml/2006/picture">
-                <pic:pic>
-                  <pic:nvPicPr>
-                    <pic:cNvPr id="0" name="plot_grid_candidate_heatmaps.png"/>
-                    <pic:cNvPicPr/>
-                  </pic:nvPicPr>
-                  <pic:blipFill>
-                    <a:blip r:embed="rId21"/>
-                    <a:stretch>
-                      <a:fillRect/>
-                    </a:stretch>
-                  </pic:blipFill>
-                  <pic:spPr>
-                    <a:xfrm>
-                      <a:off x="0" y="0"/>
-                      <a:ext cx="6035040" cy="2633472"/>
-                    </a:xfrm>
-                    <a:prstGeom prst="rect"/>
-                  </pic:spPr>
-                </pic:pic>
-              </a:graphicData>
-            </a:graphic>
-          </wp:inline>
+          <ns2:inline>
+            <ns2:extent cx="6035040" cy="2633472"/>
+            <ns2:docPr id="5" name="Picture 5"/>
+            <ns2:cNvGraphicFramePr>
+              <ns3:graphicFrameLocks noChangeAspect="1"/>
+            </ns2:cNvGraphicFramePr>
+            <ns3:graphic>
+              <ns3:graphicData uri="http://schemas.openxmlformats.org/drawingml/2006/picture">
+                <ns4:pic>
+                  <ns4:nvPicPr>
+                    <ns4:cNvPr id="0" name="plot_grid_candidate_heatmaps.png"/>
+                    <ns4:cNvPicPr/>
+                  </ns4:nvPicPr>
+                  <ns4:blipFill>
+                    <ns3:blip ns5:embed="rId21"/>
+                    <ns3:stretch>
+                      <ns3:fillRect/>
+                    </ns3:stretch>
+                  </ns4:blipFill>
+                  <ns4:spPr>
+                    <ns3:xfrm>
+                      <ns3:off x="0" y="0"/>
+                      <ns3:ext cx="6035040" cy="2633472"/>
+                    </ns3:xfrm>
+                    <ns3:prstGeom prst="rect"/>
+                  </ns4:spPr>
+                </ns4:pic>
+              </ns3:graphicData>
+            </ns3:graphic>
+          </ns2:inline>
         </w:drawing>
       </w:r>
     </w:p>
@@ -8917,36 +8869,36 @@
       </w:pPr>
       <w:r>
         <w:drawing>
-          <wp:inline xmlns:a="http://schemas.openxmlformats.org/drawingml/2006/main" xmlns:pic="http://schemas.openxmlformats.org/drawingml/2006/picture">
-            <wp:extent cx="6035040" cy="4526280"/>
-            <wp:docPr id="6" name="Picture 6"/>
-            <wp:cNvGraphicFramePr>
-              <a:graphicFrameLocks noChangeAspect="1"/>
-            </wp:cNvGraphicFramePr>
-            <a:graphic>
-              <a:graphicData uri="http://schemas.openxmlformats.org/drawingml/2006/picture">
-                <pic:pic>
-                  <pic:nvPicPr>
-                    <pic:cNvPr id="0" name="volume_mutation_proxy.png"/>
-                    <pic:cNvPicPr/>
-                  </pic:nvPicPr>
-                  <pic:blipFill>
-                    <a:blip r:embed="rId22"/>
-                    <a:stretch>
-                      <a:fillRect/>
-                    </a:stretch>
-                  </pic:blipFill>
-                  <pic:spPr>
-                    <a:xfrm>
-                      <a:off x="0" y="0"/>
-                      <a:ext cx="6035040" cy="4526280"/>
-                    </a:xfrm>
-                    <a:prstGeom prst="rect"/>
-                  </pic:spPr>
-                </pic:pic>
-              </a:graphicData>
-            </a:graphic>
-          </wp:inline>
+          <ns2:inline>
+            <ns2:extent cx="6035040" cy="4526280"/>
+            <ns2:docPr id="6" name="Picture 6"/>
+            <ns2:cNvGraphicFramePr>
+              <ns3:graphicFrameLocks noChangeAspect="1"/>
+            </ns2:cNvGraphicFramePr>
+            <ns3:graphic>
+              <ns3:graphicData uri="http://schemas.openxmlformats.org/drawingml/2006/picture">
+                <ns4:pic>
+                  <ns4:nvPicPr>
+                    <ns4:cNvPr id="0" name="volume_mutation_proxy.png"/>
+                    <ns4:cNvPicPr/>
+                  </ns4:nvPicPr>
+                  <ns4:blipFill>
+                    <ns3:blip ns5:embed="rId22"/>
+                    <ns3:stretch>
+                      <ns3:fillRect/>
+                    </ns3:stretch>
+                  </ns4:blipFill>
+                  <ns4:spPr>
+                    <ns3:xfrm>
+                      <ns3:off x="0" y="0"/>
+                      <ns3:ext cx="6035040" cy="4526280"/>
+                    </ns3:xfrm>
+                    <ns3:prstGeom prst="rect"/>
+                  </ns4:spPr>
+                </ns4:pic>
+              </ns3:graphicData>
+            </ns3:graphic>
+          </ns2:inline>
         </w:drawing>
       </w:r>
     </w:p>
@@ -10309,36 +10261,36 @@
       </w:pPr>
       <w:r>
         <w:drawing>
-          <wp:inline xmlns:a="http://schemas.openxmlformats.org/drawingml/2006/main" xmlns:pic="http://schemas.openxmlformats.org/drawingml/2006/picture">
-            <wp:extent cx="6035040" cy="3727525"/>
-            <wp:docPr id="7" name="Picture 7"/>
-            <wp:cNvGraphicFramePr>
-              <a:graphicFrameLocks noChangeAspect="1"/>
-            </wp:cNvGraphicFramePr>
-            <a:graphic>
-              <a:graphicData uri="http://schemas.openxmlformats.org/drawingml/2006/picture">
-                <pic:pic>
-                  <pic:nvPicPr>
-                    <pic:cNvPr id="0" name="local_2p5d_quality_scatter.png"/>
-                    <pic:cNvPicPr/>
-                  </pic:nvPicPr>
-                  <pic:blipFill>
-                    <a:blip r:embed="rId23"/>
-                    <a:stretch>
-                      <a:fillRect/>
-                    </a:stretch>
-                  </pic:blipFill>
-                  <pic:spPr>
-                    <a:xfrm>
-                      <a:off x="0" y="0"/>
-                      <a:ext cx="6035040" cy="3727525"/>
-                    </a:xfrm>
-                    <a:prstGeom prst="rect"/>
-                  </pic:spPr>
-                </pic:pic>
-              </a:graphicData>
-            </a:graphic>
-          </wp:inline>
+          <ns2:inline>
+            <ns2:extent cx="6035040" cy="3727525"/>
+            <ns2:docPr id="7" name="Picture 7"/>
+            <ns2:cNvGraphicFramePr>
+              <ns3:graphicFrameLocks noChangeAspect="1"/>
+            </ns2:cNvGraphicFramePr>
+            <ns3:graphic>
+              <ns3:graphicData uri="http://schemas.openxmlformats.org/drawingml/2006/picture">
+                <ns4:pic>
+                  <ns4:nvPicPr>
+                    <ns4:cNvPr id="0" name="local_2p5d_quality_scatter.png"/>
+                    <ns4:cNvPicPr/>
+                  </ns4:nvPicPr>
+                  <ns4:blipFill>
+                    <ns3:blip ns5:embed="rId23"/>
+                    <ns3:stretch>
+                      <ns3:fillRect/>
+                    </ns3:stretch>
+                  </ns4:blipFill>
+                  <ns4:spPr>
+                    <ns3:xfrm>
+                      <ns3:off x="0" y="0"/>
+                      <ns3:ext cx="6035040" cy="3727525"/>
+                    </ns3:xfrm>
+                    <ns3:prstGeom prst="rect"/>
+                  </ns4:spPr>
+                </ns4:pic>
+              </ns3:graphicData>
+            </ns3:graphic>
+          </ns2:inline>
         </w:drawing>
       </w:r>
     </w:p>
@@ -10719,18 +10671,11 @@
       </w:r>
     </w:p>
     <w:sectPr>
-      <w:footerReference w:type="even" r:id="rId8"/>
-      <w:footerReference w:type="default" r:id="rId9"/>
-      <w:headerReference w:type="first" r:id="rId10"/>
-      <w:footerReference w:type="first" r:id="rId11"/>
-      <w:headerReference w:type="default" r:id="rId15"/>
-      <w:headerReference w:type="even" r:id="rId16"/>
       <w:type w:val="continuous"/>
       <w:pgSz w:w="12240" w:h="15840" w:code="1"/>
       <w:pgMar w:top="720" w:right="1440" w:bottom="806" w:left="1440" w:header="403" w:footer="720" w:gutter="0"/>
       <w:pgNumType w:start="1"/>
       <w:cols w:space="720"/>
-      <w:titlePg/>
       <w:docGrid w:linePitch="360"/>
     </w:sectPr>
   </w:body>
@@ -10758,24 +10703,6 @@
 </w:endnotes>
 </file>
 
-<file path=word/footer1.xml><?xml version="1.0" encoding="utf-8"?>
-<w:ftr xmlns:wpc="http://schemas.microsoft.com/office/word/2010/wordprocessingCanvas" xmlns:cx="http://schemas.microsoft.com/office/drawing/2014/chartex" xmlns:cx1="http://schemas.microsoft.com/office/drawing/2015/9/8/chartex" xmlns:cx2="http://schemas.microsoft.com/office/drawing/2015/10/21/chartex" xmlns:cx3="http://schemas.microsoft.com/office/drawing/2016/5/9/chartex" xmlns:cx4="http://schemas.microsoft.com/office/drawing/2016/5/10/chartex" xmlns:cx5="http://schemas.microsoft.com/office/drawing/2016/5/11/chartex" xmlns:cx6="http://schemas.microsoft.com/office/drawing/2016/5/12/chartex" xmlns:cx7="http://schemas.microsoft.com/office/drawing/2016/5/13/chartex" xmlns:cx8="http://schemas.microsoft.com/office/drawing/2016/5/14/chartex" xmlns:mc="http://schemas.openxmlformats.org/markup-compatibility/2006" xmlns:aink="http://schemas.microsoft.com/office/drawing/2016/ink" xmlns:am3d="http://schemas.microsoft.com/office/drawing/2017/model3d" xmlns:o="urn:schemas-microsoft-com:office:office" xmlns:oel="http://schemas.microsoft.com/office/2019/extlst" xmlns:r="http://schemas.openxmlformats.org/officeDocument/2006/relationships" xmlns:m="http://schemas.openxmlformats.org/officeDocument/2006/math" xmlns:v="urn:schemas-microsoft-com:vml" xmlns:wp14="http://schemas.microsoft.com/office/word/2010/wordprocessingDrawing" xmlns:wp="http://schemas.openxmlformats.org/drawingml/2006/wordprocessingDrawing" xmlns:w10="urn:schemas-microsoft-com:office:word" xmlns:w="http://schemas.openxmlformats.org/wordprocessingml/2006/main" xmlns:w14="http://schemas.microsoft.com/office/word/2010/wordml" xmlns:w15="http://schemas.microsoft.com/office/word/2012/wordml" xmlns:w16cex="http://schemas.microsoft.com/office/word/2018/wordml/cex" xmlns:w16cid="http://schemas.microsoft.com/office/word/2016/wordml/cid" xmlns:w16="http://schemas.microsoft.com/office/word/2018/wordml" xmlns:w16du="http://schemas.microsoft.com/office/word/2023/wordml/word16du" xmlns:w16sdtdh="http://schemas.microsoft.com/office/word/2020/wordml/sdtdatahash" xmlns:w16sdtfl="http://schemas.microsoft.com/office/word/2024/wordml/sdtformatlock" xmlns:w16se="http://schemas.microsoft.com/office/word/2015/wordml/symex" xmlns:wpg="http://schemas.microsoft.com/office/word/2010/wordprocessingGroup" xmlns:wpi="http://schemas.microsoft.com/office/word/2010/wordprocessingInk" xmlns:wne="http://schemas.microsoft.com/office/word/2006/wordml" xmlns:wps="http://schemas.microsoft.com/office/word/2010/wordprocessingShape" mc:Ignorable="w14 w15 w16se w16cid w16 w16cex w16sdtdh w16sdtfl w16du wp14">
-  <w:p/>
-</w:ftr>
-</file>
-
-<file path=word/footer2.xml><?xml version="1.0" encoding="utf-8"?>
-<w:ftr xmlns:wpc="http://schemas.microsoft.com/office/word/2010/wordprocessingCanvas" xmlns:cx="http://schemas.microsoft.com/office/drawing/2014/chartex" xmlns:cx1="http://schemas.microsoft.com/office/drawing/2015/9/8/chartex" xmlns:cx2="http://schemas.microsoft.com/office/drawing/2015/10/21/chartex" xmlns:cx3="http://schemas.microsoft.com/office/drawing/2016/5/9/chartex" xmlns:cx4="http://schemas.microsoft.com/office/drawing/2016/5/10/chartex" xmlns:cx5="http://schemas.microsoft.com/office/drawing/2016/5/11/chartex" xmlns:cx6="http://schemas.microsoft.com/office/drawing/2016/5/12/chartex" xmlns:cx7="http://schemas.microsoft.com/office/drawing/2016/5/13/chartex" xmlns:cx8="http://schemas.microsoft.com/office/drawing/2016/5/14/chartex" xmlns:mc="http://schemas.openxmlformats.org/markup-compatibility/2006" xmlns:aink="http://schemas.microsoft.com/office/drawing/2016/ink" xmlns:am3d="http://schemas.microsoft.com/office/drawing/2017/model3d" xmlns:o="urn:schemas-microsoft-com:office:office" xmlns:oel="http://schemas.microsoft.com/office/2019/extlst" xmlns:r="http://schemas.openxmlformats.org/officeDocument/2006/relationships" xmlns:m="http://schemas.openxmlformats.org/officeDocument/2006/math" xmlns:v="urn:schemas-microsoft-com:vml" xmlns:wp14="http://schemas.microsoft.com/office/word/2010/wordprocessingDrawing" xmlns:wp="http://schemas.openxmlformats.org/drawingml/2006/wordprocessingDrawing" xmlns:w10="urn:schemas-microsoft-com:office:word" xmlns:w="http://schemas.openxmlformats.org/wordprocessingml/2006/main" xmlns:w14="http://schemas.microsoft.com/office/word/2010/wordml" xmlns:w15="http://schemas.microsoft.com/office/word/2012/wordml" xmlns:w16cex="http://schemas.microsoft.com/office/word/2018/wordml/cex" xmlns:w16cid="http://schemas.microsoft.com/office/word/2016/wordml/cid" xmlns:w16="http://schemas.microsoft.com/office/word/2018/wordml" xmlns:w16du="http://schemas.microsoft.com/office/word/2023/wordml/word16du" xmlns:w16sdtdh="http://schemas.microsoft.com/office/word/2020/wordml/sdtdatahash" xmlns:w16sdtfl="http://schemas.microsoft.com/office/word/2024/wordml/sdtformatlock" xmlns:w16se="http://schemas.microsoft.com/office/word/2015/wordml/symex" xmlns:wpg="http://schemas.microsoft.com/office/word/2010/wordprocessingGroup" xmlns:wpi="http://schemas.microsoft.com/office/word/2010/wordprocessingInk" xmlns:wne="http://schemas.microsoft.com/office/word/2006/wordml" xmlns:wps="http://schemas.microsoft.com/office/word/2010/wordprocessingShape" mc:Ignorable="w14 w15 w16se w16cid w16 w16cex w16sdtdh w16sdtfl w16du wp14">
-  <w:p/>
-</w:ftr>
-</file>
-
-<file path=word/footer3.xml><?xml version="1.0" encoding="utf-8"?>
-<w:ftr xmlns:wpc="http://schemas.microsoft.com/office/word/2010/wordprocessingCanvas" xmlns:cx="http://schemas.microsoft.com/office/drawing/2014/chartex" xmlns:cx1="http://schemas.microsoft.com/office/drawing/2015/9/8/chartex" xmlns:cx2="http://schemas.microsoft.com/office/drawing/2015/10/21/chartex" xmlns:cx3="http://schemas.microsoft.com/office/drawing/2016/5/9/chartex" xmlns:cx4="http://schemas.microsoft.com/office/drawing/2016/5/10/chartex" xmlns:cx5="http://schemas.microsoft.com/office/drawing/2016/5/11/chartex" xmlns:cx6="http://schemas.microsoft.com/office/drawing/2016/5/12/chartex" xmlns:cx7="http://schemas.microsoft.com/office/drawing/2016/5/13/chartex" xmlns:cx8="http://schemas.microsoft.com/office/drawing/2016/5/14/chartex" xmlns:mc="http://schemas.openxmlformats.org/markup-compatibility/2006" xmlns:aink="http://schemas.microsoft.com/office/drawing/2016/ink" xmlns:am3d="http://schemas.microsoft.com/office/drawing/2017/model3d" xmlns:o="urn:schemas-microsoft-com:office:office" xmlns:oel="http://schemas.microsoft.com/office/2019/extlst" xmlns:r="http://schemas.openxmlformats.org/officeDocument/2006/relationships" xmlns:m="http://schemas.openxmlformats.org/officeDocument/2006/math" xmlns:v="urn:schemas-microsoft-com:vml" xmlns:wp14="http://schemas.microsoft.com/office/word/2010/wordprocessingDrawing" xmlns:wp="http://schemas.openxmlformats.org/drawingml/2006/wordprocessingDrawing" xmlns:w10="urn:schemas-microsoft-com:office:word" xmlns:w="http://schemas.openxmlformats.org/wordprocessingml/2006/main" xmlns:w14="http://schemas.microsoft.com/office/word/2010/wordml" xmlns:w15="http://schemas.microsoft.com/office/word/2012/wordml" xmlns:w16cex="http://schemas.microsoft.com/office/word/2018/wordml/cex" xmlns:w16cid="http://schemas.microsoft.com/office/word/2016/wordml/cid" xmlns:w16="http://schemas.microsoft.com/office/word/2018/wordml" xmlns:w16du="http://schemas.microsoft.com/office/word/2023/wordml/word16du" xmlns:w16sdtdh="http://schemas.microsoft.com/office/word/2020/wordml/sdtdatahash" xmlns:w16sdtfl="http://schemas.microsoft.com/office/word/2024/wordml/sdtformatlock" xmlns:w16se="http://schemas.microsoft.com/office/word/2015/wordml/symex" xmlns:wpg="http://schemas.microsoft.com/office/word/2010/wordprocessingGroup" xmlns:wpi="http://schemas.microsoft.com/office/word/2010/wordprocessingInk" xmlns:wne="http://schemas.microsoft.com/office/word/2006/wordml" xmlns:wps="http://schemas.microsoft.com/office/word/2010/wordprocessingShape" mc:Ignorable="w14 w15 w16se w16cid w16 w16cex w16sdtdh w16sdtfl w16du wp14">
-  <w:p/>
-</w:ftr>
-</file>
-
 <file path=word/footnotes.xml><?xml version="1.0" encoding="utf-8"?>
 <w:footnotes xmlns:wpc="http://schemas.microsoft.com/office/word/2010/wordprocessingCanvas" xmlns:cx="http://schemas.microsoft.com/office/drawing/2014/chartex" xmlns:cx1="http://schemas.microsoft.com/office/drawing/2015/9/8/chartex" xmlns:cx2="http://schemas.microsoft.com/office/drawing/2015/10/21/chartex" xmlns:cx3="http://schemas.microsoft.com/office/drawing/2016/5/9/chartex" xmlns:cx4="http://schemas.microsoft.com/office/drawing/2016/5/10/chartex" xmlns:cx5="http://schemas.microsoft.com/office/drawing/2016/5/11/chartex" xmlns:cx6="http://schemas.microsoft.com/office/drawing/2016/5/12/chartex" xmlns:cx7="http://schemas.microsoft.com/office/drawing/2016/5/13/chartex" xmlns:cx8="http://schemas.microsoft.com/office/drawing/2016/5/14/chartex" xmlns:mc="http://schemas.openxmlformats.org/markup-compatibility/2006" xmlns:aink="http://schemas.microsoft.com/office/drawing/2016/ink" xmlns:am3d="http://schemas.microsoft.com/office/drawing/2017/model3d" xmlns:o="urn:schemas-microsoft-com:office:office" xmlns:oel="http://schemas.microsoft.com/office/2019/extlst" xmlns:r="http://schemas.openxmlformats.org/officeDocument/2006/relationships" xmlns:m="http://schemas.openxmlformats.org/officeDocument/2006/math" xmlns:v="urn:schemas-microsoft-com:vml" xmlns:wp14="http://schemas.microsoft.com/office/word/2010/wordprocessingDrawing" xmlns:wp="http://schemas.openxmlformats.org/drawingml/2006/wordprocessingDrawing" xmlns:w10="urn:schemas-microsoft-com:office:word" xmlns:w="http://schemas.openxmlformats.org/wordprocessingml/2006/main" xmlns:w14="http://schemas.microsoft.com/office/word/2010/wordml" xmlns:w15="http://schemas.microsoft.com/office/word/2012/wordml" xmlns:w16cex="http://schemas.microsoft.com/office/word/2018/wordml/cex" xmlns:w16cid="http://schemas.microsoft.com/office/word/2016/wordml/cid" xmlns:w16="http://schemas.microsoft.com/office/word/2018/wordml" xmlns:w16du="http://schemas.microsoft.com/office/word/2023/wordml/word16du" xmlns:w16sdtdh="http://schemas.microsoft.com/office/word/2020/wordml/sdtdatahash" xmlns:w16sdtfl="http://schemas.microsoft.com/office/word/2024/wordml/sdtformatlock" xmlns:w16se="http://schemas.microsoft.com/office/word/2015/wordml/symex" xmlns:wpg="http://schemas.microsoft.com/office/word/2010/wordprocessingGroup" xmlns:wpi="http://schemas.microsoft.com/office/word/2010/wordprocessingInk" xmlns:wne="http://schemas.microsoft.com/office/word/2006/wordml" xmlns:wps="http://schemas.microsoft.com/office/word/2010/wordprocessingShape" mc:Ignorable="w14 w15 w16se w16cid w16 w16cex w16sdtdh w16sdtfl w16du wp14">
   <w:footnote w:type="separator" w:id="-1">
@@ -10795,24 +10722,6 @@
     <w:p/>
   </w:footnote>
 </w:footnotes>
-</file>
-
-<file path=word/header1.xml><?xml version="1.0" encoding="utf-8"?>
-<w:hdr xmlns:wpc="http://schemas.microsoft.com/office/word/2010/wordprocessingCanvas" xmlns:cx="http://schemas.microsoft.com/office/drawing/2014/chartex" xmlns:cx1="http://schemas.microsoft.com/office/drawing/2015/9/8/chartex" xmlns:cx2="http://schemas.microsoft.com/office/drawing/2015/10/21/chartex" xmlns:cx3="http://schemas.microsoft.com/office/drawing/2016/5/9/chartex" xmlns:cx4="http://schemas.microsoft.com/office/drawing/2016/5/10/chartex" xmlns:cx5="http://schemas.microsoft.com/office/drawing/2016/5/11/chartex" xmlns:cx6="http://schemas.microsoft.com/office/drawing/2016/5/12/chartex" xmlns:cx7="http://schemas.microsoft.com/office/drawing/2016/5/13/chartex" xmlns:cx8="http://schemas.microsoft.com/office/drawing/2016/5/14/chartex" xmlns:mc="http://schemas.openxmlformats.org/markup-compatibility/2006" xmlns:aink="http://schemas.microsoft.com/office/drawing/2016/ink" xmlns:am3d="http://schemas.microsoft.com/office/drawing/2017/model3d" xmlns:o="urn:schemas-microsoft-com:office:office" xmlns:oel="http://schemas.microsoft.com/office/2019/extlst" xmlns:r="http://schemas.openxmlformats.org/officeDocument/2006/relationships" xmlns:m="http://schemas.openxmlformats.org/officeDocument/2006/math" xmlns:v="urn:schemas-microsoft-com:vml" xmlns:wp14="http://schemas.microsoft.com/office/word/2010/wordprocessingDrawing" xmlns:wp="http://schemas.openxmlformats.org/drawingml/2006/wordprocessingDrawing" xmlns:w10="urn:schemas-microsoft-com:office:word" xmlns:w="http://schemas.openxmlformats.org/wordprocessingml/2006/main" xmlns:w14="http://schemas.microsoft.com/office/word/2010/wordml" xmlns:w15="http://schemas.microsoft.com/office/word/2012/wordml" xmlns:w16cex="http://schemas.microsoft.com/office/word/2018/wordml/cex" xmlns:w16cid="http://schemas.microsoft.com/office/word/2016/wordml/cid" xmlns:w16="http://schemas.microsoft.com/office/word/2018/wordml" xmlns:w16du="http://schemas.microsoft.com/office/word/2023/wordml/word16du" xmlns:w16sdtdh="http://schemas.microsoft.com/office/word/2020/wordml/sdtdatahash" xmlns:w16sdtfl="http://schemas.microsoft.com/office/word/2024/wordml/sdtformatlock" xmlns:w16se="http://schemas.microsoft.com/office/word/2015/wordml/symex" xmlns:wpg="http://schemas.microsoft.com/office/word/2010/wordprocessingGroup" xmlns:wpi="http://schemas.microsoft.com/office/word/2010/wordprocessingInk" xmlns:wne="http://schemas.microsoft.com/office/word/2006/wordml" xmlns:wps="http://schemas.microsoft.com/office/word/2010/wordprocessingShape" mc:Ignorable="w14 w15 w16se w16cid w16 w16cex w16sdtdh w16sdtfl w16du wp14">
-  <w:p/>
-</w:hdr>
-</file>
-
-<file path=word/header2.xml><?xml version="1.0" encoding="utf-8"?>
-<w:hdr xmlns:m="http://schemas.openxmlformats.org/officeDocument/2006/math" xmlns:mc="http://schemas.openxmlformats.org/markup-compatibility/2006" xmlns:mo="http://schemas.microsoft.com/office/mac/office/2008/main" xmlns:mv="urn:schemas-microsoft-com:mac:vml" xmlns:o="urn:schemas-microsoft-com:office:office" xmlns:r="http://schemas.openxmlformats.org/officeDocument/2006/relationships" xmlns:v="urn:schemas-microsoft-com:vml" xmlns:w10="urn:schemas-microsoft-com:office:word" xmlns:w14="http://schemas.microsoft.com/office/word/2010/wordml" xmlns:w="http://schemas.openxmlformats.org/wordprocessingml/2006/main" xmlns:wne="http://schemas.microsoft.com/office/word/2006/wordml" xmlns:wp14="http://schemas.microsoft.com/office/word/2010/wordprocessingDrawing" xmlns:wp="http://schemas.openxmlformats.org/drawingml/2006/wordprocessingDrawing" xmlns:wpc="http://schemas.microsoft.com/office/word/2010/wordprocessingCanvas" xmlns:wpg="http://schemas.microsoft.com/office/word/2010/wordprocessingGroup" xmlns:wpi="http://schemas.microsoft.com/office/word/2010/wordprocessingInk" xmlns:wps="http://schemas.microsoft.com/office/word/2010/wordprocessingShape" mc:Ignorable="w14 wp14">
-  <w:p/>
-</w:hdr>
-</file>
-
-<file path=word/header3.xml><?xml version="1.0" encoding="utf-8"?>
-<w:hdr xmlns:m="http://schemas.openxmlformats.org/officeDocument/2006/math" xmlns:mc="http://schemas.openxmlformats.org/markup-compatibility/2006" xmlns:mo="http://schemas.microsoft.com/office/mac/office/2008/main" xmlns:mv="urn:schemas-microsoft-com:mac:vml" xmlns:o="urn:schemas-microsoft-com:office:office" xmlns:r="http://schemas.openxmlformats.org/officeDocument/2006/relationships" xmlns:v="urn:schemas-microsoft-com:vml" xmlns:w10="urn:schemas-microsoft-com:office:word" xmlns:w14="http://schemas.microsoft.com/office/word/2010/wordml" xmlns:w="http://schemas.openxmlformats.org/wordprocessingml/2006/main" xmlns:wne="http://schemas.microsoft.com/office/word/2006/wordml" xmlns:wp14="http://schemas.microsoft.com/office/word/2010/wordprocessingDrawing" xmlns:wp="http://schemas.openxmlformats.org/drawingml/2006/wordprocessingDrawing" xmlns:wpc="http://schemas.microsoft.com/office/word/2010/wordprocessingCanvas" xmlns:wpg="http://schemas.microsoft.com/office/word/2010/wordprocessingGroup" xmlns:wpi="http://schemas.microsoft.com/office/word/2010/wordprocessingInk" xmlns:wps="http://schemas.microsoft.com/office/word/2010/wordprocessingShape" mc:Ignorable="w14 wp14">
-  <w:p/>
-</w:hdr>
 </file>
 
 <file path=word/numbering.xml><?xml version="1.0" encoding="utf-8"?>

</xml_diff>